<commit_message>
Add newly screened HRSID literature to the comparison report; drop one-off patch scripts
</commit_message>
<xml_diff>
--- a/PAPER2_HRSID_literature_comparison.docx
+++ b/PAPER2_HRSID_literature_comparison.docx
@@ -2994,7 +2994,7 @@
                 <w:sz w:val="15"/>
                 <w:szCs w:val="15"/>
               </w:rPr>
-              <w:t xml:space="preserve">+4.89 pts over baseline (absolute n.r.)</w:t>
+              <w:t xml:space="preserve">P 91.45, R 87.57, F1 89.47, AP50 92.13, AP75 82.17 (full text, Table 1a)</w:t>
             </w:r>
           </w:p>
         </w:tc>
@@ -3058,7 +3058,7 @@
                 <w:sz w:val="15"/>
                 <w:szCs w:val="15"/>
               </w:rPr>
-              <w:t xml:space="preserve">n.r.</w:t>
+              <w:t xml:space="preserve">16.1 FPS, RTX 3090</w:t>
             </w:r>
           </w:p>
         </w:tc>
@@ -5442,6 +5442,3723 @@
           <w:szCs w:val="17"/>
         </w:rPr>
         <w:t xml:space="preserve">[1] baselines evaluated with an IoU threshold of 0.7 for filtering; in [1] the same detectors reach inshore AP50 of 78.3-82.7 and offshore AP50 of 98.0-99.0 (Table 5 of [1]; inshore scenes are 18.4 % of the test set). [12]: the abstract lists "98.4 % and 93.9 % mAP50" for "the HRSID and SSDD datasets"; 98.4 % would be far above every other HRSID result in this table, so the order may be reversed in the abstract and the value should be checked in the full paper before it is quoted. [4], [5], [6] state accuracy gains or model cost in the abstract only; "detection accuracy" in [6] is taken to be mAP50 but the abstract does not say. [21] is not a data-set-level evaluation.</w:t>
+      </w:r>
+    </w:p>
+    <w:p>
+      <w:pPr>
+        <w:pStyle w:val="Heading1"/>
+        <w:spacing w:after="110" w:before="260"/>
+      </w:pPr>
+      <w:r>
+        <w:rPr>
+          <w:rFonts w:ascii="Times New Roman" w:cs="Times New Roman" w:eastAsia="Times New Roman" w:hAnsi="Times New Roman"/>
+          <w:b/>
+          <w:bCs/>
+          <w:sz w:val="26"/>
+          <w:szCs w:val="26"/>
+        </w:rPr>
+        <w:t xml:space="preserve">4a. References screened on 2026-10-04 and their bearing on this work</w:t>
+      </w:r>
+    </w:p>
+    <w:p>
+      <w:pPr>
+        <w:spacing w:after="110" w:line="270"/>
+        <w:jc w:val="both"/>
+      </w:pPr>
+      <w:r>
+        <w:rPr>
+          <w:rFonts w:ascii="Times New Roman" w:cs="Times New Roman" w:eastAsia="Times New Roman" w:hAnsi="Times New Roman"/>
+          <w:sz w:val="21"/>
+          <w:szCs w:val="21"/>
+        </w:rPr>
+        <w:t xml:space="preserve">Twenty-two documents from the folder of new references (papers/new_references; one is a duplicate copy) were read after the first version of this comparison. Their abstracts and, for the HRSID results and cost figures, their result tables were read in the PDFs (the tables are images in the PDFs and were read from the rendered pages; values that could not be read unambiguously are marked). Of the twenty-two, </w:t>
+      </w:r>
+      <w:r>
+        <w:rPr>
+          <w:rFonts w:ascii="Times New Roman" w:cs="Times New Roman" w:eastAsia="Times New Roman" w:hAnsi="Times New Roman"/>
+          <w:b/>
+          <w:bCs/>
+          <w:sz w:val="21"/>
+          <w:szCs w:val="21"/>
+        </w:rPr>
+        <w:t xml:space="preserve">five report HRSID results</w:t>
+      </w:r>
+      <w:r>
+        <w:rPr>
+          <w:rFonts w:ascii="Times New Roman" w:cs="Times New Roman" w:eastAsia="Times New Roman" w:hAnsi="Times New Roman"/>
+          <w:sz w:val="21"/>
+          <w:szCs w:val="21"/>
+        </w:rPr>
+        <w:t xml:space="preserve"> ([7], [22]-[25]; Table 1a), </w:t>
+      </w:r>
+      <w:r>
+        <w:rPr>
+          <w:rFonts w:ascii="Times New Roman" w:cs="Times New Roman" w:eastAsia="Times New Roman" w:hAnsi="Times New Roman"/>
+          <w:b/>
+          <w:bCs/>
+          <w:sz w:val="21"/>
+          <w:szCs w:val="21"/>
+        </w:rPr>
+        <w:t xml:space="preserve">none reports an FPGA or ASIC implementation</w:t>
+      </w:r>
+      <w:r>
+        <w:rPr>
+          <w:rFonts w:ascii="Times New Roman" w:cs="Times New Roman" w:eastAsia="Times New Roman" w:hAnsi="Times New Roman"/>
+          <w:sz w:val="21"/>
+          <w:szCs w:val="21"/>
+        </w:rPr>
+        <w:t xml:space="preserve">, and the rest are CFAR-family papers or lightweight detectors evaluated on SSDD, LS-SSDD-v1.0 or SAR-Ship-Dataset (Table 1b). GL-DETR [7] was already in Table 1 with only an abstract-level value; its absolute numbers are now taken from the paper. AMFS-Net [23] and CFAR-DP-FW [30] were already in the project library but not yet in this document.</w:t>
+      </w:r>
+    </w:p>
+    <w:p>
+      <w:pPr>
+        <w:keepNext/>
+        <w:spacing w:after="70" w:before="150"/>
+      </w:pPr>
+      <w:r>
+        <w:rPr>
+          <w:rFonts w:ascii="Times New Roman" w:cs="Times New Roman" w:eastAsia="Times New Roman" w:hAnsi="Times New Roman"/>
+          <w:sz w:val="20"/>
+          <w:szCs w:val="20"/>
+        </w:rPr>
+        <w:t xml:space="preserve">Table 1a. Newly added HRSID results, as reported, with this work at the same recall (event-level matching within 4 px; the reported precision of the others is at IoU 0.5, so the comparison is indicative, not like-for-like).</w:t>
+      </w:r>
+    </w:p>
+    <w:tbl>
+      <w:tblPr>
+        <w:tblW w:type="dxa" w:w="14120"/>
+        <w:tblBorders>
+          <w:top w:val="single" w:color="auto" w:sz="4"/>
+          <w:left w:val="single" w:color="auto" w:sz="4"/>
+          <w:bottom w:val="single" w:color="auto" w:sz="4"/>
+          <w:right w:val="single" w:color="auto" w:sz="4"/>
+          <w:insideH w:val="single" w:color="auto" w:sz="4"/>
+          <w:insideV w:val="single" w:color="auto" w:sz="4"/>
+        </w:tblBorders>
+      </w:tblPr>
+      <w:tblGrid>
+        <w:gridCol w:w="620"/>
+        <w:gridCol w:w="2900"/>
+        <w:gridCol w:w="3500"/>
+        <w:gridCol w:w="1900"/>
+        <w:gridCol w:w="2300"/>
+        <w:gridCol w:w="2900"/>
+      </w:tblGrid>
+      <w:tr>
+        <w:trPr>
+          <w:tblHeader/>
+        </w:trPr>
+        <w:tc>
+          <w:tcPr>
+            <w:tcW w:type="dxa" w:w="620"/>
+            <w:tcBorders>
+              <w:top w:val="single" w:color="999999" w:sz="4"/>
+              <w:left w:val="single" w:color="999999" w:sz="4"/>
+              <w:bottom w:val="single" w:color="999999" w:sz="4"/>
+              <w:right w:val="single" w:color="999999" w:sz="4"/>
+            </w:tcBorders>
+            <w:shd w:fill="E8EDF5" w:color="auto" w:val="clear"/>
+            <w:tcMar>
+              <w:top w:type="dxa" w:w="30"/>
+              <w:left w:type="dxa" w:w="60"/>
+              <w:bottom w:type="dxa" w:w="30"/>
+              <w:right w:type="dxa" w:w="60"/>
+            </w:tcMar>
+          </w:tcPr>
+          <w:p>
+            <w:pPr>
+              <w:jc w:val="center"/>
+            </w:pPr>
+            <w:r>
+              <w:rPr>
+                <w:rFonts w:ascii="Times New Roman" w:cs="Times New Roman" w:eastAsia="Times New Roman" w:hAnsi="Times New Roman"/>
+                <w:b/>
+                <w:bCs/>
+                <w:sz w:val="14"/>
+                <w:szCs w:val="14"/>
+              </w:rPr>
+              <w:t xml:space="preserve">Ref.</w:t>
+            </w:r>
+          </w:p>
+        </w:tc>
+        <w:tc>
+          <w:tcPr>
+            <w:tcW w:type="dxa" w:w="2900"/>
+            <w:tcBorders>
+              <w:top w:val="single" w:color="999999" w:sz="4"/>
+              <w:left w:val="single" w:color="999999" w:sz="4"/>
+              <w:bottom w:val="single" w:color="999999" w:sz="4"/>
+              <w:right w:val="single" w:color="999999" w:sz="4"/>
+            </w:tcBorders>
+            <w:shd w:fill="E8EDF5" w:color="auto" w:val="clear"/>
+            <w:tcMar>
+              <w:top w:type="dxa" w:w="30"/>
+              <w:left w:type="dxa" w:w="60"/>
+              <w:bottom w:type="dxa" w:w="30"/>
+              <w:right w:type="dxa" w:w="60"/>
+            </w:tcMar>
+          </w:tcPr>
+          <w:p>
+            <w:pPr>
+              <w:jc w:val="center"/>
+            </w:pPr>
+            <w:r>
+              <w:rPr>
+                <w:rFonts w:ascii="Times New Roman" w:cs="Times New Roman" w:eastAsia="Times New Roman" w:hAnsi="Times New Roman"/>
+                <w:b/>
+                <w:bCs/>
+                <w:sz w:val="14"/>
+                <w:szCs w:val="14"/>
+              </w:rPr>
+              <w:t xml:space="preserve">Method (year, venue)</w:t>
+            </w:r>
+          </w:p>
+        </w:tc>
+        <w:tc>
+          <w:tcPr>
+            <w:tcW w:type="dxa" w:w="3500"/>
+            <w:tcBorders>
+              <w:top w:val="single" w:color="999999" w:sz="4"/>
+              <w:left w:val="single" w:color="999999" w:sz="4"/>
+              <w:bottom w:val="single" w:color="999999" w:sz="4"/>
+              <w:right w:val="single" w:color="999999" w:sz="4"/>
+            </w:tcBorders>
+            <w:shd w:fill="E8EDF5" w:color="auto" w:val="clear"/>
+            <w:tcMar>
+              <w:top w:type="dxa" w:w="30"/>
+              <w:left w:type="dxa" w:w="60"/>
+              <w:bottom w:type="dxa" w:w="30"/>
+              <w:right w:type="dxa" w:w="60"/>
+            </w:tcMar>
+          </w:tcPr>
+          <w:p>
+            <w:pPr>
+              <w:jc w:val="center"/>
+            </w:pPr>
+            <w:r>
+              <w:rPr>
+                <w:rFonts w:ascii="Times New Roman" w:cs="Times New Roman" w:eastAsia="Times New Roman" w:hAnsi="Times New Roman"/>
+                <w:b/>
+                <w:bCs/>
+                <w:sz w:val="14"/>
+                <w:szCs w:val="14"/>
+              </w:rPr>
+              <w:t xml:space="preserve">HRSID result as reported</w:t>
+            </w:r>
+          </w:p>
+        </w:tc>
+        <w:tc>
+          <w:tcPr>
+            <w:tcW w:type="dxa" w:w="1900"/>
+            <w:tcBorders>
+              <w:top w:val="single" w:color="999999" w:sz="4"/>
+              <w:left w:val="single" w:color="999999" w:sz="4"/>
+              <w:bottom w:val="single" w:color="999999" w:sz="4"/>
+              <w:right w:val="single" w:color="999999" w:sz="4"/>
+            </w:tcBorders>
+            <w:shd w:fill="E8EDF5" w:color="auto" w:val="clear"/>
+            <w:tcMar>
+              <w:top w:type="dxa" w:w="30"/>
+              <w:left w:type="dxa" w:w="60"/>
+              <w:bottom w:type="dxa" w:w="30"/>
+              <w:right w:type="dxa" w:w="60"/>
+            </w:tcMar>
+          </w:tcPr>
+          <w:p>
+            <w:pPr>
+              <w:jc w:val="center"/>
+            </w:pPr>
+            <w:r>
+              <w:rPr>
+                <w:rFonts w:ascii="Times New Roman" w:cs="Times New Roman" w:eastAsia="Times New Roman" w:hAnsi="Times New Roman"/>
+                <w:b/>
+                <w:bCs/>
+                <w:sz w:val="14"/>
+                <w:szCs w:val="14"/>
+              </w:rPr>
+              <w:t xml:space="preserve">Model cost</w:t>
+            </w:r>
+          </w:p>
+        </w:tc>
+        <w:tc>
+          <w:tcPr>
+            <w:tcW w:type="dxa" w:w="2300"/>
+            <w:tcBorders>
+              <w:top w:val="single" w:color="999999" w:sz="4"/>
+              <w:left w:val="single" w:color="999999" w:sz="4"/>
+              <w:bottom w:val="single" w:color="999999" w:sz="4"/>
+              <w:right w:val="single" w:color="999999" w:sz="4"/>
+            </w:tcBorders>
+            <w:shd w:fill="E8EDF5" w:color="auto" w:val="clear"/>
+            <w:tcMar>
+              <w:top w:type="dxa" w:w="30"/>
+              <w:left w:type="dxa" w:w="60"/>
+              <w:bottom w:type="dxa" w:w="30"/>
+              <w:right w:type="dxa" w:w="60"/>
+            </w:tcMar>
+          </w:tcPr>
+          <w:p>
+            <w:pPr>
+              <w:jc w:val="center"/>
+            </w:pPr>
+            <w:r>
+              <w:rPr>
+                <w:rFonts w:ascii="Times New Roman" w:cs="Times New Roman" w:eastAsia="Times New Roman" w:hAnsi="Times New Roman"/>
+                <w:b/>
+                <w:bCs/>
+                <w:sz w:val="14"/>
+                <w:szCs w:val="14"/>
+              </w:rPr>
+              <w:t xml:space="preserve">Speed / platform</w:t>
+            </w:r>
+          </w:p>
+        </w:tc>
+        <w:tc>
+          <w:tcPr>
+            <w:tcW w:type="dxa" w:w="2900"/>
+            <w:tcBorders>
+              <w:top w:val="single" w:color="999999" w:sz="4"/>
+              <w:left w:val="single" w:color="999999" w:sz="4"/>
+              <w:bottom w:val="single" w:color="999999" w:sz="4"/>
+              <w:right w:val="single" w:color="999999" w:sz="4"/>
+            </w:tcBorders>
+            <w:shd w:fill="E8EDF5" w:color="auto" w:val="clear"/>
+            <w:tcMar>
+              <w:top w:type="dxa" w:w="30"/>
+              <w:left w:type="dxa" w:w="60"/>
+              <w:bottom w:type="dxa" w:w="30"/>
+              <w:right w:type="dxa" w:w="60"/>
+            </w:tcMar>
+          </w:tcPr>
+          <w:p>
+            <w:pPr>
+              <w:jc w:val="center"/>
+            </w:pPr>
+            <w:r>
+              <w:rPr>
+                <w:rFonts w:ascii="Times New Roman" w:cs="Times New Roman" w:eastAsia="Times New Roman" w:hAnsi="Times New Roman"/>
+                <w:b/>
+                <w:bCs/>
+                <w:sz w:val="14"/>
+                <w:szCs w:val="14"/>
+              </w:rPr>
+              <w:t xml:space="preserve">This work at the same recall (all images / test split)</w:t>
+            </w:r>
+          </w:p>
+        </w:tc>
+      </w:tr>
+      <w:tr>
+        <w:trPr>
+          <w:cantSplit/>
+        </w:trPr>
+        <w:tc>
+          <w:tcPr>
+            <w:tcW w:type="dxa" w:w="620"/>
+            <w:tcBorders>
+              <w:top w:val="single" w:color="999999" w:sz="4"/>
+              <w:left w:val="single" w:color="999999" w:sz="4"/>
+              <w:bottom w:val="single" w:color="999999" w:sz="4"/>
+              <w:right w:val="single" w:color="999999" w:sz="4"/>
+            </w:tcBorders>
+            <w:tcMar>
+              <w:top w:type="dxa" w:w="30"/>
+              <w:left w:type="dxa" w:w="60"/>
+              <w:bottom w:type="dxa" w:w="30"/>
+              <w:right w:type="dxa" w:w="60"/>
+            </w:tcMar>
+          </w:tcPr>
+          <w:p>
+            <w:pPr>
+              <w:jc w:val="left"/>
+            </w:pPr>
+            <w:r>
+              <w:rPr>
+                <w:rFonts w:ascii="Times New Roman" w:cs="Times New Roman" w:eastAsia="Times New Roman" w:hAnsi="Times New Roman"/>
+                <w:b w:val="false"/>
+                <w:bCs w:val="false"/>
+                <w:sz w:val="14"/>
+                <w:szCs w:val="14"/>
+              </w:rPr>
+              <w:t xml:space="preserve">[22]</w:t>
+            </w:r>
+          </w:p>
+        </w:tc>
+        <w:tc>
+          <w:tcPr>
+            <w:tcW w:type="dxa" w:w="2900"/>
+            <w:tcBorders>
+              <w:top w:val="single" w:color="999999" w:sz="4"/>
+              <w:left w:val="single" w:color="999999" w:sz="4"/>
+              <w:bottom w:val="single" w:color="999999" w:sz="4"/>
+              <w:right w:val="single" w:color="999999" w:sz="4"/>
+            </w:tcBorders>
+            <w:tcMar>
+              <w:top w:type="dxa" w:w="30"/>
+              <w:left w:type="dxa" w:w="60"/>
+              <w:bottom w:type="dxa" w:w="30"/>
+              <w:right w:type="dxa" w:w="60"/>
+            </w:tcMar>
+          </w:tcPr>
+          <w:p>
+            <w:pPr>
+              <w:jc w:val="left"/>
+            </w:pPr>
+            <w:r>
+              <w:rPr>
+                <w:rFonts w:ascii="Times New Roman" w:cs="Times New Roman" w:eastAsia="Times New Roman" w:hAnsi="Times New Roman"/>
+                <w:b w:val="false"/>
+                <w:bCs w:val="false"/>
+                <w:sz w:val="14"/>
+                <w:szCs w:val="14"/>
+              </w:rPr>
+              <w:t xml:space="preserve">AD-YOLO, YOLO11n-based with state-space module and shared detail head (2026, GRSL)</w:t>
+            </w:r>
+          </w:p>
+        </w:tc>
+        <w:tc>
+          <w:tcPr>
+            <w:tcW w:type="dxa" w:w="3500"/>
+            <w:tcBorders>
+              <w:top w:val="single" w:color="999999" w:sz="4"/>
+              <w:left w:val="single" w:color="999999" w:sz="4"/>
+              <w:bottom w:val="single" w:color="999999" w:sz="4"/>
+              <w:right w:val="single" w:color="999999" w:sz="4"/>
+            </w:tcBorders>
+            <w:tcMar>
+              <w:top w:type="dxa" w:w="30"/>
+              <w:left w:type="dxa" w:w="60"/>
+              <w:bottom w:type="dxa" w:w="30"/>
+              <w:right w:type="dxa" w:w="60"/>
+            </w:tcMar>
+          </w:tcPr>
+          <w:p>
+            <w:pPr>
+              <w:jc w:val="center"/>
+            </w:pPr>
+            <w:r>
+              <w:rPr>
+                <w:rFonts w:ascii="Times New Roman" w:cs="Times New Roman" w:eastAsia="Times New Roman" w:hAnsi="Times New Roman"/>
+                <w:b w:val="false"/>
+                <w:bCs w:val="false"/>
+                <w:sz w:val="14"/>
+                <w:szCs w:val="14"/>
+              </w:rPr>
+              <w:t xml:space="preserve">P 91.7 %, R 83.8 %, AP50 91.8 %, AP50:95 68.7 % (YOLO11n baseline 67.3 %); 65 / 35 split, trained from scratch</w:t>
+            </w:r>
+          </w:p>
+        </w:tc>
+        <w:tc>
+          <w:tcPr>
+            <w:tcW w:type="dxa" w:w="1900"/>
+            <w:tcBorders>
+              <w:top w:val="single" w:color="999999" w:sz="4"/>
+              <w:left w:val="single" w:color="999999" w:sz="4"/>
+              <w:bottom w:val="single" w:color="999999" w:sz="4"/>
+              <w:right w:val="single" w:color="999999" w:sz="4"/>
+            </w:tcBorders>
+            <w:tcMar>
+              <w:top w:type="dxa" w:w="30"/>
+              <w:left w:type="dxa" w:w="60"/>
+              <w:bottom w:type="dxa" w:w="30"/>
+              <w:right w:type="dxa" w:w="60"/>
+            </w:tcMar>
+          </w:tcPr>
+          <w:p>
+            <w:pPr>
+              <w:jc w:val="center"/>
+            </w:pPr>
+            <w:r>
+              <w:rPr>
+                <w:rFonts w:ascii="Times New Roman" w:cs="Times New Roman" w:eastAsia="Times New Roman" w:hAnsi="Times New Roman"/>
+                <w:b w:val="false"/>
+                <w:bCs w:val="false"/>
+                <w:sz w:val="14"/>
+                <w:szCs w:val="14"/>
+              </w:rPr>
+              <w:t xml:space="preserve">2.75 M params, 7.0 GFLOPs</w:t>
+            </w:r>
+          </w:p>
+        </w:tc>
+        <w:tc>
+          <w:tcPr>
+            <w:tcW w:type="dxa" w:w="2300"/>
+            <w:tcBorders>
+              <w:top w:val="single" w:color="999999" w:sz="4"/>
+              <w:left w:val="single" w:color="999999" w:sz="4"/>
+              <w:bottom w:val="single" w:color="999999" w:sz="4"/>
+              <w:right w:val="single" w:color="999999" w:sz="4"/>
+            </w:tcBorders>
+            <w:tcMar>
+              <w:top w:type="dxa" w:w="30"/>
+              <w:left w:type="dxa" w:w="60"/>
+              <w:bottom w:type="dxa" w:w="30"/>
+              <w:right w:type="dxa" w:w="60"/>
+            </w:tcMar>
+          </w:tcPr>
+          <w:p>
+            <w:pPr>
+              <w:jc w:val="center"/>
+            </w:pPr>
+            <w:r>
+              <w:rPr>
+                <w:rFonts w:ascii="Times New Roman" w:cs="Times New Roman" w:eastAsia="Times New Roman" w:hAnsi="Times New Roman"/>
+                <w:b w:val="false"/>
+                <w:bCs w:val="false"/>
+                <w:sz w:val="14"/>
+                <w:szCs w:val="14"/>
+              </w:rPr>
+              <w:t xml:space="preserve">532 FPS, RTX 4090</w:t>
+            </w:r>
+          </w:p>
+        </w:tc>
+        <w:tc>
+          <w:tcPr>
+            <w:tcW w:type="dxa" w:w="2900"/>
+            <w:tcBorders>
+              <w:top w:val="single" w:color="999999" w:sz="4"/>
+              <w:left w:val="single" w:color="999999" w:sz="4"/>
+              <w:bottom w:val="single" w:color="999999" w:sz="4"/>
+              <w:right w:val="single" w:color="999999" w:sz="4"/>
+            </w:tcBorders>
+            <w:tcMar>
+              <w:top w:type="dxa" w:w="30"/>
+              <w:left w:type="dxa" w:w="60"/>
+              <w:bottom w:type="dxa" w:w="30"/>
+              <w:right w:type="dxa" w:w="60"/>
+            </w:tcMar>
+          </w:tcPr>
+          <w:p>
+            <w:pPr>
+              <w:jc w:val="center"/>
+            </w:pPr>
+            <w:r>
+              <w:rPr>
+                <w:rFonts w:ascii="Times New Roman" w:cs="Times New Roman" w:eastAsia="Times New Roman" w:hAnsi="Times New Roman"/>
+                <w:b w:val="false"/>
+                <w:bCs w:val="false"/>
+                <w:sz w:val="14"/>
+                <w:szCs w:val="14"/>
+              </w:rPr>
+              <w:t xml:space="preserve">recall 83.4 %: precision 93.8 % / recall 83.2 %: precision 91.3 %</w:t>
+            </w:r>
+          </w:p>
+        </w:tc>
+      </w:tr>
+      <w:tr>
+        <w:trPr>
+          <w:cantSplit/>
+        </w:trPr>
+        <w:tc>
+          <w:tcPr>
+            <w:tcW w:type="dxa" w:w="620"/>
+            <w:tcBorders>
+              <w:top w:val="single" w:color="999999" w:sz="4"/>
+              <w:left w:val="single" w:color="999999" w:sz="4"/>
+              <w:bottom w:val="single" w:color="999999" w:sz="4"/>
+              <w:right w:val="single" w:color="999999" w:sz="4"/>
+            </w:tcBorders>
+            <w:tcMar>
+              <w:top w:type="dxa" w:w="30"/>
+              <w:left w:type="dxa" w:w="60"/>
+              <w:bottom w:type="dxa" w:w="30"/>
+              <w:right w:type="dxa" w:w="60"/>
+            </w:tcMar>
+          </w:tcPr>
+          <w:p>
+            <w:pPr>
+              <w:jc w:val="left"/>
+            </w:pPr>
+            <w:r>
+              <w:rPr>
+                <w:rFonts w:ascii="Times New Roman" w:cs="Times New Roman" w:eastAsia="Times New Roman" w:hAnsi="Times New Roman"/>
+                <w:b w:val="false"/>
+                <w:bCs w:val="false"/>
+                <w:sz w:val="14"/>
+                <w:szCs w:val="14"/>
+              </w:rPr>
+              <w:t xml:space="preserve">[23]</w:t>
+            </w:r>
+          </w:p>
+        </w:tc>
+        <w:tc>
+          <w:tcPr>
+            <w:tcW w:type="dxa" w:w="2900"/>
+            <w:tcBorders>
+              <w:top w:val="single" w:color="999999" w:sz="4"/>
+              <w:left w:val="single" w:color="999999" w:sz="4"/>
+              <w:bottom w:val="single" w:color="999999" w:sz="4"/>
+              <w:right w:val="single" w:color="999999" w:sz="4"/>
+            </w:tcBorders>
+            <w:tcMar>
+              <w:top w:type="dxa" w:w="30"/>
+              <w:left w:type="dxa" w:w="60"/>
+              <w:bottom w:type="dxa" w:w="30"/>
+              <w:right w:type="dxa" w:w="60"/>
+            </w:tcMar>
+          </w:tcPr>
+          <w:p>
+            <w:pPr>
+              <w:jc w:val="left"/>
+            </w:pPr>
+            <w:r>
+              <w:rPr>
+                <w:rFonts w:ascii="Times New Roman" w:cs="Times New Roman" w:eastAsia="Times New Roman" w:hAnsi="Times New Roman"/>
+                <w:b w:val="false"/>
+                <w:bCs w:val="false"/>
+                <w:sz w:val="14"/>
+                <w:szCs w:val="14"/>
+              </w:rPr>
+              <w:t xml:space="preserve">AMFS-Net, adaptive multiscale fusion, P3+P4 head (2026, GRSL)</w:t>
+            </w:r>
+          </w:p>
+        </w:tc>
+        <w:tc>
+          <w:tcPr>
+            <w:tcW w:type="dxa" w:w="3500"/>
+            <w:tcBorders>
+              <w:top w:val="single" w:color="999999" w:sz="4"/>
+              <w:left w:val="single" w:color="999999" w:sz="4"/>
+              <w:bottom w:val="single" w:color="999999" w:sz="4"/>
+              <w:right w:val="single" w:color="999999" w:sz="4"/>
+            </w:tcBorders>
+            <w:tcMar>
+              <w:top w:type="dxa" w:w="30"/>
+              <w:left w:type="dxa" w:w="60"/>
+              <w:bottom w:type="dxa" w:w="30"/>
+              <w:right w:type="dxa" w:w="60"/>
+            </w:tcMar>
+          </w:tcPr>
+          <w:p>
+            <w:pPr>
+              <w:jc w:val="center"/>
+            </w:pPr>
+            <w:r>
+              <w:rPr>
+                <w:rFonts w:ascii="Times New Roman" w:cs="Times New Roman" w:eastAsia="Times New Roman" w:hAnsi="Times New Roman"/>
+                <w:b w:val="false"/>
+                <w:bCs w:val="false"/>
+                <w:sz w:val="14"/>
+                <w:szCs w:val="14"/>
+              </w:rPr>
+              <w:t xml:space="preserve">P 93.6 %, AP50 93.1 % (recall n.r. in the HRSID table; ESarDet 93.2 %, YOLO11n 92.8 %); 640 px</w:t>
+            </w:r>
+          </w:p>
+        </w:tc>
+        <w:tc>
+          <w:tcPr>
+            <w:tcW w:type="dxa" w:w="1900"/>
+            <w:tcBorders>
+              <w:top w:val="single" w:color="999999" w:sz="4"/>
+              <w:left w:val="single" w:color="999999" w:sz="4"/>
+              <w:bottom w:val="single" w:color="999999" w:sz="4"/>
+              <w:right w:val="single" w:color="999999" w:sz="4"/>
+            </w:tcBorders>
+            <w:tcMar>
+              <w:top w:type="dxa" w:w="30"/>
+              <w:left w:type="dxa" w:w="60"/>
+              <w:bottom w:type="dxa" w:w="30"/>
+              <w:right w:type="dxa" w:w="60"/>
+            </w:tcMar>
+          </w:tcPr>
+          <w:p>
+            <w:pPr>
+              <w:jc w:val="center"/>
+            </w:pPr>
+            <w:r>
+              <w:rPr>
+                <w:rFonts w:ascii="Times New Roman" w:cs="Times New Roman" w:eastAsia="Times New Roman" w:hAnsi="Times New Roman"/>
+                <w:b w:val="false"/>
+                <w:bCs w:val="false"/>
+                <w:sz w:val="14"/>
+                <w:szCs w:val="14"/>
+              </w:rPr>
+              <w:t xml:space="preserve">1.59 M params, 7.0 GFLOPs</w:t>
+            </w:r>
+          </w:p>
+        </w:tc>
+        <w:tc>
+          <w:tcPr>
+            <w:tcW w:type="dxa" w:w="2300"/>
+            <w:tcBorders>
+              <w:top w:val="single" w:color="999999" w:sz="4"/>
+              <w:left w:val="single" w:color="999999" w:sz="4"/>
+              <w:bottom w:val="single" w:color="999999" w:sz="4"/>
+              <w:right w:val="single" w:color="999999" w:sz="4"/>
+            </w:tcBorders>
+            <w:tcMar>
+              <w:top w:type="dxa" w:w="30"/>
+              <w:left w:type="dxa" w:w="60"/>
+              <w:bottom w:type="dxa" w:w="30"/>
+              <w:right w:type="dxa" w:w="60"/>
+            </w:tcMar>
+          </w:tcPr>
+          <w:p>
+            <w:pPr>
+              <w:jc w:val="center"/>
+            </w:pPr>
+            <w:r>
+              <w:rPr>
+                <w:rFonts w:ascii="Times New Roman" w:cs="Times New Roman" w:eastAsia="Times New Roman" w:hAnsi="Times New Roman"/>
+                <w:b w:val="false"/>
+                <w:bCs w:val="false"/>
+                <w:sz w:val="14"/>
+                <w:szCs w:val="14"/>
+              </w:rPr>
+              <w:t xml:space="preserve">371 FPS, RTX 4090</w:t>
+            </w:r>
+          </w:p>
+        </w:tc>
+        <w:tc>
+          <w:tcPr>
+            <w:tcW w:type="dxa" w:w="2900"/>
+            <w:tcBorders>
+              <w:top w:val="single" w:color="999999" w:sz="4"/>
+              <w:left w:val="single" w:color="999999" w:sz="4"/>
+              <w:bottom w:val="single" w:color="999999" w:sz="4"/>
+              <w:right w:val="single" w:color="999999" w:sz="4"/>
+            </w:tcBorders>
+            <w:tcMar>
+              <w:top w:type="dxa" w:w="30"/>
+              <w:left w:type="dxa" w:w="60"/>
+              <w:bottom w:type="dxa" w:w="30"/>
+              <w:right w:type="dxa" w:w="60"/>
+            </w:tcMar>
+          </w:tcPr>
+          <w:p>
+            <w:pPr>
+              <w:jc w:val="center"/>
+            </w:pPr>
+            <w:r>
+              <w:rPr>
+                <w:rFonts w:ascii="Times New Roman" w:cs="Times New Roman" w:eastAsia="Times New Roman" w:hAnsi="Times New Roman"/>
+                <w:b w:val="false"/>
+                <w:bCs w:val="false"/>
+                <w:sz w:val="14"/>
+                <w:szCs w:val="14"/>
+              </w:rPr>
+              <w:t xml:space="preserve">no recall given, so no matched point</w:t>
+            </w:r>
+          </w:p>
+        </w:tc>
+      </w:tr>
+      <w:tr>
+        <w:trPr>
+          <w:cantSplit/>
+        </w:trPr>
+        <w:tc>
+          <w:tcPr>
+            <w:tcW w:type="dxa" w:w="620"/>
+            <w:tcBorders>
+              <w:top w:val="single" w:color="999999" w:sz="4"/>
+              <w:left w:val="single" w:color="999999" w:sz="4"/>
+              <w:bottom w:val="single" w:color="999999" w:sz="4"/>
+              <w:right w:val="single" w:color="999999" w:sz="4"/>
+            </w:tcBorders>
+            <w:tcMar>
+              <w:top w:type="dxa" w:w="30"/>
+              <w:left w:type="dxa" w:w="60"/>
+              <w:bottom w:type="dxa" w:w="30"/>
+              <w:right w:type="dxa" w:w="60"/>
+            </w:tcMar>
+          </w:tcPr>
+          <w:p>
+            <w:pPr>
+              <w:jc w:val="left"/>
+            </w:pPr>
+            <w:r>
+              <w:rPr>
+                <w:rFonts w:ascii="Times New Roman" w:cs="Times New Roman" w:eastAsia="Times New Roman" w:hAnsi="Times New Roman"/>
+                <w:b w:val="false"/>
+                <w:bCs w:val="false"/>
+                <w:sz w:val="14"/>
+                <w:szCs w:val="14"/>
+              </w:rPr>
+              <w:t xml:space="preserve">[24]</w:t>
+            </w:r>
+          </w:p>
+        </w:tc>
+        <w:tc>
+          <w:tcPr>
+            <w:tcW w:type="dxa" w:w="2900"/>
+            <w:tcBorders>
+              <w:top w:val="single" w:color="999999" w:sz="4"/>
+              <w:left w:val="single" w:color="999999" w:sz="4"/>
+              <w:bottom w:val="single" w:color="999999" w:sz="4"/>
+              <w:right w:val="single" w:color="999999" w:sz="4"/>
+            </w:tcBorders>
+            <w:tcMar>
+              <w:top w:type="dxa" w:w="30"/>
+              <w:left w:type="dxa" w:w="60"/>
+              <w:bottom w:type="dxa" w:w="30"/>
+              <w:right w:type="dxa" w:w="60"/>
+            </w:tcMar>
+          </w:tcPr>
+          <w:p>
+            <w:pPr>
+              <w:jc w:val="left"/>
+            </w:pPr>
+            <w:r>
+              <w:rPr>
+                <w:rFonts w:ascii="Times New Roman" w:cs="Times New Roman" w:eastAsia="Times New Roman" w:hAnsi="Times New Roman"/>
+                <w:b w:val="false"/>
+                <w:bCs w:val="false"/>
+                <w:sz w:val="14"/>
+                <w:szCs w:val="14"/>
+              </w:rPr>
+              <w:t xml:space="preserve">LightSAR-Net, dual-edge stem, dynamic head (2025, GRSL)</w:t>
+            </w:r>
+          </w:p>
+        </w:tc>
+        <w:tc>
+          <w:tcPr>
+            <w:tcW w:type="dxa" w:w="3500"/>
+            <w:tcBorders>
+              <w:top w:val="single" w:color="999999" w:sz="4"/>
+              <w:left w:val="single" w:color="999999" w:sz="4"/>
+              <w:bottom w:val="single" w:color="999999" w:sz="4"/>
+              <w:right w:val="single" w:color="999999" w:sz="4"/>
+            </w:tcBorders>
+            <w:tcMar>
+              <w:top w:type="dxa" w:w="30"/>
+              <w:left w:type="dxa" w:w="60"/>
+              <w:bottom w:type="dxa" w:w="30"/>
+              <w:right w:type="dxa" w:w="60"/>
+            </w:tcMar>
+          </w:tcPr>
+          <w:p>
+            <w:pPr>
+              <w:jc w:val="center"/>
+            </w:pPr>
+            <w:r>
+              <w:rPr>
+                <w:rFonts w:ascii="Times New Roman" w:cs="Times New Roman" w:eastAsia="Times New Roman" w:hAnsi="Times New Roman"/>
+                <w:b w:val="false"/>
+                <w:bCs w:val="false"/>
+                <w:sz w:val="14"/>
+                <w:szCs w:val="14"/>
+              </w:rPr>
+              <w:t xml:space="preserve">AP50 95.8 % (Table III; the print of the digits is degraded, value read as 95.8; YOLOv8n 94.9 %); split 3,642 / 1,962</w:t>
+            </w:r>
+          </w:p>
+        </w:tc>
+        <w:tc>
+          <w:tcPr>
+            <w:tcW w:type="dxa" w:w="1900"/>
+            <w:tcBorders>
+              <w:top w:val="single" w:color="999999" w:sz="4"/>
+              <w:left w:val="single" w:color="999999" w:sz="4"/>
+              <w:bottom w:val="single" w:color="999999" w:sz="4"/>
+              <w:right w:val="single" w:color="999999" w:sz="4"/>
+            </w:tcBorders>
+            <w:tcMar>
+              <w:top w:type="dxa" w:w="30"/>
+              <w:left w:type="dxa" w:w="60"/>
+              <w:bottom w:type="dxa" w:w="30"/>
+              <w:right w:type="dxa" w:w="60"/>
+            </w:tcMar>
+          </w:tcPr>
+          <w:p>
+            <w:pPr>
+              <w:jc w:val="center"/>
+            </w:pPr>
+            <w:r>
+              <w:rPr>
+                <w:rFonts w:ascii="Times New Roman" w:cs="Times New Roman" w:eastAsia="Times New Roman" w:hAnsi="Times New Roman"/>
+                <w:b w:val="false"/>
+                <w:bCs w:val="false"/>
+                <w:sz w:val="14"/>
+                <w:szCs w:val="14"/>
+              </w:rPr>
+              <w:t xml:space="preserve">2.11 M params, 7.2 GFLOPs</w:t>
+            </w:r>
+          </w:p>
+        </w:tc>
+        <w:tc>
+          <w:tcPr>
+            <w:tcW w:type="dxa" w:w="2300"/>
+            <w:tcBorders>
+              <w:top w:val="single" w:color="999999" w:sz="4"/>
+              <w:left w:val="single" w:color="999999" w:sz="4"/>
+              <w:bottom w:val="single" w:color="999999" w:sz="4"/>
+              <w:right w:val="single" w:color="999999" w:sz="4"/>
+            </w:tcBorders>
+            <w:tcMar>
+              <w:top w:type="dxa" w:w="30"/>
+              <w:left w:type="dxa" w:w="60"/>
+              <w:bottom w:type="dxa" w:w="30"/>
+              <w:right w:type="dxa" w:w="60"/>
+            </w:tcMar>
+          </w:tcPr>
+          <w:p>
+            <w:pPr>
+              <w:jc w:val="center"/>
+            </w:pPr>
+            <w:r>
+              <w:rPr>
+                <w:rFonts w:ascii="Times New Roman" w:cs="Times New Roman" w:eastAsia="Times New Roman" w:hAnsi="Times New Roman"/>
+                <w:b w:val="false"/>
+                <w:bCs w:val="false"/>
+                <w:sz w:val="14"/>
+                <w:szCs w:val="14"/>
+              </w:rPr>
+              <w:t xml:space="preserve">RTX 3060, speed n.r.</w:t>
+            </w:r>
+          </w:p>
+        </w:tc>
+        <w:tc>
+          <w:tcPr>
+            <w:tcW w:type="dxa" w:w="2900"/>
+            <w:tcBorders>
+              <w:top w:val="single" w:color="999999" w:sz="4"/>
+              <w:left w:val="single" w:color="999999" w:sz="4"/>
+              <w:bottom w:val="single" w:color="999999" w:sz="4"/>
+              <w:right w:val="single" w:color="999999" w:sz="4"/>
+            </w:tcBorders>
+            <w:tcMar>
+              <w:top w:type="dxa" w:w="30"/>
+              <w:left w:type="dxa" w:w="60"/>
+              <w:bottom w:type="dxa" w:w="30"/>
+              <w:right w:type="dxa" w:w="60"/>
+            </w:tcMar>
+          </w:tcPr>
+          <w:p>
+            <w:pPr>
+              <w:jc w:val="center"/>
+            </w:pPr>
+            <w:r>
+              <w:rPr>
+                <w:rFonts w:ascii="Times New Roman" w:cs="Times New Roman" w:eastAsia="Times New Roman" w:hAnsi="Times New Roman"/>
+                <w:b w:val="false"/>
+                <w:bCs w:val="false"/>
+                <w:sz w:val="14"/>
+                <w:szCs w:val="14"/>
+              </w:rPr>
+              <w:t xml:space="preserve">no recall given, so no matched point</w:t>
+            </w:r>
+          </w:p>
+        </w:tc>
+      </w:tr>
+      <w:tr>
+        <w:trPr>
+          <w:cantSplit/>
+        </w:trPr>
+        <w:tc>
+          <w:tcPr>
+            <w:tcW w:type="dxa" w:w="620"/>
+            <w:tcBorders>
+              <w:top w:val="single" w:color="999999" w:sz="4"/>
+              <w:left w:val="single" w:color="999999" w:sz="4"/>
+              <w:bottom w:val="single" w:color="999999" w:sz="4"/>
+              <w:right w:val="single" w:color="999999" w:sz="4"/>
+            </w:tcBorders>
+            <w:tcMar>
+              <w:top w:type="dxa" w:w="30"/>
+              <w:left w:type="dxa" w:w="60"/>
+              <w:bottom w:type="dxa" w:w="30"/>
+              <w:right w:type="dxa" w:w="60"/>
+            </w:tcMar>
+          </w:tcPr>
+          <w:p>
+            <w:pPr>
+              <w:jc w:val="left"/>
+            </w:pPr>
+            <w:r>
+              <w:rPr>
+                <w:rFonts w:ascii="Times New Roman" w:cs="Times New Roman" w:eastAsia="Times New Roman" w:hAnsi="Times New Roman"/>
+                <w:b w:val="false"/>
+                <w:bCs w:val="false"/>
+                <w:sz w:val="14"/>
+                <w:szCs w:val="14"/>
+              </w:rPr>
+              <w:t xml:space="preserve">[7]</w:t>
+            </w:r>
+          </w:p>
+        </w:tc>
+        <w:tc>
+          <w:tcPr>
+            <w:tcW w:type="dxa" w:w="2900"/>
+            <w:tcBorders>
+              <w:top w:val="single" w:color="999999" w:sz="4"/>
+              <w:left w:val="single" w:color="999999" w:sz="4"/>
+              <w:bottom w:val="single" w:color="999999" w:sz="4"/>
+              <w:right w:val="single" w:color="999999" w:sz="4"/>
+            </w:tcBorders>
+            <w:tcMar>
+              <w:top w:type="dxa" w:w="30"/>
+              <w:left w:type="dxa" w:w="60"/>
+              <w:bottom w:type="dxa" w:w="30"/>
+              <w:right w:type="dxa" w:w="60"/>
+            </w:tcMar>
+          </w:tcPr>
+          <w:p>
+            <w:pPr>
+              <w:jc w:val="left"/>
+            </w:pPr>
+            <w:r>
+              <w:rPr>
+                <w:rFonts w:ascii="Times New Roman" w:cs="Times New Roman" w:eastAsia="Times New Roman" w:hAnsi="Times New Roman"/>
+                <w:b w:val="false"/>
+                <w:bCs w:val="false"/>
+                <w:sz w:val="14"/>
+                <w:szCs w:val="14"/>
+              </w:rPr>
+              <w:t xml:space="preserve">GL-DETR, global-to-local transformer decoder (2024, GRSL)</w:t>
+            </w:r>
+          </w:p>
+        </w:tc>
+        <w:tc>
+          <w:tcPr>
+            <w:tcW w:type="dxa" w:w="3500"/>
+            <w:tcBorders>
+              <w:top w:val="single" w:color="999999" w:sz="4"/>
+              <w:left w:val="single" w:color="999999" w:sz="4"/>
+              <w:bottom w:val="single" w:color="999999" w:sz="4"/>
+              <w:right w:val="single" w:color="999999" w:sz="4"/>
+            </w:tcBorders>
+            <w:tcMar>
+              <w:top w:type="dxa" w:w="30"/>
+              <w:left w:type="dxa" w:w="60"/>
+              <w:bottom w:type="dxa" w:w="30"/>
+              <w:right w:type="dxa" w:w="60"/>
+            </w:tcMar>
+          </w:tcPr>
+          <w:p>
+            <w:pPr>
+              <w:jc w:val="center"/>
+            </w:pPr>
+            <w:r>
+              <w:rPr>
+                <w:rFonts w:ascii="Times New Roman" w:cs="Times New Roman" w:eastAsia="Times New Roman" w:hAnsi="Times New Roman"/>
+                <w:b w:val="false"/>
+                <w:bCs w:val="false"/>
+                <w:sz w:val="14"/>
+                <w:szCs w:val="14"/>
+              </w:rPr>
+              <w:t xml:space="preserve">P 91.45 %, R 87.57 %, F1 89.47 %, AP50 92.13 %, AP75 82.17 % (DINO 87.22 %, Faster R-CNN 82.13 %)</w:t>
+            </w:r>
+          </w:p>
+        </w:tc>
+        <w:tc>
+          <w:tcPr>
+            <w:tcW w:type="dxa" w:w="1900"/>
+            <w:tcBorders>
+              <w:top w:val="single" w:color="999999" w:sz="4"/>
+              <w:left w:val="single" w:color="999999" w:sz="4"/>
+              <w:bottom w:val="single" w:color="999999" w:sz="4"/>
+              <w:right w:val="single" w:color="999999" w:sz="4"/>
+            </w:tcBorders>
+            <w:tcMar>
+              <w:top w:type="dxa" w:w="30"/>
+              <w:left w:type="dxa" w:w="60"/>
+              <w:bottom w:type="dxa" w:w="30"/>
+              <w:right w:type="dxa" w:w="60"/>
+            </w:tcMar>
+          </w:tcPr>
+          <w:p>
+            <w:pPr>
+              <w:jc w:val="center"/>
+            </w:pPr>
+            <w:r>
+              <w:rPr>
+                <w:rFonts w:ascii="Times New Roman" w:cs="Times New Roman" w:eastAsia="Times New Roman" w:hAnsi="Times New Roman"/>
+                <w:b w:val="false"/>
+                <w:bCs w:val="false"/>
+                <w:sz w:val="14"/>
+                <w:szCs w:val="14"/>
+              </w:rPr>
+              <w:t xml:space="preserve">n.r.</w:t>
+            </w:r>
+          </w:p>
+        </w:tc>
+        <w:tc>
+          <w:tcPr>
+            <w:tcW w:type="dxa" w:w="2300"/>
+            <w:tcBorders>
+              <w:top w:val="single" w:color="999999" w:sz="4"/>
+              <w:left w:val="single" w:color="999999" w:sz="4"/>
+              <w:bottom w:val="single" w:color="999999" w:sz="4"/>
+              <w:right w:val="single" w:color="999999" w:sz="4"/>
+            </w:tcBorders>
+            <w:tcMar>
+              <w:top w:type="dxa" w:w="30"/>
+              <w:left w:type="dxa" w:w="60"/>
+              <w:bottom w:type="dxa" w:w="30"/>
+              <w:right w:type="dxa" w:w="60"/>
+            </w:tcMar>
+          </w:tcPr>
+          <w:p>
+            <w:pPr>
+              <w:jc w:val="center"/>
+            </w:pPr>
+            <w:r>
+              <w:rPr>
+                <w:rFonts w:ascii="Times New Roman" w:cs="Times New Roman" w:eastAsia="Times New Roman" w:hAnsi="Times New Roman"/>
+                <w:b w:val="false"/>
+                <w:bCs w:val="false"/>
+                <w:sz w:val="14"/>
+                <w:szCs w:val="14"/>
+              </w:rPr>
+              <w:t xml:space="preserve">16.1 FPS, RTX 3090</w:t>
+            </w:r>
+          </w:p>
+        </w:tc>
+        <w:tc>
+          <w:tcPr>
+            <w:tcW w:type="dxa" w:w="2900"/>
+            <w:tcBorders>
+              <w:top w:val="single" w:color="999999" w:sz="4"/>
+              <w:left w:val="single" w:color="999999" w:sz="4"/>
+              <w:bottom w:val="single" w:color="999999" w:sz="4"/>
+              <w:right w:val="single" w:color="999999" w:sz="4"/>
+            </w:tcBorders>
+            <w:tcMar>
+              <w:top w:type="dxa" w:w="30"/>
+              <w:left w:type="dxa" w:w="60"/>
+              <w:bottom w:type="dxa" w:w="30"/>
+              <w:right w:type="dxa" w:w="60"/>
+            </w:tcMar>
+          </w:tcPr>
+          <w:p>
+            <w:pPr>
+              <w:jc w:val="center"/>
+            </w:pPr>
+            <w:r>
+              <w:rPr>
+                <w:rFonts w:ascii="Times New Roman" w:cs="Times New Roman" w:eastAsia="Times New Roman" w:hAnsi="Times New Roman"/>
+                <w:b w:val="false"/>
+                <w:bCs w:val="false"/>
+                <w:sz w:val="14"/>
+                <w:szCs w:val="14"/>
+              </w:rPr>
+              <w:t xml:space="preserve">recall 87.7 %: precision 88.7 %, F1 0.882 / recall 87.9 %: precision 85.4 %, F1 0.866</w:t>
+            </w:r>
+          </w:p>
+        </w:tc>
+      </w:tr>
+      <w:tr>
+        <w:trPr>
+          <w:cantSplit/>
+        </w:trPr>
+        <w:tc>
+          <w:tcPr>
+            <w:tcW w:type="dxa" w:w="620"/>
+            <w:tcBorders>
+              <w:top w:val="single" w:color="999999" w:sz="4"/>
+              <w:left w:val="single" w:color="999999" w:sz="4"/>
+              <w:bottom w:val="single" w:color="999999" w:sz="4"/>
+              <w:right w:val="single" w:color="999999" w:sz="4"/>
+            </w:tcBorders>
+            <w:tcMar>
+              <w:top w:type="dxa" w:w="30"/>
+              <w:left w:type="dxa" w:w="60"/>
+              <w:bottom w:type="dxa" w:w="30"/>
+              <w:right w:type="dxa" w:w="60"/>
+            </w:tcMar>
+          </w:tcPr>
+          <w:p>
+            <w:pPr>
+              <w:jc w:val="left"/>
+            </w:pPr>
+            <w:r>
+              <w:rPr>
+                <w:rFonts w:ascii="Times New Roman" w:cs="Times New Roman" w:eastAsia="Times New Roman" w:hAnsi="Times New Roman"/>
+                <w:b w:val="false"/>
+                <w:bCs w:val="false"/>
+                <w:sz w:val="14"/>
+                <w:szCs w:val="14"/>
+              </w:rPr>
+              <w:t xml:space="preserve">[25]</w:t>
+            </w:r>
+          </w:p>
+        </w:tc>
+        <w:tc>
+          <w:tcPr>
+            <w:tcW w:type="dxa" w:w="2900"/>
+            <w:tcBorders>
+              <w:top w:val="single" w:color="999999" w:sz="4"/>
+              <w:left w:val="single" w:color="999999" w:sz="4"/>
+              <w:bottom w:val="single" w:color="999999" w:sz="4"/>
+              <w:right w:val="single" w:color="999999" w:sz="4"/>
+            </w:tcBorders>
+            <w:tcMar>
+              <w:top w:type="dxa" w:w="30"/>
+              <w:left w:type="dxa" w:w="60"/>
+              <w:bottom w:type="dxa" w:w="30"/>
+              <w:right w:type="dxa" w:w="60"/>
+            </w:tcMar>
+          </w:tcPr>
+          <w:p>
+            <w:pPr>
+              <w:jc w:val="left"/>
+            </w:pPr>
+            <w:r>
+              <w:rPr>
+                <w:rFonts w:ascii="Times New Roman" w:cs="Times New Roman" w:eastAsia="Times New Roman" w:hAnsi="Times New Roman"/>
+                <w:b w:val="false"/>
+                <w:bCs w:val="false"/>
+                <w:sz w:val="14"/>
+                <w:szCs w:val="14"/>
+              </w:rPr>
+              <w:t xml:space="preserve">SAR-Net (YOLOv4-based, deformable convolution) (2022, GRSL)</w:t>
+            </w:r>
+          </w:p>
+        </w:tc>
+        <w:tc>
+          <w:tcPr>
+            <w:tcW w:type="dxa" w:w="3500"/>
+            <w:tcBorders>
+              <w:top w:val="single" w:color="999999" w:sz="4"/>
+              <w:left w:val="single" w:color="999999" w:sz="4"/>
+              <w:bottom w:val="single" w:color="999999" w:sz="4"/>
+              <w:right w:val="single" w:color="999999" w:sz="4"/>
+            </w:tcBorders>
+            <w:tcMar>
+              <w:top w:type="dxa" w:w="30"/>
+              <w:left w:type="dxa" w:w="60"/>
+              <w:bottom w:type="dxa" w:w="30"/>
+              <w:right w:type="dxa" w:w="60"/>
+            </w:tcMar>
+          </w:tcPr>
+          <w:p>
+            <w:pPr>
+              <w:jc w:val="center"/>
+            </w:pPr>
+            <w:r>
+              <w:rPr>
+                <w:rFonts w:ascii="Times New Roman" w:cs="Times New Roman" w:eastAsia="Times New Roman" w:hAnsi="Times New Roman"/>
+                <w:b w:val="false"/>
+                <w:bCs w:val="false"/>
+                <w:sz w:val="14"/>
+                <w:szCs w:val="14"/>
+              </w:rPr>
+              <w:t xml:space="preserve">800 px input: mAP 87.49 %, P 53.73 %, R 90.93 % at confidence threshold 0.05 (512 px: mAP 78.71 %); split 3,642 / 1,962</w:t>
+            </w:r>
+          </w:p>
+        </w:tc>
+        <w:tc>
+          <w:tcPr>
+            <w:tcW w:type="dxa" w:w="1900"/>
+            <w:tcBorders>
+              <w:top w:val="single" w:color="999999" w:sz="4"/>
+              <w:left w:val="single" w:color="999999" w:sz="4"/>
+              <w:bottom w:val="single" w:color="999999" w:sz="4"/>
+              <w:right w:val="single" w:color="999999" w:sz="4"/>
+            </w:tcBorders>
+            <w:tcMar>
+              <w:top w:type="dxa" w:w="30"/>
+              <w:left w:type="dxa" w:w="60"/>
+              <w:bottom w:type="dxa" w:w="30"/>
+              <w:right w:type="dxa" w:w="60"/>
+            </w:tcMar>
+          </w:tcPr>
+          <w:p>
+            <w:pPr>
+              <w:jc w:val="center"/>
+            </w:pPr>
+            <w:r>
+              <w:rPr>
+                <w:rFonts w:ascii="Times New Roman" w:cs="Times New Roman" w:eastAsia="Times New Roman" w:hAnsi="Times New Roman"/>
+                <w:b w:val="false"/>
+                <w:bCs w:val="false"/>
+                <w:sz w:val="14"/>
+                <w:szCs w:val="14"/>
+              </w:rPr>
+              <w:t xml:space="preserve">42.6 M params, 104.2 BFLOPs</w:t>
+            </w:r>
+          </w:p>
+        </w:tc>
+        <w:tc>
+          <w:tcPr>
+            <w:tcW w:type="dxa" w:w="2300"/>
+            <w:tcBorders>
+              <w:top w:val="single" w:color="999999" w:sz="4"/>
+              <w:left w:val="single" w:color="999999" w:sz="4"/>
+              <w:bottom w:val="single" w:color="999999" w:sz="4"/>
+              <w:right w:val="single" w:color="999999" w:sz="4"/>
+            </w:tcBorders>
+            <w:tcMar>
+              <w:top w:type="dxa" w:w="30"/>
+              <w:left w:type="dxa" w:w="60"/>
+              <w:bottom w:type="dxa" w:w="30"/>
+              <w:right w:type="dxa" w:w="60"/>
+            </w:tcMar>
+          </w:tcPr>
+          <w:p>
+            <w:pPr>
+              <w:jc w:val="center"/>
+            </w:pPr>
+            <w:r>
+              <w:rPr>
+                <w:rFonts w:ascii="Times New Roman" w:cs="Times New Roman" w:eastAsia="Times New Roman" w:hAnsi="Times New Roman"/>
+                <w:b w:val="false"/>
+                <w:bCs w:val="false"/>
+                <w:sz w:val="14"/>
+                <w:szCs w:val="14"/>
+              </w:rPr>
+              <w:t xml:space="preserve">0.118 s / image, GTX 1060</w:t>
+            </w:r>
+          </w:p>
+        </w:tc>
+        <w:tc>
+          <w:tcPr>
+            <w:tcW w:type="dxa" w:w="2900"/>
+            <w:tcBorders>
+              <w:top w:val="single" w:color="999999" w:sz="4"/>
+              <w:left w:val="single" w:color="999999" w:sz="4"/>
+              <w:bottom w:val="single" w:color="999999" w:sz="4"/>
+              <w:right w:val="single" w:color="999999" w:sz="4"/>
+            </w:tcBorders>
+            <w:tcMar>
+              <w:top w:type="dxa" w:w="30"/>
+              <w:left w:type="dxa" w:w="60"/>
+              <w:bottom w:type="dxa" w:w="30"/>
+              <w:right w:type="dxa" w:w="60"/>
+            </w:tcMar>
+          </w:tcPr>
+          <w:p>
+            <w:pPr>
+              <w:jc w:val="center"/>
+            </w:pPr>
+            <w:r>
+              <w:rPr>
+                <w:rFonts w:ascii="Times New Roman" w:cs="Times New Roman" w:eastAsia="Times New Roman" w:hAnsi="Times New Roman"/>
+                <w:b w:val="false"/>
+                <w:bCs w:val="false"/>
+                <w:sz w:val="14"/>
+                <w:szCs w:val="14"/>
+              </w:rPr>
+              <w:t xml:space="preserve">recall 91.2 %: precision 81.7 % / recall 91.1 %: precision 78.6 %</w:t>
+            </w:r>
+          </w:p>
+        </w:tc>
+      </w:tr>
+    </w:tbl>
+    <w:p>
+      <w:pPr>
+        <w:spacing w:after="120" w:before="40"/>
+        <w:jc w:val="both"/>
+      </w:pPr>
+      <w:r>
+        <w:rPr>
+          <w:rFonts w:ascii="Times New Roman" w:cs="Times New Roman" w:eastAsia="Times New Roman" w:hAnsi="Times New Roman"/>
+          <w:i/>
+          <w:iCs/>
+          <w:sz w:val="17"/>
+          <w:szCs w:val="17"/>
+        </w:rPr>
+        <w:t xml:space="preserve">This work: operating points read from the curve of the on-board context cascade (Figure 1) at the recall nearest to each reported value; "all images" includes in-sample images, "test split" is held out. Our best F1 along the curve is 0.885 on all images (recall 86.1 %, precision 91.1 %, 0.25 false events per image) and 0.873 on the test split (recall 84.4 %, precision 90.3 %). Reported precision and recall of [22], [7], [25] depend on the confidence threshold each paper chose; [25] used 0.05.</w:t>
+      </w:r>
+    </w:p>
+    <w:p>
+      <w:pPr>
+        <w:keepNext/>
+        <w:spacing w:after="70" w:before="150"/>
+      </w:pPr>
+      <w:r>
+        <w:rPr>
+          <w:rFonts w:ascii="Times New Roman" w:cs="Times New Roman" w:eastAsia="Times New Roman" w:hAnsi="Times New Roman"/>
+          <w:sz w:val="20"/>
+          <w:szCs w:val="20"/>
+        </w:rPr>
+        <w:t xml:space="preserve">Table 1b. Other newly screened papers: CFAR-family methods and lightweight detectors without HRSID results (no entry reports FPGA resources).</w:t>
+      </w:r>
+    </w:p>
+    <w:tbl>
+      <w:tblPr>
+        <w:tblW w:type="dxa" w:w="14020"/>
+        <w:tblBorders>
+          <w:top w:val="single" w:color="auto" w:sz="4"/>
+          <w:left w:val="single" w:color="auto" w:sz="4"/>
+          <w:bottom w:val="single" w:color="auto" w:sz="4"/>
+          <w:right w:val="single" w:color="auto" w:sz="4"/>
+          <w:insideH w:val="single" w:color="auto" w:sz="4"/>
+          <w:insideV w:val="single" w:color="auto" w:sz="4"/>
+        </w:tblBorders>
+      </w:tblPr>
+      <w:tblGrid>
+        <w:gridCol w:w="620"/>
+        <w:gridCol w:w="3000"/>
+        <w:gridCol w:w="2500"/>
+        <w:gridCol w:w="3500"/>
+        <w:gridCol w:w="2400"/>
+        <w:gridCol w:w="2000"/>
+      </w:tblGrid>
+      <w:tr>
+        <w:trPr>
+          <w:tblHeader/>
+        </w:trPr>
+        <w:tc>
+          <w:tcPr>
+            <w:tcW w:type="dxa" w:w="620"/>
+            <w:tcBorders>
+              <w:top w:val="single" w:color="999999" w:sz="4"/>
+              <w:left w:val="single" w:color="999999" w:sz="4"/>
+              <w:bottom w:val="single" w:color="999999" w:sz="4"/>
+              <w:right w:val="single" w:color="999999" w:sz="4"/>
+            </w:tcBorders>
+            <w:shd w:fill="E8EDF5" w:color="auto" w:val="clear"/>
+            <w:tcMar>
+              <w:top w:type="dxa" w:w="30"/>
+              <w:left w:type="dxa" w:w="60"/>
+              <w:bottom w:type="dxa" w:w="30"/>
+              <w:right w:type="dxa" w:w="60"/>
+            </w:tcMar>
+          </w:tcPr>
+          <w:p>
+            <w:pPr>
+              <w:jc w:val="center"/>
+            </w:pPr>
+            <w:r>
+              <w:rPr>
+                <w:rFonts w:ascii="Times New Roman" w:cs="Times New Roman" w:eastAsia="Times New Roman" w:hAnsi="Times New Roman"/>
+                <w:b/>
+                <w:bCs/>
+                <w:sz w:val="14"/>
+                <w:szCs w:val="14"/>
+              </w:rPr>
+              <w:t xml:space="preserve">Ref.</w:t>
+            </w:r>
+          </w:p>
+        </w:tc>
+        <w:tc>
+          <w:tcPr>
+            <w:tcW w:type="dxa" w:w="3000"/>
+            <w:tcBorders>
+              <w:top w:val="single" w:color="999999" w:sz="4"/>
+              <w:left w:val="single" w:color="999999" w:sz="4"/>
+              <w:bottom w:val="single" w:color="999999" w:sz="4"/>
+              <w:right w:val="single" w:color="999999" w:sz="4"/>
+            </w:tcBorders>
+            <w:shd w:fill="E8EDF5" w:color="auto" w:val="clear"/>
+            <w:tcMar>
+              <w:top w:type="dxa" w:w="30"/>
+              <w:left w:type="dxa" w:w="60"/>
+              <w:bottom w:type="dxa" w:w="30"/>
+              <w:right w:type="dxa" w:w="60"/>
+            </w:tcMar>
+          </w:tcPr>
+          <w:p>
+            <w:pPr>
+              <w:jc w:val="center"/>
+            </w:pPr>
+            <w:r>
+              <w:rPr>
+                <w:rFonts w:ascii="Times New Roman" w:cs="Times New Roman" w:eastAsia="Times New Roman" w:hAnsi="Times New Roman"/>
+                <w:b/>
+                <w:bCs/>
+                <w:sz w:val="14"/>
+                <w:szCs w:val="14"/>
+              </w:rPr>
+              <w:t xml:space="preserve">Method (year, venue)</w:t>
+            </w:r>
+          </w:p>
+        </w:tc>
+        <w:tc>
+          <w:tcPr>
+            <w:tcW w:type="dxa" w:w="2500"/>
+            <w:tcBorders>
+              <w:top w:val="single" w:color="999999" w:sz="4"/>
+              <w:left w:val="single" w:color="999999" w:sz="4"/>
+              <w:bottom w:val="single" w:color="999999" w:sz="4"/>
+              <w:right w:val="single" w:color="999999" w:sz="4"/>
+            </w:tcBorders>
+            <w:shd w:fill="E8EDF5" w:color="auto" w:val="clear"/>
+            <w:tcMar>
+              <w:top w:type="dxa" w:w="30"/>
+              <w:left w:type="dxa" w:w="60"/>
+              <w:bottom w:type="dxa" w:w="30"/>
+              <w:right w:type="dxa" w:w="60"/>
+            </w:tcMar>
+          </w:tcPr>
+          <w:p>
+            <w:pPr>
+              <w:jc w:val="center"/>
+            </w:pPr>
+            <w:r>
+              <w:rPr>
+                <w:rFonts w:ascii="Times New Roman" w:cs="Times New Roman" w:eastAsia="Times New Roman" w:hAnsi="Times New Roman"/>
+                <w:b/>
+                <w:bCs/>
+                <w:sz w:val="14"/>
+                <w:szCs w:val="14"/>
+              </w:rPr>
+              <w:t xml:space="preserve">Data used</w:t>
+            </w:r>
+          </w:p>
+        </w:tc>
+        <w:tc>
+          <w:tcPr>
+            <w:tcW w:type="dxa" w:w="3500"/>
+            <w:tcBorders>
+              <w:top w:val="single" w:color="999999" w:sz="4"/>
+              <w:left w:val="single" w:color="999999" w:sz="4"/>
+              <w:bottom w:val="single" w:color="999999" w:sz="4"/>
+              <w:right w:val="single" w:color="999999" w:sz="4"/>
+            </w:tcBorders>
+            <w:shd w:fill="E8EDF5" w:color="auto" w:val="clear"/>
+            <w:tcMar>
+              <w:top w:type="dxa" w:w="30"/>
+              <w:left w:type="dxa" w:w="60"/>
+              <w:bottom w:type="dxa" w:w="30"/>
+              <w:right w:type="dxa" w:w="60"/>
+            </w:tcMar>
+          </w:tcPr>
+          <w:p>
+            <w:pPr>
+              <w:jc w:val="center"/>
+            </w:pPr>
+            <w:r>
+              <w:rPr>
+                <w:rFonts w:ascii="Times New Roman" w:cs="Times New Roman" w:eastAsia="Times New Roman" w:hAnsi="Times New Roman"/>
+                <w:b/>
+                <w:bCs/>
+                <w:sz w:val="14"/>
+                <w:szCs w:val="14"/>
+              </w:rPr>
+              <w:t xml:space="preserve">Main claim as reported</w:t>
+            </w:r>
+          </w:p>
+        </w:tc>
+        <w:tc>
+          <w:tcPr>
+            <w:tcW w:type="dxa" w:w="2400"/>
+            <w:tcBorders>
+              <w:top w:val="single" w:color="999999" w:sz="4"/>
+              <w:left w:val="single" w:color="999999" w:sz="4"/>
+              <w:bottom w:val="single" w:color="999999" w:sz="4"/>
+              <w:right w:val="single" w:color="999999" w:sz="4"/>
+            </w:tcBorders>
+            <w:shd w:fill="E8EDF5" w:color="auto" w:val="clear"/>
+            <w:tcMar>
+              <w:top w:type="dxa" w:w="30"/>
+              <w:left w:type="dxa" w:w="60"/>
+              <w:bottom w:type="dxa" w:w="30"/>
+              <w:right w:type="dxa" w:w="60"/>
+            </w:tcMar>
+          </w:tcPr>
+          <w:p>
+            <w:pPr>
+              <w:jc w:val="center"/>
+            </w:pPr>
+            <w:r>
+              <w:rPr>
+                <w:rFonts w:ascii="Times New Roman" w:cs="Times New Roman" w:eastAsia="Times New Roman" w:hAnsi="Times New Roman"/>
+                <w:b/>
+                <w:bCs/>
+                <w:sz w:val="14"/>
+                <w:szCs w:val="14"/>
+              </w:rPr>
+              <w:t xml:space="preserve">Speed / hardware as reported</w:t>
+            </w:r>
+          </w:p>
+        </w:tc>
+        <w:tc>
+          <w:tcPr>
+            <w:tcW w:type="dxa" w:w="2000"/>
+            <w:tcBorders>
+              <w:top w:val="single" w:color="999999" w:sz="4"/>
+              <w:left w:val="single" w:color="999999" w:sz="4"/>
+              <w:bottom w:val="single" w:color="999999" w:sz="4"/>
+              <w:right w:val="single" w:color="999999" w:sz="4"/>
+            </w:tcBorders>
+            <w:shd w:fill="E8EDF5" w:color="auto" w:val="clear"/>
+            <w:tcMar>
+              <w:top w:type="dxa" w:w="30"/>
+              <w:left w:type="dxa" w:w="60"/>
+              <w:bottom w:type="dxa" w:w="30"/>
+              <w:right w:type="dxa" w:w="60"/>
+            </w:tcMar>
+          </w:tcPr>
+          <w:p>
+            <w:pPr>
+              <w:jc w:val="center"/>
+            </w:pPr>
+            <w:r>
+              <w:rPr>
+                <w:rFonts w:ascii="Times New Roman" w:cs="Times New Roman" w:eastAsia="Times New Roman" w:hAnsi="Times New Roman"/>
+                <w:b/>
+                <w:bCs/>
+                <w:sz w:val="14"/>
+                <w:szCs w:val="14"/>
+              </w:rPr>
+              <w:t xml:space="preserve">Bearing on this work</w:t>
+            </w:r>
+          </w:p>
+        </w:tc>
+      </w:tr>
+      <w:tr>
+        <w:trPr>
+          <w:cantSplit/>
+        </w:trPr>
+        <w:tc>
+          <w:tcPr>
+            <w:tcW w:type="dxa" w:w="620"/>
+            <w:tcBorders>
+              <w:top w:val="single" w:color="999999" w:sz="4"/>
+              <w:left w:val="single" w:color="999999" w:sz="4"/>
+              <w:bottom w:val="single" w:color="999999" w:sz="4"/>
+              <w:right w:val="single" w:color="999999" w:sz="4"/>
+            </w:tcBorders>
+            <w:tcMar>
+              <w:top w:type="dxa" w:w="30"/>
+              <w:left w:type="dxa" w:w="60"/>
+              <w:bottom w:type="dxa" w:w="30"/>
+              <w:right w:type="dxa" w:w="60"/>
+            </w:tcMar>
+          </w:tcPr>
+          <w:p>
+            <w:pPr>
+              <w:jc w:val="left"/>
+            </w:pPr>
+            <w:r>
+              <w:rPr>
+                <w:rFonts w:ascii="Times New Roman" w:cs="Times New Roman" w:eastAsia="Times New Roman" w:hAnsi="Times New Roman"/>
+                <w:b w:val="false"/>
+                <w:bCs w:val="false"/>
+                <w:sz w:val="14"/>
+                <w:szCs w:val="14"/>
+              </w:rPr>
+              <w:t xml:space="preserve">[30]</w:t>
+            </w:r>
+          </w:p>
+        </w:tc>
+        <w:tc>
+          <w:tcPr>
+            <w:tcW w:type="dxa" w:w="3000"/>
+            <w:tcBorders>
+              <w:top w:val="single" w:color="999999" w:sz="4"/>
+              <w:left w:val="single" w:color="999999" w:sz="4"/>
+              <w:bottom w:val="single" w:color="999999" w:sz="4"/>
+              <w:right w:val="single" w:color="999999" w:sz="4"/>
+            </w:tcBorders>
+            <w:tcMar>
+              <w:top w:type="dxa" w:w="30"/>
+              <w:left w:type="dxa" w:w="60"/>
+              <w:bottom w:type="dxa" w:w="30"/>
+              <w:right w:type="dxa" w:w="60"/>
+            </w:tcMar>
+          </w:tcPr>
+          <w:p>
+            <w:pPr>
+              <w:jc w:val="left"/>
+            </w:pPr>
+            <w:r>
+              <w:rPr>
+                <w:rFonts w:ascii="Times New Roman" w:cs="Times New Roman" w:eastAsia="Times New Roman" w:hAnsi="Times New Roman"/>
+                <w:b w:val="false"/>
+                <w:bCs w:val="false"/>
+                <w:sz w:val="14"/>
+                <w:szCs w:val="14"/>
+              </w:rPr>
+              <w:t xml:space="preserve">CFAR-DP-FW: CFAR probability field guides a dual-polarisation detector (2024, JSTARS)</w:t>
+            </w:r>
+          </w:p>
+        </w:tc>
+        <w:tc>
+          <w:tcPr>
+            <w:tcW w:type="dxa" w:w="2500"/>
+            <w:tcBorders>
+              <w:top w:val="single" w:color="999999" w:sz="4"/>
+              <w:left w:val="single" w:color="999999" w:sz="4"/>
+              <w:bottom w:val="single" w:color="999999" w:sz="4"/>
+              <w:right w:val="single" w:color="999999" w:sz="4"/>
+            </w:tcBorders>
+            <w:tcMar>
+              <w:top w:type="dxa" w:w="30"/>
+              <w:left w:type="dxa" w:w="60"/>
+              <w:bottom w:type="dxa" w:w="30"/>
+              <w:right w:type="dxa" w:w="60"/>
+            </w:tcMar>
+          </w:tcPr>
+          <w:p>
+            <w:pPr>
+              <w:jc w:val="center"/>
+            </w:pPr>
+            <w:r>
+              <w:rPr>
+                <w:rFonts w:ascii="Times New Roman" w:cs="Times New Roman" w:eastAsia="Times New Roman" w:hAnsi="Times New Roman"/>
+                <w:b w:val="false"/>
+                <w:bCs w:val="false"/>
+                <w:sz w:val="14"/>
+                <w:szCs w:val="14"/>
+              </w:rPr>
+              <w:t xml:space="preserve">LS-SSDD-v1.0 (dual-pol Sentinel-1)</w:t>
+            </w:r>
+          </w:p>
+        </w:tc>
+        <w:tc>
+          <w:tcPr>
+            <w:tcW w:type="dxa" w:w="3500"/>
+            <w:tcBorders>
+              <w:top w:val="single" w:color="999999" w:sz="4"/>
+              <w:left w:val="single" w:color="999999" w:sz="4"/>
+              <w:bottom w:val="single" w:color="999999" w:sz="4"/>
+              <w:right w:val="single" w:color="999999" w:sz="4"/>
+            </w:tcBorders>
+            <w:tcMar>
+              <w:top w:type="dxa" w:w="30"/>
+              <w:left w:type="dxa" w:w="60"/>
+              <w:bottom w:type="dxa" w:w="30"/>
+              <w:right w:type="dxa" w:w="60"/>
+            </w:tcMar>
+          </w:tcPr>
+          <w:p>
+            <w:pPr>
+              <w:jc w:val="center"/>
+            </w:pPr>
+            <w:r>
+              <w:rPr>
+                <w:rFonts w:ascii="Times New Roman" w:cs="Times New Roman" w:eastAsia="Times New Roman" w:hAnsi="Times New Roman"/>
+                <w:b w:val="false"/>
+                <w:bCs w:val="false"/>
+                <w:sz w:val="14"/>
+                <w:szCs w:val="14"/>
+              </w:rPr>
+              <w:t xml:space="preserve">+3.28 points mAP for inshore ships over the next best of 20 models</w:t>
+            </w:r>
+          </w:p>
+        </w:tc>
+        <w:tc>
+          <w:tcPr>
+            <w:tcW w:type="dxa" w:w="2400"/>
+            <w:tcBorders>
+              <w:top w:val="single" w:color="999999" w:sz="4"/>
+              <w:left w:val="single" w:color="999999" w:sz="4"/>
+              <w:bottom w:val="single" w:color="999999" w:sz="4"/>
+              <w:right w:val="single" w:color="999999" w:sz="4"/>
+            </w:tcBorders>
+            <w:tcMar>
+              <w:top w:type="dxa" w:w="30"/>
+              <w:left w:type="dxa" w:w="60"/>
+              <w:bottom w:type="dxa" w:w="30"/>
+              <w:right w:type="dxa" w:w="60"/>
+            </w:tcMar>
+          </w:tcPr>
+          <w:p>
+            <w:pPr>
+              <w:jc w:val="center"/>
+            </w:pPr>
+            <w:r>
+              <w:rPr>
+                <w:rFonts w:ascii="Times New Roman" w:cs="Times New Roman" w:eastAsia="Times New Roman" w:hAnsi="Times New Roman"/>
+                <w:b w:val="false"/>
+                <w:bCs w:val="false"/>
+                <w:sz w:val="14"/>
+                <w:szCs w:val="14"/>
+              </w:rPr>
+              <w:t xml:space="preserve">two ResNet-50 feature extractors; no speed or hardware figures in the text consulted</w:t>
+            </w:r>
+          </w:p>
+        </w:tc>
+        <w:tc>
+          <w:tcPr>
+            <w:tcW w:type="dxa" w:w="2000"/>
+            <w:tcBorders>
+              <w:top w:val="single" w:color="999999" w:sz="4"/>
+              <w:left w:val="single" w:color="999999" w:sz="4"/>
+              <w:bottom w:val="single" w:color="999999" w:sz="4"/>
+              <w:right w:val="single" w:color="999999" w:sz="4"/>
+            </w:tcBorders>
+            <w:tcMar>
+              <w:top w:type="dxa" w:w="30"/>
+              <w:left w:type="dxa" w:w="60"/>
+              <w:bottom w:type="dxa" w:w="30"/>
+              <w:right w:type="dxa" w:w="60"/>
+            </w:tcMar>
+          </w:tcPr>
+          <w:p>
+            <w:pPr>
+              <w:jc w:val="center"/>
+            </w:pPr>
+            <w:r>
+              <w:rPr>
+                <w:rFonts w:ascii="Times New Roman" w:cs="Times New Roman" w:eastAsia="Times New Roman" w:hAnsi="Times New Roman"/>
+                <w:b w:val="false"/>
+                <w:bCs w:val="false"/>
+                <w:sz w:val="14"/>
+                <w:szCs w:val="14"/>
+              </w:rPr>
+              <w:t xml:space="preserve">closest in concept (CFAR plus a learned stage), but CFAR is a feature input to a heavy detector, not a gate that saves compute</w:t>
+            </w:r>
+          </w:p>
+        </w:tc>
+      </w:tr>
+      <w:tr>
+        <w:trPr>
+          <w:cantSplit/>
+        </w:trPr>
+        <w:tc>
+          <w:tcPr>
+            <w:tcW w:type="dxa" w:w="620"/>
+            <w:tcBorders>
+              <w:top w:val="single" w:color="999999" w:sz="4"/>
+              <w:left w:val="single" w:color="999999" w:sz="4"/>
+              <w:bottom w:val="single" w:color="999999" w:sz="4"/>
+              <w:right w:val="single" w:color="999999" w:sz="4"/>
+            </w:tcBorders>
+            <w:tcMar>
+              <w:top w:type="dxa" w:w="30"/>
+              <w:left w:type="dxa" w:w="60"/>
+              <w:bottom w:type="dxa" w:w="30"/>
+              <w:right w:type="dxa" w:w="60"/>
+            </w:tcMar>
+          </w:tcPr>
+          <w:p>
+            <w:pPr>
+              <w:jc w:val="left"/>
+            </w:pPr>
+            <w:r>
+              <w:rPr>
+                <w:rFonts w:ascii="Times New Roman" w:cs="Times New Roman" w:eastAsia="Times New Roman" w:hAnsi="Times New Roman"/>
+                <w:b w:val="false"/>
+                <w:bCs w:val="false"/>
+                <w:sz w:val="14"/>
+                <w:szCs w:val="14"/>
+              </w:rPr>
+              <w:t xml:space="preserve">[31]</w:t>
+            </w:r>
+          </w:p>
+        </w:tc>
+        <w:tc>
+          <w:tcPr>
+            <w:tcW w:type="dxa" w:w="3000"/>
+            <w:tcBorders>
+              <w:top w:val="single" w:color="999999" w:sz="4"/>
+              <w:left w:val="single" w:color="999999" w:sz="4"/>
+              <w:bottom w:val="single" w:color="999999" w:sz="4"/>
+              <w:right w:val="single" w:color="999999" w:sz="4"/>
+            </w:tcBorders>
+            <w:tcMar>
+              <w:top w:type="dxa" w:w="30"/>
+              <w:left w:type="dxa" w:w="60"/>
+              <w:bottom w:type="dxa" w:w="30"/>
+              <w:right w:type="dxa" w:w="60"/>
+            </w:tcMar>
+          </w:tcPr>
+          <w:p>
+            <w:pPr>
+              <w:jc w:val="left"/>
+            </w:pPr>
+            <w:r>
+              <w:rPr>
+                <w:rFonts w:ascii="Times New Roman" w:cs="Times New Roman" w:eastAsia="Times New Roman" w:hAnsi="Times New Roman"/>
+                <w:b w:val="false"/>
+                <w:bCs w:val="false"/>
+                <w:sz w:val="14"/>
+                <w:szCs w:val="14"/>
+              </w:rPr>
+              <w:t xml:space="preserve">Wilcoxon nonparametric CFAR (2025, JSTARS)</w:t>
+            </w:r>
+          </w:p>
+        </w:tc>
+        <w:tc>
+          <w:tcPr>
+            <w:tcW w:type="dxa" w:w="2500"/>
+            <w:tcBorders>
+              <w:top w:val="single" w:color="999999" w:sz="4"/>
+              <w:left w:val="single" w:color="999999" w:sz="4"/>
+              <w:bottom w:val="single" w:color="999999" w:sz="4"/>
+              <w:right w:val="single" w:color="999999" w:sz="4"/>
+            </w:tcBorders>
+            <w:tcMar>
+              <w:top w:type="dxa" w:w="30"/>
+              <w:left w:type="dxa" w:w="60"/>
+              <w:bottom w:type="dxa" w:w="30"/>
+              <w:right w:type="dxa" w:w="60"/>
+            </w:tcMar>
+          </w:tcPr>
+          <w:p>
+            <w:pPr>
+              <w:jc w:val="center"/>
+            </w:pPr>
+            <w:r>
+              <w:rPr>
+                <w:rFonts w:ascii="Times New Roman" w:cs="Times New Roman" w:eastAsia="Times New Roman" w:hAnsi="Times New Roman"/>
+                <w:b w:val="false"/>
+                <w:bCs w:val="false"/>
+                <w:sz w:val="14"/>
+                <w:szCs w:val="14"/>
+              </w:rPr>
+              <w:t xml:space="preserve">Sentinel-1A, ICEYE-X6, Gaofen-3</w:t>
+            </w:r>
+          </w:p>
+        </w:tc>
+        <w:tc>
+          <w:tcPr>
+            <w:tcW w:type="dxa" w:w="3500"/>
+            <w:tcBorders>
+              <w:top w:val="single" w:color="999999" w:sz="4"/>
+              <w:left w:val="single" w:color="999999" w:sz="4"/>
+              <w:bottom w:val="single" w:color="999999" w:sz="4"/>
+              <w:right w:val="single" w:color="999999" w:sz="4"/>
+            </w:tcBorders>
+            <w:tcMar>
+              <w:top w:type="dxa" w:w="30"/>
+              <w:left w:type="dxa" w:w="60"/>
+              <w:bottom w:type="dxa" w:w="30"/>
+              <w:right w:type="dxa" w:w="60"/>
+            </w:tcMar>
+          </w:tcPr>
+          <w:p>
+            <w:pPr>
+              <w:jc w:val="center"/>
+            </w:pPr>
+            <w:r>
+              <w:rPr>
+                <w:rFonts w:ascii="Times New Roman" w:cs="Times New Roman" w:eastAsia="Times New Roman" w:hAnsi="Times New Roman"/>
+                <w:b w:val="false"/>
+                <w:bCs w:val="false"/>
+                <w:sz w:val="14"/>
+                <w:szCs w:val="14"/>
+              </w:rPr>
+              <w:t xml:space="preserve">closed-form Pfa independent of the clutter distribution; better weak ships in rough sea</w:t>
+            </w:r>
+          </w:p>
+        </w:tc>
+        <w:tc>
+          <w:tcPr>
+            <w:tcW w:type="dxa" w:w="2400"/>
+            <w:tcBorders>
+              <w:top w:val="single" w:color="999999" w:sz="4"/>
+              <w:left w:val="single" w:color="999999" w:sz="4"/>
+              <w:bottom w:val="single" w:color="999999" w:sz="4"/>
+              <w:right w:val="single" w:color="999999" w:sz="4"/>
+            </w:tcBorders>
+            <w:tcMar>
+              <w:top w:type="dxa" w:w="30"/>
+              <w:left w:type="dxa" w:w="60"/>
+              <w:bottom w:type="dxa" w:w="30"/>
+              <w:right w:type="dxa" w:w="60"/>
+            </w:tcMar>
+          </w:tcPr>
+          <w:p>
+            <w:pPr>
+              <w:jc w:val="center"/>
+            </w:pPr>
+            <w:r>
+              <w:rPr>
+                <w:rFonts w:ascii="Times New Roman" w:cs="Times New Roman" w:eastAsia="Times New Roman" w:hAnsi="Times New Roman"/>
+                <w:b w:val="false"/>
+                <w:bCs w:val="false"/>
+                <w:sz w:val="14"/>
+                <w:szCs w:val="14"/>
+              </w:rPr>
+              <w:t xml:space="preserve">about half the execution time of two-parameter CFAR; "m x n + 1 comparators and an accumulator"</w:t>
+            </w:r>
+          </w:p>
+        </w:tc>
+        <w:tc>
+          <w:tcPr>
+            <w:tcW w:type="dxa" w:w="2000"/>
+            <w:tcBorders>
+              <w:top w:val="single" w:color="999999" w:sz="4"/>
+              <w:left w:val="single" w:color="999999" w:sz="4"/>
+              <w:bottom w:val="single" w:color="999999" w:sz="4"/>
+              <w:right w:val="single" w:color="999999" w:sz="4"/>
+            </w:tcBorders>
+            <w:tcMar>
+              <w:top w:type="dxa" w:w="30"/>
+              <w:left w:type="dxa" w:w="60"/>
+              <w:bottom w:type="dxa" w:w="30"/>
+              <w:right w:type="dxa" w:w="60"/>
+            </w:tcMar>
+          </w:tcPr>
+          <w:p>
+            <w:pPr>
+              <w:jc w:val="center"/>
+            </w:pPr>
+            <w:r>
+              <w:rPr>
+                <w:rFonts w:ascii="Times New Roman" w:cs="Times New Roman" w:eastAsia="Times New Roman" w:hAnsi="Times New Roman"/>
+                <w:b w:val="false"/>
+                <w:bCs w:val="false"/>
+                <w:sz w:val="14"/>
+                <w:szCs w:val="14"/>
+              </w:rPr>
+              <w:t xml:space="preserve">challenges the parametric Weibull assumption; not tested on HRSID</w:t>
+            </w:r>
+          </w:p>
+        </w:tc>
+      </w:tr>
+      <w:tr>
+        <w:trPr>
+          <w:cantSplit/>
+        </w:trPr>
+        <w:tc>
+          <w:tcPr>
+            <w:tcW w:type="dxa" w:w="620"/>
+            <w:tcBorders>
+              <w:top w:val="single" w:color="999999" w:sz="4"/>
+              <w:left w:val="single" w:color="999999" w:sz="4"/>
+              <w:bottom w:val="single" w:color="999999" w:sz="4"/>
+              <w:right w:val="single" w:color="999999" w:sz="4"/>
+            </w:tcBorders>
+            <w:tcMar>
+              <w:top w:type="dxa" w:w="30"/>
+              <w:left w:type="dxa" w:w="60"/>
+              <w:bottom w:type="dxa" w:w="30"/>
+              <w:right w:type="dxa" w:w="60"/>
+            </w:tcMar>
+          </w:tcPr>
+          <w:p>
+            <w:pPr>
+              <w:jc w:val="left"/>
+            </w:pPr>
+            <w:r>
+              <w:rPr>
+                <w:rFonts w:ascii="Times New Roman" w:cs="Times New Roman" w:eastAsia="Times New Roman" w:hAnsi="Times New Roman"/>
+                <w:b w:val="false"/>
+                <w:bCs w:val="false"/>
+                <w:sz w:val="14"/>
+                <w:szCs w:val="14"/>
+              </w:rPr>
+              <w:t xml:space="preserve">[32]</w:t>
+            </w:r>
+          </w:p>
+        </w:tc>
+        <w:tc>
+          <w:tcPr>
+            <w:tcW w:type="dxa" w:w="3000"/>
+            <w:tcBorders>
+              <w:top w:val="single" w:color="999999" w:sz="4"/>
+              <w:left w:val="single" w:color="999999" w:sz="4"/>
+              <w:bottom w:val="single" w:color="999999" w:sz="4"/>
+              <w:right w:val="single" w:color="999999" w:sz="4"/>
+            </w:tcBorders>
+            <w:tcMar>
+              <w:top w:type="dxa" w:w="30"/>
+              <w:left w:type="dxa" w:w="60"/>
+              <w:bottom w:type="dxa" w:w="30"/>
+              <w:right w:type="dxa" w:w="60"/>
+            </w:tcMar>
+          </w:tcPr>
+          <w:p>
+            <w:pPr>
+              <w:jc w:val="left"/>
+            </w:pPr>
+            <w:r>
+              <w:rPr>
+                <w:rFonts w:ascii="Times New Roman" w:cs="Times New Roman" w:eastAsia="Times New Roman" w:hAnsi="Times New Roman"/>
+                <w:b w:val="false"/>
+                <w:bCs w:val="false"/>
+                <w:sz w:val="14"/>
+                <w:szCs w:val="14"/>
+              </w:rPr>
+              <w:t xml:space="preserve">Density-clustering CFAR (2024, GRSL)</w:t>
+            </w:r>
+          </w:p>
+        </w:tc>
+        <w:tc>
+          <w:tcPr>
+            <w:tcW w:type="dxa" w:w="2500"/>
+            <w:tcBorders>
+              <w:top w:val="single" w:color="999999" w:sz="4"/>
+              <w:left w:val="single" w:color="999999" w:sz="4"/>
+              <w:bottom w:val="single" w:color="999999" w:sz="4"/>
+              <w:right w:val="single" w:color="999999" w:sz="4"/>
+            </w:tcBorders>
+            <w:tcMar>
+              <w:top w:type="dxa" w:w="30"/>
+              <w:left w:type="dxa" w:w="60"/>
+              <w:bottom w:type="dxa" w:w="30"/>
+              <w:right w:type="dxa" w:w="60"/>
+            </w:tcMar>
+          </w:tcPr>
+          <w:p>
+            <w:pPr>
+              <w:jc w:val="center"/>
+            </w:pPr>
+            <w:r>
+              <w:rPr>
+                <w:rFonts w:ascii="Times New Roman" w:cs="Times New Roman" w:eastAsia="Times New Roman" w:hAnsi="Times New Roman"/>
+                <w:b w:val="false"/>
+                <w:bCs w:val="false"/>
+                <w:sz w:val="14"/>
+                <w:szCs w:val="14"/>
+              </w:rPr>
+              <w:t xml:space="preserve">four images: two GF-3 (256 x 256), a Sentinel-1B and a TerraSAR-X image (800 x 800, taken from HRSID)</w:t>
+            </w:r>
+          </w:p>
+        </w:tc>
+        <w:tc>
+          <w:tcPr>
+            <w:tcW w:type="dxa" w:w="3500"/>
+            <w:tcBorders>
+              <w:top w:val="single" w:color="999999" w:sz="4"/>
+              <w:left w:val="single" w:color="999999" w:sz="4"/>
+              <w:bottom w:val="single" w:color="999999" w:sz="4"/>
+              <w:right w:val="single" w:color="999999" w:sz="4"/>
+            </w:tcBorders>
+            <w:tcMar>
+              <w:top w:type="dxa" w:w="30"/>
+              <w:left w:type="dxa" w:w="60"/>
+              <w:bottom w:type="dxa" w:w="30"/>
+              <w:right w:type="dxa" w:w="60"/>
+            </w:tcMar>
+          </w:tcPr>
+          <w:p>
+            <w:pPr>
+              <w:jc w:val="center"/>
+            </w:pPr>
+            <w:r>
+              <w:rPr>
+                <w:rFonts w:ascii="Times New Roman" w:cs="Times New Roman" w:eastAsia="Times New Roman" w:hAnsi="Times New Roman"/>
+                <w:b w:val="false"/>
+                <w:bCs w:val="false"/>
+                <w:sz w:val="14"/>
+                <w:szCs w:val="14"/>
+              </w:rPr>
+              <w:t xml:space="preserve">+14.8 % detection accuracy over SP-CFAR in heterogeneous and dense scenes, false-alarm rate &lt;= 0.13 %</w:t>
+            </w:r>
+          </w:p>
+        </w:tc>
+        <w:tc>
+          <w:tcPr>
+            <w:tcW w:type="dxa" w:w="2400"/>
+            <w:tcBorders>
+              <w:top w:val="single" w:color="999999" w:sz="4"/>
+              <w:left w:val="single" w:color="999999" w:sz="4"/>
+              <w:bottom w:val="single" w:color="999999" w:sz="4"/>
+              <w:right w:val="single" w:color="999999" w:sz="4"/>
+            </w:tcBorders>
+            <w:tcMar>
+              <w:top w:type="dxa" w:w="30"/>
+              <w:left w:type="dxa" w:w="60"/>
+              <w:bottom w:type="dxa" w:w="30"/>
+              <w:right w:type="dxa" w:w="60"/>
+            </w:tcMar>
+          </w:tcPr>
+          <w:p>
+            <w:pPr>
+              <w:jc w:val="center"/>
+            </w:pPr>
+            <w:r>
+              <w:rPr>
+                <w:rFonts w:ascii="Times New Roman" w:cs="Times New Roman" w:eastAsia="Times New Roman" w:hAnsi="Times New Roman"/>
+                <w:b w:val="false"/>
+                <w:bCs w:val="false"/>
+                <w:sz w:val="14"/>
+                <w:szCs w:val="14"/>
+              </w:rPr>
+              <w:t xml:space="preserve">software only</w:t>
+            </w:r>
+          </w:p>
+        </w:tc>
+        <w:tc>
+          <w:tcPr>
+            <w:tcW w:type="dxa" w:w="2000"/>
+            <w:tcBorders>
+              <w:top w:val="single" w:color="999999" w:sz="4"/>
+              <w:left w:val="single" w:color="999999" w:sz="4"/>
+              <w:bottom w:val="single" w:color="999999" w:sz="4"/>
+              <w:right w:val="single" w:color="999999" w:sz="4"/>
+            </w:tcBorders>
+            <w:tcMar>
+              <w:top w:type="dxa" w:w="30"/>
+              <w:left w:type="dxa" w:w="60"/>
+              <w:bottom w:type="dxa" w:w="30"/>
+              <w:right w:type="dxa" w:w="60"/>
+            </w:tcMar>
+          </w:tcPr>
+          <w:p>
+            <w:pPr>
+              <w:jc w:val="center"/>
+            </w:pPr>
+            <w:r>
+              <w:rPr>
+                <w:rFonts w:ascii="Times New Roman" w:cs="Times New Roman" w:eastAsia="Times New Roman" w:hAnsi="Times New Roman"/>
+                <w:b w:val="false"/>
+                <w:bCs w:val="false"/>
+                <w:sz w:val="14"/>
+                <w:szCs w:val="14"/>
+              </w:rPr>
+              <w:t xml:space="preserve">four-image evaluation; not comparable to a data-set-level result</w:t>
+            </w:r>
+          </w:p>
+        </w:tc>
+      </w:tr>
+      <w:tr>
+        <w:trPr>
+          <w:cantSplit/>
+        </w:trPr>
+        <w:tc>
+          <w:tcPr>
+            <w:tcW w:type="dxa" w:w="620"/>
+            <w:tcBorders>
+              <w:top w:val="single" w:color="999999" w:sz="4"/>
+              <w:left w:val="single" w:color="999999" w:sz="4"/>
+              <w:bottom w:val="single" w:color="999999" w:sz="4"/>
+              <w:right w:val="single" w:color="999999" w:sz="4"/>
+            </w:tcBorders>
+            <w:tcMar>
+              <w:top w:type="dxa" w:w="30"/>
+              <w:left w:type="dxa" w:w="60"/>
+              <w:bottom w:type="dxa" w:w="30"/>
+              <w:right w:type="dxa" w:w="60"/>
+            </w:tcMar>
+          </w:tcPr>
+          <w:p>
+            <w:pPr>
+              <w:jc w:val="left"/>
+            </w:pPr>
+            <w:r>
+              <w:rPr>
+                <w:rFonts w:ascii="Times New Roman" w:cs="Times New Roman" w:eastAsia="Times New Roman" w:hAnsi="Times New Roman"/>
+                <w:b w:val="false"/>
+                <w:bCs w:val="false"/>
+                <w:sz w:val="14"/>
+                <w:szCs w:val="14"/>
+              </w:rPr>
+              <w:t xml:space="preserve">[33]</w:t>
+            </w:r>
+          </w:p>
+        </w:tc>
+        <w:tc>
+          <w:tcPr>
+            <w:tcW w:type="dxa" w:w="3000"/>
+            <w:tcBorders>
+              <w:top w:val="single" w:color="999999" w:sz="4"/>
+              <w:left w:val="single" w:color="999999" w:sz="4"/>
+              <w:bottom w:val="single" w:color="999999" w:sz="4"/>
+              <w:right w:val="single" w:color="999999" w:sz="4"/>
+            </w:tcBorders>
+            <w:tcMar>
+              <w:top w:type="dxa" w:w="30"/>
+              <w:left w:type="dxa" w:w="60"/>
+              <w:bottom w:type="dxa" w:w="30"/>
+              <w:right w:type="dxa" w:w="60"/>
+            </w:tcMar>
+          </w:tcPr>
+          <w:p>
+            <w:pPr>
+              <w:jc w:val="left"/>
+            </w:pPr>
+            <w:r>
+              <w:rPr>
+                <w:rFonts w:ascii="Times New Roman" w:cs="Times New Roman" w:eastAsia="Times New Roman" w:hAnsi="Times New Roman"/>
+                <w:b w:val="false"/>
+                <w:bCs w:val="false"/>
+                <w:sz w:val="14"/>
+                <w:szCs w:val="14"/>
+              </w:rPr>
+              <w:t xml:space="preserve">Fast CFAR with density-censoring operation (2021, SPL)</w:t>
+            </w:r>
+          </w:p>
+        </w:tc>
+        <w:tc>
+          <w:tcPr>
+            <w:tcW w:type="dxa" w:w="2500"/>
+            <w:tcBorders>
+              <w:top w:val="single" w:color="999999" w:sz="4"/>
+              <w:left w:val="single" w:color="999999" w:sz="4"/>
+              <w:bottom w:val="single" w:color="999999" w:sz="4"/>
+              <w:right w:val="single" w:color="999999" w:sz="4"/>
+            </w:tcBorders>
+            <w:tcMar>
+              <w:top w:type="dxa" w:w="30"/>
+              <w:left w:type="dxa" w:w="60"/>
+              <w:bottom w:type="dxa" w:w="30"/>
+              <w:right w:type="dxa" w:w="60"/>
+            </w:tcMar>
+          </w:tcPr>
+          <w:p>
+            <w:pPr>
+              <w:jc w:val="center"/>
+            </w:pPr>
+            <w:r>
+              <w:rPr>
+                <w:rFonts w:ascii="Times New Roman" w:cs="Times New Roman" w:eastAsia="Times New Roman" w:hAnsi="Times New Roman"/>
+                <w:b w:val="false"/>
+                <w:bCs w:val="false"/>
+                <w:sz w:val="14"/>
+                <w:szCs w:val="14"/>
+              </w:rPr>
+              <w:t xml:space="preserve">300 Gaofen-3 images</w:t>
+            </w:r>
+          </w:p>
+        </w:tc>
+        <w:tc>
+          <w:tcPr>
+            <w:tcW w:type="dxa" w:w="3500"/>
+            <w:tcBorders>
+              <w:top w:val="single" w:color="999999" w:sz="4"/>
+              <w:left w:val="single" w:color="999999" w:sz="4"/>
+              <w:bottom w:val="single" w:color="999999" w:sz="4"/>
+              <w:right w:val="single" w:color="999999" w:sz="4"/>
+            </w:tcBorders>
+            <w:tcMar>
+              <w:top w:type="dxa" w:w="30"/>
+              <w:left w:type="dxa" w:w="60"/>
+              <w:bottom w:type="dxa" w:w="30"/>
+              <w:right w:type="dxa" w:w="60"/>
+            </w:tcMar>
+          </w:tcPr>
+          <w:p>
+            <w:pPr>
+              <w:jc w:val="center"/>
+            </w:pPr>
+            <w:r>
+              <w:rPr>
+                <w:rFonts w:ascii="Times New Roman" w:cs="Times New Roman" w:eastAsia="Times New Roman" w:hAnsi="Times New Roman"/>
+                <w:b w:val="false"/>
+                <w:bCs w:val="false"/>
+                <w:sz w:val="14"/>
+                <w:szCs w:val="14"/>
+              </w:rPr>
+              <w:t xml:space="preserve">75-96 % less computation than superpixel CFAR at similar or better detection</w:t>
+            </w:r>
+          </w:p>
+        </w:tc>
+        <w:tc>
+          <w:tcPr>
+            <w:tcW w:type="dxa" w:w="2400"/>
+            <w:tcBorders>
+              <w:top w:val="single" w:color="999999" w:sz="4"/>
+              <w:left w:val="single" w:color="999999" w:sz="4"/>
+              <w:bottom w:val="single" w:color="999999" w:sz="4"/>
+              <w:right w:val="single" w:color="999999" w:sz="4"/>
+            </w:tcBorders>
+            <w:tcMar>
+              <w:top w:type="dxa" w:w="30"/>
+              <w:left w:type="dxa" w:w="60"/>
+              <w:bottom w:type="dxa" w:w="30"/>
+              <w:right w:type="dxa" w:w="60"/>
+            </w:tcMar>
+          </w:tcPr>
+          <w:p>
+            <w:pPr>
+              <w:jc w:val="center"/>
+            </w:pPr>
+            <w:r>
+              <w:rPr>
+                <w:rFonts w:ascii="Times New Roman" w:cs="Times New Roman" w:eastAsia="Times New Roman" w:hAnsi="Times New Roman"/>
+                <w:b w:val="false"/>
+                <w:bCs w:val="false"/>
+                <w:sz w:val="14"/>
+                <w:szCs w:val="14"/>
+              </w:rPr>
+              <w:t xml:space="preserve">running-time table, software</w:t>
+            </w:r>
+          </w:p>
+        </w:tc>
+        <w:tc>
+          <w:tcPr>
+            <w:tcW w:type="dxa" w:w="2000"/>
+            <w:tcBorders>
+              <w:top w:val="single" w:color="999999" w:sz="4"/>
+              <w:left w:val="single" w:color="999999" w:sz="4"/>
+              <w:bottom w:val="single" w:color="999999" w:sz="4"/>
+              <w:right w:val="single" w:color="999999" w:sz="4"/>
+            </w:tcBorders>
+            <w:tcMar>
+              <w:top w:type="dxa" w:w="30"/>
+              <w:left w:type="dxa" w:w="60"/>
+              <w:bottom w:type="dxa" w:w="30"/>
+              <w:right w:type="dxa" w:w="60"/>
+            </w:tcMar>
+          </w:tcPr>
+          <w:p>
+            <w:pPr>
+              <w:jc w:val="center"/>
+            </w:pPr>
+            <w:r>
+              <w:rPr>
+                <w:rFonts w:ascii="Times New Roman" w:cs="Times New Roman" w:eastAsia="Times New Roman" w:hAnsi="Times New Roman"/>
+                <w:b w:val="false"/>
+                <w:bCs w:val="false"/>
+                <w:sz w:val="14"/>
+                <w:szCs w:val="14"/>
+              </w:rPr>
+              <w:t xml:space="preserve">puts the cost of superpixel CFAR in context (ours: fixed 9.01 ms per frame)</w:t>
+            </w:r>
+          </w:p>
+        </w:tc>
+      </w:tr>
+      <w:tr>
+        <w:trPr>
+          <w:cantSplit/>
+        </w:trPr>
+        <w:tc>
+          <w:tcPr>
+            <w:tcW w:type="dxa" w:w="620"/>
+            <w:tcBorders>
+              <w:top w:val="single" w:color="999999" w:sz="4"/>
+              <w:left w:val="single" w:color="999999" w:sz="4"/>
+              <w:bottom w:val="single" w:color="999999" w:sz="4"/>
+              <w:right w:val="single" w:color="999999" w:sz="4"/>
+            </w:tcBorders>
+            <w:tcMar>
+              <w:top w:type="dxa" w:w="30"/>
+              <w:left w:type="dxa" w:w="60"/>
+              <w:bottom w:type="dxa" w:w="30"/>
+              <w:right w:type="dxa" w:w="60"/>
+            </w:tcMar>
+          </w:tcPr>
+          <w:p>
+            <w:pPr>
+              <w:jc w:val="left"/>
+            </w:pPr>
+            <w:r>
+              <w:rPr>
+                <w:rFonts w:ascii="Times New Roman" w:cs="Times New Roman" w:eastAsia="Times New Roman" w:hAnsi="Times New Roman"/>
+                <w:b w:val="false"/>
+                <w:bCs w:val="false"/>
+                <w:sz w:val="14"/>
+                <w:szCs w:val="14"/>
+              </w:rPr>
+              <w:t xml:space="preserve">[34]-[36]</w:t>
+            </w:r>
+          </w:p>
+        </w:tc>
+        <w:tc>
+          <w:tcPr>
+            <w:tcW w:type="dxa" w:w="3000"/>
+            <w:tcBorders>
+              <w:top w:val="single" w:color="999999" w:sz="4"/>
+              <w:left w:val="single" w:color="999999" w:sz="4"/>
+              <w:bottom w:val="single" w:color="999999" w:sz="4"/>
+              <w:right w:val="single" w:color="999999" w:sz="4"/>
+            </w:tcBorders>
+            <w:tcMar>
+              <w:top w:type="dxa" w:w="30"/>
+              <w:left w:type="dxa" w:w="60"/>
+              <w:bottom w:type="dxa" w:w="30"/>
+              <w:right w:type="dxa" w:w="60"/>
+            </w:tcMar>
+          </w:tcPr>
+          <w:p>
+            <w:pPr>
+              <w:jc w:val="left"/>
+            </w:pPr>
+            <w:r>
+              <w:rPr>
+                <w:rFonts w:ascii="Times New Roman" w:cs="Times New Roman" w:eastAsia="Times New Roman" w:hAnsi="Times New Roman"/>
+                <w:b w:val="false"/>
+                <w:bCs w:val="false"/>
+                <w:sz w:val="14"/>
+                <w:szCs w:val="14"/>
+              </w:rPr>
+              <w:t xml:space="preserve">Superpixel CFAR family: compound-Gamma superpixel model [34] (2021), adaptive inshore-dense detector [35] (2022), non-window superpixel CFAR [36] (2022)</w:t>
+            </w:r>
+          </w:p>
+        </w:tc>
+        <w:tc>
+          <w:tcPr>
+            <w:tcW w:type="dxa" w:w="2500"/>
+            <w:tcBorders>
+              <w:top w:val="single" w:color="999999" w:sz="4"/>
+              <w:left w:val="single" w:color="999999" w:sz="4"/>
+              <w:bottom w:val="single" w:color="999999" w:sz="4"/>
+              <w:right w:val="single" w:color="999999" w:sz="4"/>
+            </w:tcBorders>
+            <w:tcMar>
+              <w:top w:type="dxa" w:w="30"/>
+              <w:left w:type="dxa" w:w="60"/>
+              <w:bottom w:type="dxa" w:w="30"/>
+              <w:right w:type="dxa" w:w="60"/>
+            </w:tcMar>
+          </w:tcPr>
+          <w:p>
+            <w:pPr>
+              <w:jc w:val="center"/>
+            </w:pPr>
+            <w:r>
+              <w:rPr>
+                <w:rFonts w:ascii="Times New Roman" w:cs="Times New Roman" w:eastAsia="Times New Roman" w:hAnsi="Times New Roman"/>
+                <w:b w:val="false"/>
+                <w:bCs w:val="false"/>
+                <w:sz w:val="14"/>
+                <w:szCs w:val="14"/>
+              </w:rPr>
+              <w:t xml:space="preserve">MSTAR and SSDD [34]; Radarsat-2, Sentinel-1, AIRSARShip-1 [35]; GF-3, Sentinel-1A [36]</w:t>
+            </w:r>
+          </w:p>
+        </w:tc>
+        <w:tc>
+          <w:tcPr>
+            <w:tcW w:type="dxa" w:w="3500"/>
+            <w:tcBorders>
+              <w:top w:val="single" w:color="999999" w:sz="4"/>
+              <w:left w:val="single" w:color="999999" w:sz="4"/>
+              <w:bottom w:val="single" w:color="999999" w:sz="4"/>
+              <w:right w:val="single" w:color="999999" w:sz="4"/>
+            </w:tcBorders>
+            <w:tcMar>
+              <w:top w:type="dxa" w:w="30"/>
+              <w:left w:type="dxa" w:w="60"/>
+              <w:bottom w:type="dxa" w:w="30"/>
+              <w:right w:type="dxa" w:w="60"/>
+            </w:tcMar>
+          </w:tcPr>
+          <w:p>
+            <w:pPr>
+              <w:jc w:val="center"/>
+            </w:pPr>
+            <w:r>
+              <w:rPr>
+                <w:rFonts w:ascii="Times New Roman" w:cs="Times New Roman" w:eastAsia="Times New Roman" w:hAnsi="Times New Roman"/>
+                <w:b w:val="false"/>
+                <w:bCs w:val="false"/>
+                <w:sz w:val="14"/>
+                <w:szCs w:val="14"/>
+              </w:rPr>
+              <w:t xml:space="preserve">fewer false alarms and complete targets [34]; better inshore dense ships [35]; no sliding window, faster [36]</w:t>
+            </w:r>
+          </w:p>
+        </w:tc>
+        <w:tc>
+          <w:tcPr>
+            <w:tcW w:type="dxa" w:w="2400"/>
+            <w:tcBorders>
+              <w:top w:val="single" w:color="999999" w:sz="4"/>
+              <w:left w:val="single" w:color="999999" w:sz="4"/>
+              <w:bottom w:val="single" w:color="999999" w:sz="4"/>
+              <w:right w:val="single" w:color="999999" w:sz="4"/>
+            </w:tcBorders>
+            <w:tcMar>
+              <w:top w:type="dxa" w:w="30"/>
+              <w:left w:type="dxa" w:w="60"/>
+              <w:bottom w:type="dxa" w:w="30"/>
+              <w:right w:type="dxa" w:w="60"/>
+            </w:tcMar>
+          </w:tcPr>
+          <w:p>
+            <w:pPr>
+              <w:jc w:val="center"/>
+            </w:pPr>
+            <w:r>
+              <w:rPr>
+                <w:rFonts w:ascii="Times New Roman" w:cs="Times New Roman" w:eastAsia="Times New Roman" w:hAnsi="Times New Roman"/>
+                <w:b w:val="false"/>
+                <w:bCs w:val="false"/>
+                <w:sz w:val="14"/>
+                <w:szCs w:val="14"/>
+              </w:rPr>
+              <w:t xml:space="preserve">software; superpixel generation precedes CFAR</w:t>
+            </w:r>
+          </w:p>
+        </w:tc>
+        <w:tc>
+          <w:tcPr>
+            <w:tcW w:type="dxa" w:w="2000"/>
+            <w:tcBorders>
+              <w:top w:val="single" w:color="999999" w:sz="4"/>
+              <w:left w:val="single" w:color="999999" w:sz="4"/>
+              <w:bottom w:val="single" w:color="999999" w:sz="4"/>
+              <w:right w:val="single" w:color="999999" w:sz="4"/>
+            </w:tcBorders>
+            <w:tcMar>
+              <w:top w:type="dxa" w:w="30"/>
+              <w:left w:type="dxa" w:w="60"/>
+              <w:bottom w:type="dxa" w:w="30"/>
+              <w:right w:type="dxa" w:w="60"/>
+            </w:tcMar>
+          </w:tcPr>
+          <w:p>
+            <w:pPr>
+              <w:jc w:val="center"/>
+            </w:pPr>
+            <w:r>
+              <w:rPr>
+                <w:rFonts w:ascii="Times New Roman" w:cs="Times New Roman" w:eastAsia="Times New Roman" w:hAnsi="Times New Roman"/>
+                <w:b w:val="false"/>
+                <w:bCs w:val="false"/>
+                <w:sz w:val="14"/>
+                <w:szCs w:val="14"/>
+              </w:rPr>
+              <w:t xml:space="preserve">address the same self-masking problem as our ring-window prescreen by a different route</w:t>
+            </w:r>
+          </w:p>
+        </w:tc>
+      </w:tr>
+      <w:tr>
+        <w:trPr>
+          <w:cantSplit/>
+        </w:trPr>
+        <w:tc>
+          <w:tcPr>
+            <w:tcW w:type="dxa" w:w="620"/>
+            <w:tcBorders>
+              <w:top w:val="single" w:color="999999" w:sz="4"/>
+              <w:left w:val="single" w:color="999999" w:sz="4"/>
+              <w:bottom w:val="single" w:color="999999" w:sz="4"/>
+              <w:right w:val="single" w:color="999999" w:sz="4"/>
+            </w:tcBorders>
+            <w:tcMar>
+              <w:top w:type="dxa" w:w="30"/>
+              <w:left w:type="dxa" w:w="60"/>
+              <w:bottom w:type="dxa" w:w="30"/>
+              <w:right w:type="dxa" w:w="60"/>
+            </w:tcMar>
+          </w:tcPr>
+          <w:p>
+            <w:pPr>
+              <w:jc w:val="left"/>
+            </w:pPr>
+            <w:r>
+              <w:rPr>
+                <w:rFonts w:ascii="Times New Roman" w:cs="Times New Roman" w:eastAsia="Times New Roman" w:hAnsi="Times New Roman"/>
+                <w:b w:val="false"/>
+                <w:bCs w:val="false"/>
+                <w:sz w:val="14"/>
+                <w:szCs w:val="14"/>
+              </w:rPr>
+              <w:t xml:space="preserve">[37]</w:t>
+            </w:r>
+          </w:p>
+        </w:tc>
+        <w:tc>
+          <w:tcPr>
+            <w:tcW w:type="dxa" w:w="3000"/>
+            <w:tcBorders>
+              <w:top w:val="single" w:color="999999" w:sz="4"/>
+              <w:left w:val="single" w:color="999999" w:sz="4"/>
+              <w:bottom w:val="single" w:color="999999" w:sz="4"/>
+              <w:right w:val="single" w:color="999999" w:sz="4"/>
+            </w:tcBorders>
+            <w:tcMar>
+              <w:top w:type="dxa" w:w="30"/>
+              <w:left w:type="dxa" w:w="60"/>
+              <w:bottom w:type="dxa" w:w="30"/>
+              <w:right w:type="dxa" w:w="60"/>
+            </w:tcMar>
+          </w:tcPr>
+          <w:p>
+            <w:pPr>
+              <w:jc w:val="left"/>
+            </w:pPr>
+            <w:r>
+              <w:rPr>
+                <w:rFonts w:ascii="Times New Roman" w:cs="Times New Roman" w:eastAsia="Times New Roman" w:hAnsi="Times New Roman"/>
+                <w:b w:val="false"/>
+                <w:bCs w:val="false"/>
+                <w:sz w:val="14"/>
+                <w:szCs w:val="14"/>
+              </w:rPr>
+              <w:t xml:space="preserve">Variable-window CFAR using multiscale local contrast (2019, SIVP)</w:t>
+            </w:r>
+          </w:p>
+        </w:tc>
+        <w:tc>
+          <w:tcPr>
+            <w:tcW w:type="dxa" w:w="2500"/>
+            <w:tcBorders>
+              <w:top w:val="single" w:color="999999" w:sz="4"/>
+              <w:left w:val="single" w:color="999999" w:sz="4"/>
+              <w:bottom w:val="single" w:color="999999" w:sz="4"/>
+              <w:right w:val="single" w:color="999999" w:sz="4"/>
+            </w:tcBorders>
+            <w:tcMar>
+              <w:top w:type="dxa" w:w="30"/>
+              <w:left w:type="dxa" w:w="60"/>
+              <w:bottom w:type="dxa" w:w="30"/>
+              <w:right w:type="dxa" w:w="60"/>
+            </w:tcMar>
+          </w:tcPr>
+          <w:p>
+            <w:pPr>
+              <w:jc w:val="center"/>
+            </w:pPr>
+            <w:r>
+              <w:rPr>
+                <w:rFonts w:ascii="Times New Roman" w:cs="Times New Roman" w:eastAsia="Times New Roman" w:hAnsi="Times New Roman"/>
+                <w:b w:val="false"/>
+                <w:bCs w:val="false"/>
+                <w:sz w:val="14"/>
+                <w:szCs w:val="14"/>
+              </w:rPr>
+              <w:t xml:space="preserve">Sentinel-1, GF-3 images</w:t>
+            </w:r>
+          </w:p>
+        </w:tc>
+        <w:tc>
+          <w:tcPr>
+            <w:tcW w:type="dxa" w:w="3500"/>
+            <w:tcBorders>
+              <w:top w:val="single" w:color="999999" w:sz="4"/>
+              <w:left w:val="single" w:color="999999" w:sz="4"/>
+              <w:bottom w:val="single" w:color="999999" w:sz="4"/>
+              <w:right w:val="single" w:color="999999" w:sz="4"/>
+            </w:tcBorders>
+            <w:tcMar>
+              <w:top w:type="dxa" w:w="30"/>
+              <w:left w:type="dxa" w:w="60"/>
+              <w:bottom w:type="dxa" w:w="30"/>
+              <w:right w:type="dxa" w:w="60"/>
+            </w:tcMar>
+          </w:tcPr>
+          <w:p>
+            <w:pPr>
+              <w:jc w:val="center"/>
+            </w:pPr>
+            <w:r>
+              <w:rPr>
+                <w:rFonts w:ascii="Times New Roman" w:cs="Times New Roman" w:eastAsia="Times New Roman" w:hAnsi="Times New Roman"/>
+                <w:b w:val="false"/>
+                <w:bCs w:val="false"/>
+                <w:sz w:val="14"/>
+                <w:szCs w:val="14"/>
+              </w:rPr>
+              <w:t xml:space="preserve">window size follows the ship size</w:t>
+            </w:r>
+          </w:p>
+        </w:tc>
+        <w:tc>
+          <w:tcPr>
+            <w:tcW w:type="dxa" w:w="2400"/>
+            <w:tcBorders>
+              <w:top w:val="single" w:color="999999" w:sz="4"/>
+              <w:left w:val="single" w:color="999999" w:sz="4"/>
+              <w:bottom w:val="single" w:color="999999" w:sz="4"/>
+              <w:right w:val="single" w:color="999999" w:sz="4"/>
+            </w:tcBorders>
+            <w:tcMar>
+              <w:top w:type="dxa" w:w="30"/>
+              <w:left w:type="dxa" w:w="60"/>
+              <w:bottom w:type="dxa" w:w="30"/>
+              <w:right w:type="dxa" w:w="60"/>
+            </w:tcMar>
+          </w:tcPr>
+          <w:p>
+            <w:pPr>
+              <w:jc w:val="center"/>
+            </w:pPr>
+            <w:r>
+              <w:rPr>
+                <w:rFonts w:ascii="Times New Roman" w:cs="Times New Roman" w:eastAsia="Times New Roman" w:hAnsi="Times New Roman"/>
+                <w:b w:val="false"/>
+                <w:bCs w:val="false"/>
+                <w:sz w:val="14"/>
+                <w:szCs w:val="14"/>
+              </w:rPr>
+              <w:t xml:space="preserve">n.r.</w:t>
+            </w:r>
+          </w:p>
+        </w:tc>
+        <w:tc>
+          <w:tcPr>
+            <w:tcW w:type="dxa" w:w="2000"/>
+            <w:tcBorders>
+              <w:top w:val="single" w:color="999999" w:sz="4"/>
+              <w:left w:val="single" w:color="999999" w:sz="4"/>
+              <w:bottom w:val="single" w:color="999999" w:sz="4"/>
+              <w:right w:val="single" w:color="999999" w:sz="4"/>
+            </w:tcBorders>
+            <w:tcMar>
+              <w:top w:type="dxa" w:w="30"/>
+              <w:left w:type="dxa" w:w="60"/>
+              <w:bottom w:type="dxa" w:w="30"/>
+              <w:right w:type="dxa" w:w="60"/>
+            </w:tcMar>
+          </w:tcPr>
+          <w:p>
+            <w:pPr>
+              <w:jc w:val="center"/>
+            </w:pPr>
+            <w:r>
+              <w:rPr>
+                <w:rFonts w:ascii="Times New Roman" w:cs="Times New Roman" w:eastAsia="Times New Roman" w:hAnsi="Times New Roman"/>
+                <w:b w:val="false"/>
+                <w:bCs w:val="false"/>
+                <w:sz w:val="14"/>
+                <w:szCs w:val="14"/>
+              </w:rPr>
+              <w:t xml:space="preserve">an alternative to our fixed 25/17 ring window</w:t>
+            </w:r>
+          </w:p>
+        </w:tc>
+      </w:tr>
+      <w:tr>
+        <w:trPr>
+          <w:cantSplit/>
+        </w:trPr>
+        <w:tc>
+          <w:tcPr>
+            <w:tcW w:type="dxa" w:w="620"/>
+            <w:tcBorders>
+              <w:top w:val="single" w:color="999999" w:sz="4"/>
+              <w:left w:val="single" w:color="999999" w:sz="4"/>
+              <w:bottom w:val="single" w:color="999999" w:sz="4"/>
+              <w:right w:val="single" w:color="999999" w:sz="4"/>
+            </w:tcBorders>
+            <w:tcMar>
+              <w:top w:type="dxa" w:w="30"/>
+              <w:left w:type="dxa" w:w="60"/>
+              <w:bottom w:type="dxa" w:w="30"/>
+              <w:right w:type="dxa" w:w="60"/>
+            </w:tcMar>
+          </w:tcPr>
+          <w:p>
+            <w:pPr>
+              <w:jc w:val="left"/>
+            </w:pPr>
+            <w:r>
+              <w:rPr>
+                <w:rFonts w:ascii="Times New Roman" w:cs="Times New Roman" w:eastAsia="Times New Roman" w:hAnsi="Times New Roman"/>
+                <w:b w:val="false"/>
+                <w:bCs w:val="false"/>
+                <w:sz w:val="14"/>
+                <w:szCs w:val="14"/>
+              </w:rPr>
+              <w:t xml:space="preserve">[38], [39]</w:t>
+            </w:r>
+          </w:p>
+        </w:tc>
+        <w:tc>
+          <w:tcPr>
+            <w:tcW w:type="dxa" w:w="3000"/>
+            <w:tcBorders>
+              <w:top w:val="single" w:color="999999" w:sz="4"/>
+              <w:left w:val="single" w:color="999999" w:sz="4"/>
+              <w:bottom w:val="single" w:color="999999" w:sz="4"/>
+              <w:right w:val="single" w:color="999999" w:sz="4"/>
+            </w:tcBorders>
+            <w:tcMar>
+              <w:top w:type="dxa" w:w="30"/>
+              <w:left w:type="dxa" w:w="60"/>
+              <w:bottom w:type="dxa" w:w="30"/>
+              <w:right w:type="dxa" w:w="60"/>
+            </w:tcMar>
+          </w:tcPr>
+          <w:p>
+            <w:pPr>
+              <w:jc w:val="left"/>
+            </w:pPr>
+            <w:r>
+              <w:rPr>
+                <w:rFonts w:ascii="Times New Roman" w:cs="Times New Roman" w:eastAsia="Times New Roman" w:hAnsi="Times New Roman"/>
+                <w:b w:val="false"/>
+                <w:bCs w:val="false"/>
+                <w:sz w:val="14"/>
+                <w:szCs w:val="14"/>
+              </w:rPr>
+              <w:t xml:space="preserve">Censored harmonic-averaging CFAR [38] and bilateral-trimmed-statistics CFAR, closed form [39] (2021, TAES)</w:t>
+            </w:r>
+          </w:p>
+        </w:tc>
+        <w:tc>
+          <w:tcPr>
+            <w:tcW w:type="dxa" w:w="2500"/>
+            <w:tcBorders>
+              <w:top w:val="single" w:color="999999" w:sz="4"/>
+              <w:left w:val="single" w:color="999999" w:sz="4"/>
+              <w:bottom w:val="single" w:color="999999" w:sz="4"/>
+              <w:right w:val="single" w:color="999999" w:sz="4"/>
+            </w:tcBorders>
+            <w:tcMar>
+              <w:top w:type="dxa" w:w="30"/>
+              <w:left w:type="dxa" w:w="60"/>
+              <w:bottom w:type="dxa" w:w="30"/>
+              <w:right w:type="dxa" w:w="60"/>
+            </w:tcMar>
+          </w:tcPr>
+          <w:p>
+            <w:pPr>
+              <w:jc w:val="center"/>
+            </w:pPr>
+            <w:r>
+              <w:rPr>
+                <w:rFonts w:ascii="Times New Roman" w:cs="Times New Roman" w:eastAsia="Times New Roman" w:hAnsi="Times New Roman"/>
+                <w:b w:val="false"/>
+                <w:bCs w:val="false"/>
+                <w:sz w:val="14"/>
+                <w:szCs w:val="14"/>
+              </w:rPr>
+              <w:t xml:space="preserve">TerraSAR-X [38]; TerraSAR-X, Radarsat-2, Gaofen-3 [39]</w:t>
+            </w:r>
+          </w:p>
+        </w:tc>
+        <w:tc>
+          <w:tcPr>
+            <w:tcW w:type="dxa" w:w="3500"/>
+            <w:tcBorders>
+              <w:top w:val="single" w:color="999999" w:sz="4"/>
+              <w:left w:val="single" w:color="999999" w:sz="4"/>
+              <w:bottom w:val="single" w:color="999999" w:sz="4"/>
+              <w:right w:val="single" w:color="999999" w:sz="4"/>
+            </w:tcBorders>
+            <w:tcMar>
+              <w:top w:type="dxa" w:w="30"/>
+              <w:left w:type="dxa" w:w="60"/>
+              <w:bottom w:type="dxa" w:w="30"/>
+              <w:right w:type="dxa" w:w="60"/>
+            </w:tcMar>
+          </w:tcPr>
+          <w:p>
+            <w:pPr>
+              <w:jc w:val="center"/>
+            </w:pPr>
+            <w:r>
+              <w:rPr>
+                <w:rFonts w:ascii="Times New Roman" w:cs="Times New Roman" w:eastAsia="Times New Roman" w:hAnsi="Times New Roman"/>
+                <w:b w:val="false"/>
+                <w:bCs w:val="false"/>
+                <w:sz w:val="14"/>
+                <w:szCs w:val="14"/>
+              </w:rPr>
+              <w:t xml:space="preserve">robust to interfering targets without knowing their number [38]; closed-form threshold under trimming [39]</w:t>
+            </w:r>
+          </w:p>
+        </w:tc>
+        <w:tc>
+          <w:tcPr>
+            <w:tcW w:type="dxa" w:w="2400"/>
+            <w:tcBorders>
+              <w:top w:val="single" w:color="999999" w:sz="4"/>
+              <w:left w:val="single" w:color="999999" w:sz="4"/>
+              <w:bottom w:val="single" w:color="999999" w:sz="4"/>
+              <w:right w:val="single" w:color="999999" w:sz="4"/>
+            </w:tcBorders>
+            <w:tcMar>
+              <w:top w:type="dxa" w:w="30"/>
+              <w:left w:type="dxa" w:w="60"/>
+              <w:bottom w:type="dxa" w:w="30"/>
+              <w:right w:type="dxa" w:w="60"/>
+            </w:tcMar>
+          </w:tcPr>
+          <w:p>
+            <w:pPr>
+              <w:jc w:val="center"/>
+            </w:pPr>
+            <w:r>
+              <w:rPr>
+                <w:rFonts w:ascii="Times New Roman" w:cs="Times New Roman" w:eastAsia="Times New Roman" w:hAnsi="Times New Roman"/>
+                <w:b w:val="false"/>
+                <w:bCs w:val="false"/>
+                <w:sz w:val="14"/>
+                <w:szCs w:val="14"/>
+              </w:rPr>
+              <w:t xml:space="preserve">[38]: only a few lowest samples censored, no iteration</w:t>
+            </w:r>
+          </w:p>
+        </w:tc>
+        <w:tc>
+          <w:tcPr>
+            <w:tcW w:type="dxa" w:w="2000"/>
+            <w:tcBorders>
+              <w:top w:val="single" w:color="999999" w:sz="4"/>
+              <w:left w:val="single" w:color="999999" w:sz="4"/>
+              <w:bottom w:val="single" w:color="999999" w:sz="4"/>
+              <w:right w:val="single" w:color="999999" w:sz="4"/>
+            </w:tcBorders>
+            <w:tcMar>
+              <w:top w:type="dxa" w:w="30"/>
+              <w:left w:type="dxa" w:w="60"/>
+              <w:bottom w:type="dxa" w:w="30"/>
+              <w:right w:type="dxa" w:w="60"/>
+            </w:tcMar>
+          </w:tcPr>
+          <w:p>
+            <w:pPr>
+              <w:jc w:val="center"/>
+            </w:pPr>
+            <w:r>
+              <w:rPr>
+                <w:rFonts w:ascii="Times New Roman" w:cs="Times New Roman" w:eastAsia="Times New Roman" w:hAnsi="Times New Roman"/>
+                <w:b w:val="false"/>
+                <w:bCs w:val="false"/>
+                <w:sz w:val="14"/>
+                <w:szCs w:val="14"/>
+              </w:rPr>
+              <w:t xml:space="preserve">candidates for the self-masking loss of our prescreen (Pd study); not tested on HRSID</w:t>
+            </w:r>
+          </w:p>
+        </w:tc>
+      </w:tr>
+      <w:tr>
+        <w:trPr>
+          <w:cantSplit/>
+        </w:trPr>
+        <w:tc>
+          <w:tcPr>
+            <w:tcW w:type="dxa" w:w="620"/>
+            <w:tcBorders>
+              <w:top w:val="single" w:color="999999" w:sz="4"/>
+              <w:left w:val="single" w:color="999999" w:sz="4"/>
+              <w:bottom w:val="single" w:color="999999" w:sz="4"/>
+              <w:right w:val="single" w:color="999999" w:sz="4"/>
+            </w:tcBorders>
+            <w:tcMar>
+              <w:top w:type="dxa" w:w="30"/>
+              <w:left w:type="dxa" w:w="60"/>
+              <w:bottom w:type="dxa" w:w="30"/>
+              <w:right w:type="dxa" w:w="60"/>
+            </w:tcMar>
+          </w:tcPr>
+          <w:p>
+            <w:pPr>
+              <w:jc w:val="left"/>
+            </w:pPr>
+            <w:r>
+              <w:rPr>
+                <w:rFonts w:ascii="Times New Roman" w:cs="Times New Roman" w:eastAsia="Times New Roman" w:hAnsi="Times New Roman"/>
+                <w:b w:val="false"/>
+                <w:bCs w:val="false"/>
+                <w:sz w:val="14"/>
+                <w:szCs w:val="14"/>
+              </w:rPr>
+              <w:t xml:space="preserve">[40], [41]</w:t>
+            </w:r>
+          </w:p>
+        </w:tc>
+        <w:tc>
+          <w:tcPr>
+            <w:tcW w:type="dxa" w:w="3000"/>
+            <w:tcBorders>
+              <w:top w:val="single" w:color="999999" w:sz="4"/>
+              <w:left w:val="single" w:color="999999" w:sz="4"/>
+              <w:bottom w:val="single" w:color="999999" w:sz="4"/>
+              <w:right w:val="single" w:color="999999" w:sz="4"/>
+            </w:tcBorders>
+            <w:tcMar>
+              <w:top w:type="dxa" w:w="30"/>
+              <w:left w:type="dxa" w:w="60"/>
+              <w:bottom w:type="dxa" w:w="30"/>
+              <w:right w:type="dxa" w:w="60"/>
+            </w:tcMar>
+          </w:tcPr>
+          <w:p>
+            <w:pPr>
+              <w:jc w:val="left"/>
+            </w:pPr>
+            <w:r>
+              <w:rPr>
+                <w:rFonts w:ascii="Times New Roman" w:cs="Times New Roman" w:eastAsia="Times New Roman" w:hAnsi="Times New Roman"/>
+                <w:b w:val="false"/>
+                <w:bCs w:val="false"/>
+                <w:sz w:val="14"/>
+                <w:szCs w:val="14"/>
+              </w:rPr>
+              <w:t xml:space="preserve">AIS-aided Rayleigh CFAR [40] (TAES); GAO versus GK and K+R clutter models [41] (2022, JSTARS)</w:t>
+            </w:r>
+          </w:p>
+        </w:tc>
+        <w:tc>
+          <w:tcPr>
+            <w:tcW w:type="dxa" w:w="2500"/>
+            <w:tcBorders>
+              <w:top w:val="single" w:color="999999" w:sz="4"/>
+              <w:left w:val="single" w:color="999999" w:sz="4"/>
+              <w:bottom w:val="single" w:color="999999" w:sz="4"/>
+              <w:right w:val="single" w:color="999999" w:sz="4"/>
+            </w:tcBorders>
+            <w:tcMar>
+              <w:top w:type="dxa" w:w="30"/>
+              <w:left w:type="dxa" w:w="60"/>
+              <w:bottom w:type="dxa" w:w="30"/>
+              <w:right w:type="dxa" w:w="60"/>
+            </w:tcMar>
+          </w:tcPr>
+          <w:p>
+            <w:pPr>
+              <w:jc w:val="center"/>
+            </w:pPr>
+            <w:r>
+              <w:rPr>
+                <w:rFonts w:ascii="Times New Roman" w:cs="Times New Roman" w:eastAsia="Times New Roman" w:hAnsi="Times New Roman"/>
+                <w:b w:val="false"/>
+                <w:bCs w:val="false"/>
+                <w:sz w:val="14"/>
+                <w:szCs w:val="14"/>
+              </w:rPr>
+              <w:t xml:space="preserve">Radarsat-2, TerraSAR-X, Gaofen-3 [40]; ALOS-PALSAR [41]</w:t>
+            </w:r>
+          </w:p>
+        </w:tc>
+        <w:tc>
+          <w:tcPr>
+            <w:tcW w:type="dxa" w:w="3500"/>
+            <w:tcBorders>
+              <w:top w:val="single" w:color="999999" w:sz="4"/>
+              <w:left w:val="single" w:color="999999" w:sz="4"/>
+              <w:bottom w:val="single" w:color="999999" w:sz="4"/>
+              <w:right w:val="single" w:color="999999" w:sz="4"/>
+            </w:tcBorders>
+            <w:tcMar>
+              <w:top w:type="dxa" w:w="30"/>
+              <w:left w:type="dxa" w:w="60"/>
+              <w:bottom w:type="dxa" w:w="30"/>
+              <w:right w:type="dxa" w:w="60"/>
+            </w:tcMar>
+          </w:tcPr>
+          <w:p>
+            <w:pPr>
+              <w:jc w:val="center"/>
+            </w:pPr>
+            <w:r>
+              <w:rPr>
+                <w:rFonts w:ascii="Times New Roman" w:cs="Times New Roman" w:eastAsia="Times New Roman" w:hAnsi="Times New Roman"/>
+                <w:b w:val="false"/>
+                <w:bCs w:val="false"/>
+                <w:sz w:val="14"/>
+                <w:szCs w:val="14"/>
+              </w:rPr>
+              <w:t xml:space="preserve">AIS data sets the number of outliers [40]; GAO closed form is faster than K+R at similar accuracy [41]</w:t>
+            </w:r>
+          </w:p>
+        </w:tc>
+        <w:tc>
+          <w:tcPr>
+            <w:tcW w:type="dxa" w:w="2400"/>
+            <w:tcBorders>
+              <w:top w:val="single" w:color="999999" w:sz="4"/>
+              <w:left w:val="single" w:color="999999" w:sz="4"/>
+              <w:bottom w:val="single" w:color="999999" w:sz="4"/>
+              <w:right w:val="single" w:color="999999" w:sz="4"/>
+            </w:tcBorders>
+            <w:tcMar>
+              <w:top w:type="dxa" w:w="30"/>
+              <w:left w:type="dxa" w:w="60"/>
+              <w:bottom w:type="dxa" w:w="30"/>
+              <w:right w:type="dxa" w:w="60"/>
+            </w:tcMar>
+          </w:tcPr>
+          <w:p>
+            <w:pPr>
+              <w:jc w:val="center"/>
+            </w:pPr>
+            <w:r>
+              <w:rPr>
+                <w:rFonts w:ascii="Times New Roman" w:cs="Times New Roman" w:eastAsia="Times New Roman" w:hAnsi="Times New Roman"/>
+                <w:b w:val="false"/>
+                <w:bCs w:val="false"/>
+                <w:sz w:val="14"/>
+                <w:szCs w:val="14"/>
+              </w:rPr>
+              <w:t xml:space="preserve">software</w:t>
+            </w:r>
+          </w:p>
+        </w:tc>
+        <w:tc>
+          <w:tcPr>
+            <w:tcW w:type="dxa" w:w="2000"/>
+            <w:tcBorders>
+              <w:top w:val="single" w:color="999999" w:sz="4"/>
+              <w:left w:val="single" w:color="999999" w:sz="4"/>
+              <w:bottom w:val="single" w:color="999999" w:sz="4"/>
+              <w:right w:val="single" w:color="999999" w:sz="4"/>
+            </w:tcBorders>
+            <w:tcMar>
+              <w:top w:type="dxa" w:w="30"/>
+              <w:left w:type="dxa" w:w="60"/>
+              <w:bottom w:type="dxa" w:w="30"/>
+              <w:right w:type="dxa" w:w="60"/>
+            </w:tcMar>
+          </w:tcPr>
+          <w:p>
+            <w:pPr>
+              <w:jc w:val="center"/>
+            </w:pPr>
+            <w:r>
+              <w:rPr>
+                <w:rFonts w:ascii="Times New Roman" w:cs="Times New Roman" w:eastAsia="Times New Roman" w:hAnsi="Times New Roman"/>
+                <w:b w:val="false"/>
+                <w:bCs w:val="false"/>
+                <w:sz w:val="14"/>
+                <w:szCs w:val="14"/>
+              </w:rPr>
+              <w:t xml:space="preserve">[40] needs an AIS side channel we do not have; [41] supports closed-form detectors</w:t>
+            </w:r>
+          </w:p>
+        </w:tc>
+      </w:tr>
+      <w:tr>
+        <w:trPr>
+          <w:cantSplit/>
+        </w:trPr>
+        <w:tc>
+          <w:tcPr>
+            <w:tcW w:type="dxa" w:w="620"/>
+            <w:tcBorders>
+              <w:top w:val="single" w:color="999999" w:sz="4"/>
+              <w:left w:val="single" w:color="999999" w:sz="4"/>
+              <w:bottom w:val="single" w:color="999999" w:sz="4"/>
+              <w:right w:val="single" w:color="999999" w:sz="4"/>
+            </w:tcBorders>
+            <w:tcMar>
+              <w:top w:type="dxa" w:w="30"/>
+              <w:left w:type="dxa" w:w="60"/>
+              <w:bottom w:type="dxa" w:w="30"/>
+              <w:right w:type="dxa" w:w="60"/>
+            </w:tcMar>
+          </w:tcPr>
+          <w:p>
+            <w:pPr>
+              <w:jc w:val="left"/>
+            </w:pPr>
+            <w:r>
+              <w:rPr>
+                <w:rFonts w:ascii="Times New Roman" w:cs="Times New Roman" w:eastAsia="Times New Roman" w:hAnsi="Times New Roman"/>
+                <w:b w:val="false"/>
+                <w:bCs w:val="false"/>
+                <w:sz w:val="14"/>
+                <w:szCs w:val="14"/>
+              </w:rPr>
+              <w:t xml:space="preserve">[26]</w:t>
+            </w:r>
+          </w:p>
+        </w:tc>
+        <w:tc>
+          <w:tcPr>
+            <w:tcW w:type="dxa" w:w="3000"/>
+            <w:tcBorders>
+              <w:top w:val="single" w:color="999999" w:sz="4"/>
+              <w:left w:val="single" w:color="999999" w:sz="4"/>
+              <w:bottom w:val="single" w:color="999999" w:sz="4"/>
+              <w:right w:val="single" w:color="999999" w:sz="4"/>
+            </w:tcBorders>
+            <w:tcMar>
+              <w:top w:type="dxa" w:w="30"/>
+              <w:left w:type="dxa" w:w="60"/>
+              <w:bottom w:type="dxa" w:w="30"/>
+              <w:right w:type="dxa" w:w="60"/>
+            </w:tcMar>
+          </w:tcPr>
+          <w:p>
+            <w:pPr>
+              <w:jc w:val="left"/>
+            </w:pPr>
+            <w:r>
+              <w:rPr>
+                <w:rFonts w:ascii="Times New Roman" w:cs="Times New Roman" w:eastAsia="Times New Roman" w:hAnsi="Times New Roman"/>
+                <w:b w:val="false"/>
+                <w:bCs w:val="false"/>
+                <w:sz w:val="14"/>
+                <w:szCs w:val="14"/>
+              </w:rPr>
+              <w:t xml:space="preserve">ELSD-Net, YOLOv5n-based (2025, GRSL)</w:t>
+            </w:r>
+          </w:p>
+        </w:tc>
+        <w:tc>
+          <w:tcPr>
+            <w:tcW w:type="dxa" w:w="2500"/>
+            <w:tcBorders>
+              <w:top w:val="single" w:color="999999" w:sz="4"/>
+              <w:left w:val="single" w:color="999999" w:sz="4"/>
+              <w:bottom w:val="single" w:color="999999" w:sz="4"/>
+              <w:right w:val="single" w:color="999999" w:sz="4"/>
+            </w:tcBorders>
+            <w:tcMar>
+              <w:top w:type="dxa" w:w="30"/>
+              <w:left w:type="dxa" w:w="60"/>
+              <w:bottom w:type="dxa" w:w="30"/>
+              <w:right w:type="dxa" w:w="60"/>
+            </w:tcMar>
+          </w:tcPr>
+          <w:p>
+            <w:pPr>
+              <w:jc w:val="center"/>
+            </w:pPr>
+            <w:r>
+              <w:rPr>
+                <w:rFonts w:ascii="Times New Roman" w:cs="Times New Roman" w:eastAsia="Times New Roman" w:hAnsi="Times New Roman"/>
+                <w:b w:val="false"/>
+                <w:bCs w:val="false"/>
+                <w:sz w:val="14"/>
+                <w:szCs w:val="14"/>
+              </w:rPr>
+              <w:t xml:space="preserve">SSDD</w:t>
+            </w:r>
+          </w:p>
+        </w:tc>
+        <w:tc>
+          <w:tcPr>
+            <w:tcW w:type="dxa" w:w="3500"/>
+            <w:tcBorders>
+              <w:top w:val="single" w:color="999999" w:sz="4"/>
+              <w:left w:val="single" w:color="999999" w:sz="4"/>
+              <w:bottom w:val="single" w:color="999999" w:sz="4"/>
+              <w:right w:val="single" w:color="999999" w:sz="4"/>
+            </w:tcBorders>
+            <w:tcMar>
+              <w:top w:type="dxa" w:w="30"/>
+              <w:left w:type="dxa" w:w="60"/>
+              <w:bottom w:type="dxa" w:w="30"/>
+              <w:right w:type="dxa" w:w="60"/>
+            </w:tcMar>
+          </w:tcPr>
+          <w:p>
+            <w:pPr>
+              <w:jc w:val="center"/>
+            </w:pPr>
+            <w:r>
+              <w:rPr>
+                <w:rFonts w:ascii="Times New Roman" w:cs="Times New Roman" w:eastAsia="Times New Roman" w:hAnsi="Times New Roman"/>
+                <w:b w:val="false"/>
+                <w:bCs w:val="false"/>
+                <w:sz w:val="14"/>
+                <w:szCs w:val="14"/>
+              </w:rPr>
+              <w:t xml:space="preserve">AP50 98.2 % with 0.3 M parameters and 1.2 GFLOPs (SSDD)</w:t>
+            </w:r>
+          </w:p>
+        </w:tc>
+        <w:tc>
+          <w:tcPr>
+            <w:tcW w:type="dxa" w:w="2400"/>
+            <w:tcBorders>
+              <w:top w:val="single" w:color="999999" w:sz="4"/>
+              <w:left w:val="single" w:color="999999" w:sz="4"/>
+              <w:bottom w:val="single" w:color="999999" w:sz="4"/>
+              <w:right w:val="single" w:color="999999" w:sz="4"/>
+            </w:tcBorders>
+            <w:tcMar>
+              <w:top w:type="dxa" w:w="30"/>
+              <w:left w:type="dxa" w:w="60"/>
+              <w:bottom w:type="dxa" w:w="30"/>
+              <w:right w:type="dxa" w:w="60"/>
+            </w:tcMar>
+          </w:tcPr>
+          <w:p>
+            <w:pPr>
+              <w:jc w:val="center"/>
+            </w:pPr>
+            <w:r>
+              <w:rPr>
+                <w:rFonts w:ascii="Times New Roman" w:cs="Times New Roman" w:eastAsia="Times New Roman" w:hAnsi="Times New Roman"/>
+                <w:b w:val="false"/>
+                <w:bCs w:val="false"/>
+                <w:sz w:val="14"/>
+                <w:szCs w:val="14"/>
+              </w:rPr>
+              <w:t xml:space="preserve">640 px, RTX 2050 named in the text</w:t>
+            </w:r>
+          </w:p>
+        </w:tc>
+        <w:tc>
+          <w:tcPr>
+            <w:tcW w:type="dxa" w:w="2000"/>
+            <w:tcBorders>
+              <w:top w:val="single" w:color="999999" w:sz="4"/>
+              <w:left w:val="single" w:color="999999" w:sz="4"/>
+              <w:bottom w:val="single" w:color="999999" w:sz="4"/>
+              <w:right w:val="single" w:color="999999" w:sz="4"/>
+            </w:tcBorders>
+            <w:tcMar>
+              <w:top w:type="dxa" w:w="30"/>
+              <w:left w:type="dxa" w:w="60"/>
+              <w:bottom w:type="dxa" w:w="30"/>
+              <w:right w:type="dxa" w:w="60"/>
+            </w:tcMar>
+          </w:tcPr>
+          <w:p>
+            <w:pPr>
+              <w:jc w:val="center"/>
+            </w:pPr>
+            <w:r>
+              <w:rPr>
+                <w:rFonts w:ascii="Times New Roman" w:cs="Times New Roman" w:eastAsia="Times New Roman" w:hAnsi="Times New Roman"/>
+                <w:b w:val="false"/>
+                <w:bCs w:val="false"/>
+                <w:sz w:val="14"/>
+                <w:szCs w:val="14"/>
+              </w:rPr>
+              <w:t xml:space="preserve">smallest detector found; HRSID not reported</w:t>
+            </w:r>
+          </w:p>
+        </w:tc>
+      </w:tr>
+      <w:tr>
+        <w:trPr>
+          <w:cantSplit/>
+        </w:trPr>
+        <w:tc>
+          <w:tcPr>
+            <w:tcW w:type="dxa" w:w="620"/>
+            <w:tcBorders>
+              <w:top w:val="single" w:color="999999" w:sz="4"/>
+              <w:left w:val="single" w:color="999999" w:sz="4"/>
+              <w:bottom w:val="single" w:color="999999" w:sz="4"/>
+              <w:right w:val="single" w:color="999999" w:sz="4"/>
+            </w:tcBorders>
+            <w:tcMar>
+              <w:top w:type="dxa" w:w="30"/>
+              <w:left w:type="dxa" w:w="60"/>
+              <w:bottom w:type="dxa" w:w="30"/>
+              <w:right w:type="dxa" w:w="60"/>
+            </w:tcMar>
+          </w:tcPr>
+          <w:p>
+            <w:pPr>
+              <w:jc w:val="left"/>
+            </w:pPr>
+            <w:r>
+              <w:rPr>
+                <w:rFonts w:ascii="Times New Roman" w:cs="Times New Roman" w:eastAsia="Times New Roman" w:hAnsi="Times New Roman"/>
+                <w:b w:val="false"/>
+                <w:bCs w:val="false"/>
+                <w:sz w:val="14"/>
+                <w:szCs w:val="14"/>
+              </w:rPr>
+              <w:t xml:space="preserve">[27]-[29]</w:t>
+            </w:r>
+          </w:p>
+        </w:tc>
+        <w:tc>
+          <w:tcPr>
+            <w:tcW w:type="dxa" w:w="3000"/>
+            <w:tcBorders>
+              <w:top w:val="single" w:color="999999" w:sz="4"/>
+              <w:left w:val="single" w:color="999999" w:sz="4"/>
+              <w:bottom w:val="single" w:color="999999" w:sz="4"/>
+              <w:right w:val="single" w:color="999999" w:sz="4"/>
+            </w:tcBorders>
+            <w:tcMar>
+              <w:top w:type="dxa" w:w="30"/>
+              <w:left w:type="dxa" w:w="60"/>
+              <w:bottom w:type="dxa" w:w="30"/>
+              <w:right w:type="dxa" w:w="60"/>
+            </w:tcMar>
+          </w:tcPr>
+          <w:p>
+            <w:pPr>
+              <w:jc w:val="left"/>
+            </w:pPr>
+            <w:r>
+              <w:rPr>
+                <w:rFonts w:ascii="Times New Roman" w:cs="Times New Roman" w:eastAsia="Times New Roman" w:hAnsi="Times New Roman"/>
+                <w:b w:val="false"/>
+                <w:bCs w:val="false"/>
+                <w:sz w:val="14"/>
+                <w:szCs w:val="14"/>
+              </w:rPr>
+              <w:t xml:space="preserve">SLit-YOLOv5 [27] (2023, GRSL); CPC-YOLO [28] and adaptive feature enhancement with mixture of experts [29] (2026, SPL)</w:t>
+            </w:r>
+          </w:p>
+        </w:tc>
+        <w:tc>
+          <w:tcPr>
+            <w:tcW w:type="dxa" w:w="2500"/>
+            <w:tcBorders>
+              <w:top w:val="single" w:color="999999" w:sz="4"/>
+              <w:left w:val="single" w:color="999999" w:sz="4"/>
+              <w:bottom w:val="single" w:color="999999" w:sz="4"/>
+              <w:right w:val="single" w:color="999999" w:sz="4"/>
+            </w:tcBorders>
+            <w:tcMar>
+              <w:top w:type="dxa" w:w="30"/>
+              <w:left w:type="dxa" w:w="60"/>
+              <w:bottom w:type="dxa" w:w="30"/>
+              <w:right w:type="dxa" w:w="60"/>
+            </w:tcMar>
+          </w:tcPr>
+          <w:p>
+            <w:pPr>
+              <w:jc w:val="center"/>
+            </w:pPr>
+            <w:r>
+              <w:rPr>
+                <w:rFonts w:ascii="Times New Roman" w:cs="Times New Roman" w:eastAsia="Times New Roman" w:hAnsi="Times New Roman"/>
+                <w:b w:val="false"/>
+                <w:bCs w:val="false"/>
+                <w:sz w:val="14"/>
+                <w:szCs w:val="14"/>
+              </w:rPr>
+              <w:t xml:space="preserve">SSDD [27]; LS-SSDD-v1.0 and SAR-Ship-Dataset [28]; SSDD and SAR-Ship-Dataset [29]</w:t>
+            </w:r>
+          </w:p>
+        </w:tc>
+        <w:tc>
+          <w:tcPr>
+            <w:tcW w:type="dxa" w:w="3500"/>
+            <w:tcBorders>
+              <w:top w:val="single" w:color="999999" w:sz="4"/>
+              <w:left w:val="single" w:color="999999" w:sz="4"/>
+              <w:bottom w:val="single" w:color="999999" w:sz="4"/>
+              <w:right w:val="single" w:color="999999" w:sz="4"/>
+            </w:tcBorders>
+            <w:tcMar>
+              <w:top w:type="dxa" w:w="30"/>
+              <w:left w:type="dxa" w:w="60"/>
+              <w:bottom w:type="dxa" w:w="30"/>
+              <w:right w:type="dxa" w:w="60"/>
+            </w:tcMar>
+          </w:tcPr>
+          <w:p>
+            <w:pPr>
+              <w:jc w:val="center"/>
+            </w:pPr>
+            <w:r>
+              <w:rPr>
+                <w:rFonts w:ascii="Times New Roman" w:cs="Times New Roman" w:eastAsia="Times New Roman" w:hAnsi="Times New Roman"/>
+                <w:b w:val="false"/>
+                <w:bCs w:val="false"/>
+                <w:sz w:val="14"/>
+                <w:szCs w:val="14"/>
+              </w:rPr>
+              <w:t xml:space="preserve">lighter backbone [27]; +2.15 / +1.64 AP over the baseline [28]; target-driven data synthesis plus expert routing [29]</w:t>
+            </w:r>
+          </w:p>
+        </w:tc>
+        <w:tc>
+          <w:tcPr>
+            <w:tcW w:type="dxa" w:w="2400"/>
+            <w:tcBorders>
+              <w:top w:val="single" w:color="999999" w:sz="4"/>
+              <w:left w:val="single" w:color="999999" w:sz="4"/>
+              <w:bottom w:val="single" w:color="999999" w:sz="4"/>
+              <w:right w:val="single" w:color="999999" w:sz="4"/>
+            </w:tcBorders>
+            <w:tcMar>
+              <w:top w:type="dxa" w:w="30"/>
+              <w:left w:type="dxa" w:w="60"/>
+              <w:bottom w:type="dxa" w:w="30"/>
+              <w:right w:type="dxa" w:w="60"/>
+            </w:tcMar>
+          </w:tcPr>
+          <w:p>
+            <w:pPr>
+              <w:jc w:val="center"/>
+            </w:pPr>
+            <w:r>
+              <w:rPr>
+                <w:rFonts w:ascii="Times New Roman" w:cs="Times New Roman" w:eastAsia="Times New Roman" w:hAnsi="Times New Roman"/>
+                <w:b w:val="false"/>
+                <w:bCs w:val="false"/>
+                <w:sz w:val="14"/>
+                <w:szCs w:val="14"/>
+              </w:rPr>
+              <w:t xml:space="preserve">GPU inference times only</w:t>
+            </w:r>
+          </w:p>
+        </w:tc>
+        <w:tc>
+          <w:tcPr>
+            <w:tcW w:type="dxa" w:w="2000"/>
+            <w:tcBorders>
+              <w:top w:val="single" w:color="999999" w:sz="4"/>
+              <w:left w:val="single" w:color="999999" w:sz="4"/>
+              <w:bottom w:val="single" w:color="999999" w:sz="4"/>
+              <w:right w:val="single" w:color="999999" w:sz="4"/>
+            </w:tcBorders>
+            <w:tcMar>
+              <w:top w:type="dxa" w:w="30"/>
+              <w:left w:type="dxa" w:w="60"/>
+              <w:bottom w:type="dxa" w:w="30"/>
+              <w:right w:type="dxa" w:w="60"/>
+            </w:tcMar>
+          </w:tcPr>
+          <w:p>
+            <w:pPr>
+              <w:jc w:val="center"/>
+            </w:pPr>
+            <w:r>
+              <w:rPr>
+                <w:rFonts w:ascii="Times New Roman" w:cs="Times New Roman" w:eastAsia="Times New Roman" w:hAnsi="Times New Roman"/>
+                <w:b w:val="false"/>
+                <w:bCs w:val="false"/>
+                <w:sz w:val="14"/>
+                <w:szCs w:val="14"/>
+              </w:rPr>
+              <w:t xml:space="preserve">no HRSID, no hardware</w:t>
+            </w:r>
+          </w:p>
+        </w:tc>
+      </w:tr>
+    </w:tbl>
+    <w:p>
+      <w:pPr>
+        <w:pStyle w:val="Heading1"/>
+        <w:spacing w:after="110" w:before="260"/>
+      </w:pPr>
+      <w:r>
+        <w:rPr>
+          <w:rFonts w:ascii="Times New Roman" w:cs="Times New Roman" w:eastAsia="Times New Roman" w:hAnsi="Times New Roman"/>
+          <w:b/>
+          <w:bCs/>
+          <w:sz w:val="26"/>
+          <w:szCs w:val="26"/>
+        </w:rPr>
+        <w:t xml:space="preserve">4b. Which of these papers challenge the proposed system</w:t>
+      </w:r>
+    </w:p>
+    <w:p>
+      <w:pPr>
+        <w:spacing w:after="110" w:line="270"/>
+        <w:jc w:val="both"/>
+      </w:pPr>
+      <w:r>
+        <w:rPr>
+          <w:rFonts w:ascii="Times New Roman" w:cs="Times New Roman" w:eastAsia="Times New Roman" w:hAnsi="Times New Roman"/>
+          <w:sz w:val="21"/>
+          <w:szCs w:val="21"/>
+        </w:rPr>
+        <w:t xml:space="preserve">Assessed against the claims this work can support (low-cost integer prescreen, small INT8 CNN, bit-exact FPGA implementation, recall of 96-97 % at 2-3 false events per image), the new papers give the following challenges, in order of weight.</w:t>
+      </w:r>
+    </w:p>
+    <w:p>
+      <w:pPr>
+        <w:pStyle w:val="ListParagraph"/>
+        <w:numPr>
+          <w:ilvl w:val="0"/>
+          <w:numId w:val="2"/>
+        </w:numPr>
+        <w:spacing w:after="50" w:line="260"/>
+        <w:jc w:val="both"/>
+      </w:pPr>
+      <w:r>
+        <w:rPr>
+          <w:rFonts w:ascii="Times New Roman" w:cs="Times New Roman" w:eastAsia="Times New Roman" w:hAnsi="Times New Roman"/>
+          <w:b/>
+          <w:bCs/>
+          <w:sz w:val="21"/>
+          <w:szCs w:val="21"/>
+        </w:rPr>
+        <w:t xml:space="preserve">1. Small detectors reach high HRSID accuracy at a few million parameters ([22], [23], [24]). </w:t>
+      </w:r>
+      <w:r>
+        <w:rPr>
+          <w:rFonts w:ascii="Times New Roman" w:cs="Times New Roman" w:eastAsia="Times New Roman" w:hAnsi="Times New Roman"/>
+          <w:sz w:val="21"/>
+          <w:szCs w:val="21"/>
+        </w:rPr>
+        <w:t xml:space="preserve">A 1.6-2.8 M-parameter YOLO derivative reports 91.8-95.8 % AP50 on HRSID at 7 GFLOPs per frame and 370-530 FPS on desktop GPUs. The cascade needs 21-37 times fewer parameters (74,609) and about 0.84 GFLOP per frame on average (0.42 GMAC, data-dependent; median image 0.30 GFLOP), but the comparison is not like-for-like: they output boxes and are scored at IoU 0.5, and none of them reports an embedded implementation, so their deployability on a DE10-class FPGA is unknown. The honest conclusion is that the cost advantage is real and the accuracy claim must stay at the recall / false-event level, as in Section 3.</w:t>
+      </w:r>
+    </w:p>
+    <w:p>
+      <w:pPr>
+        <w:pStyle w:val="ListParagraph"/>
+        <w:numPr>
+          <w:ilvl w:val="0"/>
+          <w:numId w:val="2"/>
+        </w:numPr>
+        <w:spacing w:after="50" w:line="260"/>
+        <w:jc w:val="both"/>
+      </w:pPr>
+      <w:r>
+        <w:rPr>
+          <w:rFonts w:ascii="Times New Roman" w:cs="Times New Roman" w:eastAsia="Times New Roman" w:hAnsi="Times New Roman"/>
+          <w:b/>
+          <w:bCs/>
+          <w:sz w:val="21"/>
+          <w:szCs w:val="21"/>
+        </w:rPr>
+        <w:t xml:space="preserve">2. At matched recall the precision is equal to AD-YOLO but lower than GL-DETR. </w:t>
+      </w:r>
+      <w:r>
+        <w:rPr>
+          <w:rFonts w:ascii="Times New Roman" w:cs="Times New Roman" w:eastAsia="Times New Roman" w:hAnsi="Times New Roman"/>
+          <w:sz w:val="21"/>
+          <w:szCs w:val="21"/>
+        </w:rPr>
+        <w:t xml:space="preserve">At 83.8 % recall AD-YOLO [22] has precision 91.7 % against our 93.8 % (all images) or 91.3 % (test); at 87.6 % recall GL-DETR [7] has precision 91.5 % (F1 0.895) against our 88.7 % (F1 0.882) on all images and 85.4 % (F1 0.866) on the test split, a gap of 3-6 points of precision that is not closed by the INT8 network. Against the YOLOv4-based [25], which was run at a confidence threshold of 0.05, our precision at 91 % recall is 79-82 % against 54 %.</w:t>
+      </w:r>
+    </w:p>
+    <w:p>
+      <w:pPr>
+        <w:pStyle w:val="ListParagraph"/>
+        <w:numPr>
+          <w:ilvl w:val="0"/>
+          <w:numId w:val="2"/>
+        </w:numPr>
+        <w:spacing w:after="50" w:line="260"/>
+        <w:jc w:val="both"/>
+      </w:pPr>
+      <w:r>
+        <w:rPr>
+          <w:rFonts w:ascii="Times New Roman" w:cs="Times New Roman" w:eastAsia="Times New Roman" w:hAnsi="Times New Roman"/>
+          <w:b/>
+          <w:bCs/>
+          <w:sz w:val="21"/>
+          <w:szCs w:val="21"/>
+        </w:rPr>
+        <w:t xml:space="preserve">3. A distribution-free CFAR is a direct alternative to the Weibull prescreen ([31]). </w:t>
+      </w:r>
+      <w:r>
+        <w:rPr>
+          <w:rFonts w:ascii="Times New Roman" w:cs="Times New Roman" w:eastAsia="Times New Roman" w:hAnsi="Times New Roman"/>
+          <w:sz w:val="21"/>
+          <w:szCs w:val="21"/>
+        </w:rPr>
+        <w:t xml:space="preserve">The Wilcoxon scheme controls the false-alarm rate without assuming a clutter model and is described as "simple" in hardware (m x n + 1 comparators and an accumulator). It has not been tested on HRSID, so the claim that the Weibull test is the right front end is untested against it. With our ring window of 336 reference pixels, even a single-pixel test region needs at least n + 1 = 337 comparators, against three multipliers and no comparators in the present integer prescreen, but this is our estimate, not a measurement. Running a Wilcoxon prescreen through the same event, CNN and board pipeline is the experiment that would settle it.</w:t>
+      </w:r>
+    </w:p>
+    <w:p>
+      <w:pPr>
+        <w:pStyle w:val="ListParagraph"/>
+        <w:numPr>
+          <w:ilvl w:val="0"/>
+          <w:numId w:val="2"/>
+        </w:numPr>
+        <w:spacing w:after="50" w:line="260"/>
+        <w:jc w:val="both"/>
+      </w:pPr>
+      <w:r>
+        <w:rPr>
+          <w:rFonts w:ascii="Times New Roman" w:cs="Times New Roman" w:eastAsia="Times New Roman" w:hAnsi="Times New Roman"/>
+          <w:b/>
+          <w:bCs/>
+          <w:sz w:val="21"/>
+          <w:szCs w:val="21"/>
+        </w:rPr>
+        <w:t xml:space="preserve">4. Robust CFAR variants target the loss mechanism of our prescreen ([33]-[39]). </w:t>
+      </w:r>
+      <w:r>
+        <w:rPr>
+          <w:rFonts w:ascii="Times New Roman" w:cs="Times New Roman" w:eastAsia="Times New Roman" w:hAnsi="Times New Roman"/>
+          <w:sz w:val="21"/>
+          <w:szCs w:val="21"/>
+        </w:rPr>
+        <w:t xml:space="preserve">Censored, trimmed and superpixel CFAR address interfering targets and inshore density, the cause of 9.4 of the 15.7 points of ship loss found in the Pd study. The pooled integer prescreen already delivers 99.6 % of the ships (inshore 99.2 %), so the prescreen is no longer the limit; the loss of about 3 points of recall at the 97 % target is incurred in the CNN stage. These papers are therefore a low threat to the recall claim, and a possible way to cut the 166 off-ship events per image before the CNN.</w:t>
+      </w:r>
+    </w:p>
+    <w:p>
+      <w:pPr>
+        <w:pStyle w:val="ListParagraph"/>
+        <w:numPr>
+          <w:ilvl w:val="0"/>
+          <w:numId w:val="2"/>
+        </w:numPr>
+        <w:spacing w:after="50" w:line="260"/>
+        <w:jc w:val="both"/>
+      </w:pPr>
+      <w:r>
+        <w:rPr>
+          <w:rFonts w:ascii="Times New Roman" w:cs="Times New Roman" w:eastAsia="Times New Roman" w:hAnsi="Times New Roman"/>
+          <w:b/>
+          <w:bCs/>
+          <w:sz w:val="21"/>
+          <w:szCs w:val="21"/>
+        </w:rPr>
+        <w:t xml:space="preserve">5. CFAR-guided deep learning exists ([30]). </w:t>
+      </w:r>
+      <w:r>
+        <w:rPr>
+          <w:rFonts w:ascii="Times New Roman" w:cs="Times New Roman" w:eastAsia="Times New Roman" w:hAnsi="Times New Roman"/>
+          <w:sz w:val="21"/>
+          <w:szCs w:val="21"/>
+        </w:rPr>
+        <w:t xml:space="preserve">CFAR-DP-FW shows that combining a CFAR field with a learned detector improves inshore detection on LS-SSDD-v1.0. It does not weaken the cascade argument, since the CFAR output is an input feature to two ResNet-50 extractors rather than a gate that removes work, but it means that the combination itself is not novel; the contribution is the integer, bit-exact, board-verified implementation with measured cost.</w:t>
+      </w:r>
+    </w:p>
+    <w:p>
+      <w:pPr>
+        <w:pStyle w:val="ListParagraph"/>
+        <w:numPr>
+          <w:ilvl w:val="0"/>
+          <w:numId w:val="2"/>
+        </w:numPr>
+        <w:spacing w:after="50" w:line="260"/>
+        <w:jc w:val="both"/>
+      </w:pPr>
+      <w:r>
+        <w:rPr>
+          <w:rFonts w:ascii="Times New Roman" w:cs="Times New Roman" w:eastAsia="Times New Roman" w:hAnsi="Times New Roman"/>
+          <w:b/>
+          <w:bCs/>
+          <w:sz w:val="21"/>
+          <w:szCs w:val="21"/>
+        </w:rPr>
+        <w:t xml:space="preserve">6. No new FPGA entry. </w:t>
+      </w:r>
+      <w:r>
+        <w:rPr>
+          <w:rFonts w:ascii="Times New Roman" w:cs="Times New Roman" w:eastAsia="Times New Roman" w:hAnsi="Times New Roman"/>
+          <w:sz w:val="21"/>
+          <w:szCs w:val="21"/>
+        </w:rPr>
+        <w:t xml:space="preserve">None of the twenty-two papers reports FPGA resources, power or on-chip latency, so Table 4 is unchanged: the hardware comparison remains against [2], [10]-[12], [18]-[20] and the earlier design of this project.</w:t>
       </w:r>
     </w:p>
     <w:p>
@@ -21476,6 +25193,666 @@
           </w:p>
         </w:tc>
       </w:tr>
+      <w:tr>
+        <w:trPr>
+          <w:cantSplit/>
+        </w:trPr>
+        <w:tc>
+          <w:tcPr>
+            <w:tcW w:type="dxa" w:w="3600"/>
+            <w:tcBorders>
+              <w:top w:val="single" w:color="999999" w:sz="4"/>
+              <w:left w:val="single" w:color="999999" w:sz="4"/>
+              <w:bottom w:val="single" w:color="999999" w:sz="4"/>
+              <w:right w:val="single" w:color="999999" w:sz="4"/>
+            </w:tcBorders>
+            <w:tcMar>
+              <w:top w:type="dxa" w:w="30"/>
+              <w:left w:type="dxa" w:w="60"/>
+              <w:bottom w:type="dxa" w:w="30"/>
+              <w:right w:type="dxa" w:w="60"/>
+            </w:tcMar>
+          </w:tcPr>
+          <w:p>
+            <w:pPr>
+              <w:jc w:val="left"/>
+            </w:pPr>
+            <w:r>
+              <w:rPr>
+                <w:rFonts w:ascii="Times New Roman" w:cs="Times New Roman" w:eastAsia="Times New Roman" w:hAnsi="Times New Roman"/>
+                <w:b w:val="false"/>
+                <w:bCs w:val="false"/>
+                <w:sz w:val="16"/>
+                <w:szCs w:val="16"/>
+              </w:rPr>
+              <w:t xml:space="preserve">AMFS-Net [23]</w:t>
+            </w:r>
+          </w:p>
+        </w:tc>
+        <w:tc>
+          <w:tcPr>
+            <w:tcW w:type="dxa" w:w="2400"/>
+            <w:tcBorders>
+              <w:top w:val="single" w:color="999999" w:sz="4"/>
+              <w:left w:val="single" w:color="999999" w:sz="4"/>
+              <w:bottom w:val="single" w:color="999999" w:sz="4"/>
+              <w:right w:val="single" w:color="999999" w:sz="4"/>
+            </w:tcBorders>
+            <w:tcMar>
+              <w:top w:type="dxa" w:w="30"/>
+              <w:left w:type="dxa" w:w="60"/>
+              <w:bottom w:type="dxa" w:w="30"/>
+              <w:right w:type="dxa" w:w="60"/>
+            </w:tcMar>
+          </w:tcPr>
+          <w:p>
+            <w:pPr>
+              <w:jc w:val="left"/>
+            </w:pPr>
+            <w:r>
+              <w:rPr>
+                <w:rFonts w:ascii="Times New Roman" w:cs="Times New Roman" w:eastAsia="Times New Roman" w:hAnsi="Times New Roman"/>
+                <w:b w:val="false"/>
+                <w:bCs w:val="false"/>
+                <w:sz w:val="16"/>
+                <w:szCs w:val="16"/>
+              </w:rPr>
+              <w:t xml:space="preserve">1.59 M</w:t>
+            </w:r>
+          </w:p>
+        </w:tc>
+        <w:tc>
+          <w:tcPr>
+            <w:tcW w:type="dxa" w:w="2800"/>
+            <w:tcBorders>
+              <w:top w:val="single" w:color="999999" w:sz="4"/>
+              <w:left w:val="single" w:color="999999" w:sz="4"/>
+              <w:bottom w:val="single" w:color="999999" w:sz="4"/>
+              <w:right w:val="single" w:color="999999" w:sz="4"/>
+            </w:tcBorders>
+            <w:tcMar>
+              <w:top w:type="dxa" w:w="30"/>
+              <w:left w:type="dxa" w:w="60"/>
+              <w:bottom w:type="dxa" w:w="30"/>
+              <w:right w:type="dxa" w:w="60"/>
+            </w:tcMar>
+          </w:tcPr>
+          <w:p>
+            <w:pPr>
+              <w:jc w:val="center"/>
+            </w:pPr>
+            <w:r>
+              <w:rPr>
+                <w:rFonts w:ascii="Times New Roman" w:cs="Times New Roman" w:eastAsia="Times New Roman" w:hAnsi="Times New Roman"/>
+                <w:b w:val="false"/>
+                <w:bCs w:val="false"/>
+                <w:sz w:val="16"/>
+                <w:szCs w:val="16"/>
+              </w:rPr>
+              <w:t xml:space="preserve">7.0 GFLOPs</w:t>
+            </w:r>
+          </w:p>
+        </w:tc>
+        <w:tc>
+          <w:tcPr>
+            <w:tcW w:type="dxa" w:w="3200"/>
+            <w:tcBorders>
+              <w:top w:val="single" w:color="999999" w:sz="4"/>
+              <w:left w:val="single" w:color="999999" w:sz="4"/>
+              <w:bottom w:val="single" w:color="999999" w:sz="4"/>
+              <w:right w:val="single" w:color="999999" w:sz="4"/>
+            </w:tcBorders>
+            <w:tcMar>
+              <w:top w:type="dxa" w:w="30"/>
+              <w:left w:type="dxa" w:w="60"/>
+              <w:bottom w:type="dxa" w:w="30"/>
+              <w:right w:type="dxa" w:w="60"/>
+            </w:tcMar>
+          </w:tcPr>
+          <w:p>
+            <w:pPr>
+              <w:jc w:val="center"/>
+            </w:pPr>
+            <w:r>
+              <w:rPr>
+                <w:rFonts w:ascii="Times New Roman" w:cs="Times New Roman" w:eastAsia="Times New Roman" w:hAnsi="Times New Roman"/>
+                <w:b w:val="false"/>
+                <w:bCs w:val="false"/>
+                <w:sz w:val="16"/>
+                <w:szCs w:val="16"/>
+              </w:rPr>
+              <w:t xml:space="preserve">n.r.</w:t>
+            </w:r>
+          </w:p>
+        </w:tc>
+        <w:tc>
+          <w:tcPr>
+            <w:tcW w:type="dxa" w:w="3000"/>
+            <w:tcBorders>
+              <w:top w:val="single" w:color="999999" w:sz="4"/>
+              <w:left w:val="single" w:color="999999" w:sz="4"/>
+              <w:bottom w:val="single" w:color="999999" w:sz="4"/>
+              <w:right w:val="single" w:color="999999" w:sz="4"/>
+            </w:tcBorders>
+            <w:tcMar>
+              <w:top w:type="dxa" w:w="30"/>
+              <w:left w:type="dxa" w:w="60"/>
+              <w:bottom w:type="dxa" w:w="30"/>
+              <w:right w:type="dxa" w:w="60"/>
+            </w:tcMar>
+          </w:tcPr>
+          <w:p>
+            <w:pPr>
+              <w:jc w:val="center"/>
+            </w:pPr>
+            <w:r>
+              <w:rPr>
+                <w:rFonts w:ascii="Times New Roman" w:cs="Times New Roman" w:eastAsia="Times New Roman" w:hAnsi="Times New Roman"/>
+                <w:b w:val="false"/>
+                <w:bCs w:val="false"/>
+                <w:sz w:val="16"/>
+                <w:szCs w:val="16"/>
+              </w:rPr>
+              <w:t xml:space="preserve">HRSID AP50 93.1 %, 371 FPS, RTX 4090</w:t>
+            </w:r>
+          </w:p>
+        </w:tc>
+      </w:tr>
+      <w:tr>
+        <w:trPr>
+          <w:cantSplit/>
+        </w:trPr>
+        <w:tc>
+          <w:tcPr>
+            <w:tcW w:type="dxa" w:w="3600"/>
+            <w:tcBorders>
+              <w:top w:val="single" w:color="999999" w:sz="4"/>
+              <w:left w:val="single" w:color="999999" w:sz="4"/>
+              <w:bottom w:val="single" w:color="999999" w:sz="4"/>
+              <w:right w:val="single" w:color="999999" w:sz="4"/>
+            </w:tcBorders>
+            <w:tcMar>
+              <w:top w:type="dxa" w:w="30"/>
+              <w:left w:type="dxa" w:w="60"/>
+              <w:bottom w:type="dxa" w:w="30"/>
+              <w:right w:type="dxa" w:w="60"/>
+            </w:tcMar>
+          </w:tcPr>
+          <w:p>
+            <w:pPr>
+              <w:jc w:val="left"/>
+            </w:pPr>
+            <w:r>
+              <w:rPr>
+                <w:rFonts w:ascii="Times New Roman" w:cs="Times New Roman" w:eastAsia="Times New Roman" w:hAnsi="Times New Roman"/>
+                <w:b w:val="false"/>
+                <w:bCs w:val="false"/>
+                <w:sz w:val="16"/>
+                <w:szCs w:val="16"/>
+              </w:rPr>
+              <w:t xml:space="preserve">AD-YOLO [22]</w:t>
+            </w:r>
+          </w:p>
+        </w:tc>
+        <w:tc>
+          <w:tcPr>
+            <w:tcW w:type="dxa" w:w="2400"/>
+            <w:tcBorders>
+              <w:top w:val="single" w:color="999999" w:sz="4"/>
+              <w:left w:val="single" w:color="999999" w:sz="4"/>
+              <w:bottom w:val="single" w:color="999999" w:sz="4"/>
+              <w:right w:val="single" w:color="999999" w:sz="4"/>
+            </w:tcBorders>
+            <w:tcMar>
+              <w:top w:type="dxa" w:w="30"/>
+              <w:left w:type="dxa" w:w="60"/>
+              <w:bottom w:type="dxa" w:w="30"/>
+              <w:right w:type="dxa" w:w="60"/>
+            </w:tcMar>
+          </w:tcPr>
+          <w:p>
+            <w:pPr>
+              <w:jc w:val="left"/>
+            </w:pPr>
+            <w:r>
+              <w:rPr>
+                <w:rFonts w:ascii="Times New Roman" w:cs="Times New Roman" w:eastAsia="Times New Roman" w:hAnsi="Times New Roman"/>
+                <w:b w:val="false"/>
+                <w:bCs w:val="false"/>
+                <w:sz w:val="16"/>
+                <w:szCs w:val="16"/>
+              </w:rPr>
+              <w:t xml:space="preserve">2.75 M</w:t>
+            </w:r>
+          </w:p>
+        </w:tc>
+        <w:tc>
+          <w:tcPr>
+            <w:tcW w:type="dxa" w:w="2800"/>
+            <w:tcBorders>
+              <w:top w:val="single" w:color="999999" w:sz="4"/>
+              <w:left w:val="single" w:color="999999" w:sz="4"/>
+              <w:bottom w:val="single" w:color="999999" w:sz="4"/>
+              <w:right w:val="single" w:color="999999" w:sz="4"/>
+            </w:tcBorders>
+            <w:tcMar>
+              <w:top w:type="dxa" w:w="30"/>
+              <w:left w:type="dxa" w:w="60"/>
+              <w:bottom w:type="dxa" w:w="30"/>
+              <w:right w:type="dxa" w:w="60"/>
+            </w:tcMar>
+          </w:tcPr>
+          <w:p>
+            <w:pPr>
+              <w:jc w:val="center"/>
+            </w:pPr>
+            <w:r>
+              <w:rPr>
+                <w:rFonts w:ascii="Times New Roman" w:cs="Times New Roman" w:eastAsia="Times New Roman" w:hAnsi="Times New Roman"/>
+                <w:b w:val="false"/>
+                <w:bCs w:val="false"/>
+                <w:sz w:val="16"/>
+                <w:szCs w:val="16"/>
+              </w:rPr>
+              <w:t xml:space="preserve">7.0 GFLOPs</w:t>
+            </w:r>
+          </w:p>
+        </w:tc>
+        <w:tc>
+          <w:tcPr>
+            <w:tcW w:type="dxa" w:w="3200"/>
+            <w:tcBorders>
+              <w:top w:val="single" w:color="999999" w:sz="4"/>
+              <w:left w:val="single" w:color="999999" w:sz="4"/>
+              <w:bottom w:val="single" w:color="999999" w:sz="4"/>
+              <w:right w:val="single" w:color="999999" w:sz="4"/>
+            </w:tcBorders>
+            <w:tcMar>
+              <w:top w:type="dxa" w:w="30"/>
+              <w:left w:type="dxa" w:w="60"/>
+              <w:bottom w:type="dxa" w:w="30"/>
+              <w:right w:type="dxa" w:w="60"/>
+            </w:tcMar>
+          </w:tcPr>
+          <w:p>
+            <w:pPr>
+              <w:jc w:val="center"/>
+            </w:pPr>
+            <w:r>
+              <w:rPr>
+                <w:rFonts w:ascii="Times New Roman" w:cs="Times New Roman" w:eastAsia="Times New Roman" w:hAnsi="Times New Roman"/>
+                <w:b w:val="false"/>
+                <w:bCs w:val="false"/>
+                <w:sz w:val="16"/>
+                <w:szCs w:val="16"/>
+              </w:rPr>
+              <w:t xml:space="preserve">n.r.</w:t>
+            </w:r>
+          </w:p>
+        </w:tc>
+        <w:tc>
+          <w:tcPr>
+            <w:tcW w:type="dxa" w:w="3000"/>
+            <w:tcBorders>
+              <w:top w:val="single" w:color="999999" w:sz="4"/>
+              <w:left w:val="single" w:color="999999" w:sz="4"/>
+              <w:bottom w:val="single" w:color="999999" w:sz="4"/>
+              <w:right w:val="single" w:color="999999" w:sz="4"/>
+            </w:tcBorders>
+            <w:tcMar>
+              <w:top w:type="dxa" w:w="30"/>
+              <w:left w:type="dxa" w:w="60"/>
+              <w:bottom w:type="dxa" w:w="30"/>
+              <w:right w:type="dxa" w:w="60"/>
+            </w:tcMar>
+          </w:tcPr>
+          <w:p>
+            <w:pPr>
+              <w:jc w:val="center"/>
+            </w:pPr>
+            <w:r>
+              <w:rPr>
+                <w:rFonts w:ascii="Times New Roman" w:cs="Times New Roman" w:eastAsia="Times New Roman" w:hAnsi="Times New Roman"/>
+                <w:b w:val="false"/>
+                <w:bCs w:val="false"/>
+                <w:sz w:val="16"/>
+                <w:szCs w:val="16"/>
+              </w:rPr>
+              <w:t xml:space="preserve">HRSID AP50 91.8 %, 532 FPS, RTX 4090</w:t>
+            </w:r>
+          </w:p>
+        </w:tc>
+      </w:tr>
+      <w:tr>
+        <w:trPr>
+          <w:cantSplit/>
+        </w:trPr>
+        <w:tc>
+          <w:tcPr>
+            <w:tcW w:type="dxa" w:w="3600"/>
+            <w:tcBorders>
+              <w:top w:val="single" w:color="999999" w:sz="4"/>
+              <w:left w:val="single" w:color="999999" w:sz="4"/>
+              <w:bottom w:val="single" w:color="999999" w:sz="4"/>
+              <w:right w:val="single" w:color="999999" w:sz="4"/>
+            </w:tcBorders>
+            <w:tcMar>
+              <w:top w:type="dxa" w:w="30"/>
+              <w:left w:type="dxa" w:w="60"/>
+              <w:bottom w:type="dxa" w:w="30"/>
+              <w:right w:type="dxa" w:w="60"/>
+            </w:tcMar>
+          </w:tcPr>
+          <w:p>
+            <w:pPr>
+              <w:jc w:val="left"/>
+            </w:pPr>
+            <w:r>
+              <w:rPr>
+                <w:rFonts w:ascii="Times New Roman" w:cs="Times New Roman" w:eastAsia="Times New Roman" w:hAnsi="Times New Roman"/>
+                <w:b w:val="false"/>
+                <w:bCs w:val="false"/>
+                <w:sz w:val="16"/>
+                <w:szCs w:val="16"/>
+              </w:rPr>
+              <w:t xml:space="preserve">LightSAR-Net [24]</w:t>
+            </w:r>
+          </w:p>
+        </w:tc>
+        <w:tc>
+          <w:tcPr>
+            <w:tcW w:type="dxa" w:w="2400"/>
+            <w:tcBorders>
+              <w:top w:val="single" w:color="999999" w:sz="4"/>
+              <w:left w:val="single" w:color="999999" w:sz="4"/>
+              <w:bottom w:val="single" w:color="999999" w:sz="4"/>
+              <w:right w:val="single" w:color="999999" w:sz="4"/>
+            </w:tcBorders>
+            <w:tcMar>
+              <w:top w:type="dxa" w:w="30"/>
+              <w:left w:type="dxa" w:w="60"/>
+              <w:bottom w:type="dxa" w:w="30"/>
+              <w:right w:type="dxa" w:w="60"/>
+            </w:tcMar>
+          </w:tcPr>
+          <w:p>
+            <w:pPr>
+              <w:jc w:val="left"/>
+            </w:pPr>
+            <w:r>
+              <w:rPr>
+                <w:rFonts w:ascii="Times New Roman" w:cs="Times New Roman" w:eastAsia="Times New Roman" w:hAnsi="Times New Roman"/>
+                <w:b w:val="false"/>
+                <w:bCs w:val="false"/>
+                <w:sz w:val="16"/>
+                <w:szCs w:val="16"/>
+              </w:rPr>
+              <w:t xml:space="preserve">2.11 M</w:t>
+            </w:r>
+          </w:p>
+        </w:tc>
+        <w:tc>
+          <w:tcPr>
+            <w:tcW w:type="dxa" w:w="2800"/>
+            <w:tcBorders>
+              <w:top w:val="single" w:color="999999" w:sz="4"/>
+              <w:left w:val="single" w:color="999999" w:sz="4"/>
+              <w:bottom w:val="single" w:color="999999" w:sz="4"/>
+              <w:right w:val="single" w:color="999999" w:sz="4"/>
+            </w:tcBorders>
+            <w:tcMar>
+              <w:top w:type="dxa" w:w="30"/>
+              <w:left w:type="dxa" w:w="60"/>
+              <w:bottom w:type="dxa" w:w="30"/>
+              <w:right w:type="dxa" w:w="60"/>
+            </w:tcMar>
+          </w:tcPr>
+          <w:p>
+            <w:pPr>
+              <w:jc w:val="center"/>
+            </w:pPr>
+            <w:r>
+              <w:rPr>
+                <w:rFonts w:ascii="Times New Roman" w:cs="Times New Roman" w:eastAsia="Times New Roman" w:hAnsi="Times New Roman"/>
+                <w:b w:val="false"/>
+                <w:bCs w:val="false"/>
+                <w:sz w:val="16"/>
+                <w:szCs w:val="16"/>
+              </w:rPr>
+              <w:t xml:space="preserve">7.2 GFLOPs</w:t>
+            </w:r>
+          </w:p>
+        </w:tc>
+        <w:tc>
+          <w:tcPr>
+            <w:tcW w:type="dxa" w:w="3200"/>
+            <w:tcBorders>
+              <w:top w:val="single" w:color="999999" w:sz="4"/>
+              <w:left w:val="single" w:color="999999" w:sz="4"/>
+              <w:bottom w:val="single" w:color="999999" w:sz="4"/>
+              <w:right w:val="single" w:color="999999" w:sz="4"/>
+            </w:tcBorders>
+            <w:tcMar>
+              <w:top w:type="dxa" w:w="30"/>
+              <w:left w:type="dxa" w:w="60"/>
+              <w:bottom w:type="dxa" w:w="30"/>
+              <w:right w:type="dxa" w:w="60"/>
+            </w:tcMar>
+          </w:tcPr>
+          <w:p>
+            <w:pPr>
+              <w:jc w:val="center"/>
+            </w:pPr>
+            <w:r>
+              <w:rPr>
+                <w:rFonts w:ascii="Times New Roman" w:cs="Times New Roman" w:eastAsia="Times New Roman" w:hAnsi="Times New Roman"/>
+                <w:b w:val="false"/>
+                <w:bCs w:val="false"/>
+                <w:sz w:val="16"/>
+                <w:szCs w:val="16"/>
+              </w:rPr>
+              <w:t xml:space="preserve">n.r.</w:t>
+            </w:r>
+          </w:p>
+        </w:tc>
+        <w:tc>
+          <w:tcPr>
+            <w:tcW w:type="dxa" w:w="3000"/>
+            <w:tcBorders>
+              <w:top w:val="single" w:color="999999" w:sz="4"/>
+              <w:left w:val="single" w:color="999999" w:sz="4"/>
+              <w:bottom w:val="single" w:color="999999" w:sz="4"/>
+              <w:right w:val="single" w:color="999999" w:sz="4"/>
+            </w:tcBorders>
+            <w:tcMar>
+              <w:top w:type="dxa" w:w="30"/>
+              <w:left w:type="dxa" w:w="60"/>
+              <w:bottom w:type="dxa" w:w="30"/>
+              <w:right w:type="dxa" w:w="60"/>
+            </w:tcMar>
+          </w:tcPr>
+          <w:p>
+            <w:pPr>
+              <w:jc w:val="center"/>
+            </w:pPr>
+            <w:r>
+              <w:rPr>
+                <w:rFonts w:ascii="Times New Roman" w:cs="Times New Roman" w:eastAsia="Times New Roman" w:hAnsi="Times New Roman"/>
+                <w:b w:val="false"/>
+                <w:bCs w:val="false"/>
+                <w:sz w:val="16"/>
+                <w:szCs w:val="16"/>
+              </w:rPr>
+              <w:t xml:space="preserve">HRSID AP50 95.8 % (value read from a degraded table), RTX 3060</w:t>
+            </w:r>
+          </w:p>
+        </w:tc>
+      </w:tr>
+      <w:tr>
+        <w:trPr>
+          <w:cantSplit/>
+        </w:trPr>
+        <w:tc>
+          <w:tcPr>
+            <w:tcW w:type="dxa" w:w="3600"/>
+            <w:tcBorders>
+              <w:top w:val="single" w:color="999999" w:sz="4"/>
+              <w:left w:val="single" w:color="999999" w:sz="4"/>
+              <w:bottom w:val="single" w:color="999999" w:sz="4"/>
+              <w:right w:val="single" w:color="999999" w:sz="4"/>
+            </w:tcBorders>
+            <w:tcMar>
+              <w:top w:type="dxa" w:w="30"/>
+              <w:left w:type="dxa" w:w="60"/>
+              <w:bottom w:type="dxa" w:w="30"/>
+              <w:right w:type="dxa" w:w="60"/>
+            </w:tcMar>
+          </w:tcPr>
+          <w:p>
+            <w:pPr>
+              <w:jc w:val="left"/>
+            </w:pPr>
+            <w:r>
+              <w:rPr>
+                <w:rFonts w:ascii="Times New Roman" w:cs="Times New Roman" w:eastAsia="Times New Roman" w:hAnsi="Times New Roman"/>
+                <w:b w:val="false"/>
+                <w:bCs w:val="false"/>
+                <w:sz w:val="16"/>
+                <w:szCs w:val="16"/>
+              </w:rPr>
+              <w:t xml:space="preserve">ELSD-Net [26]</w:t>
+            </w:r>
+          </w:p>
+        </w:tc>
+        <w:tc>
+          <w:tcPr>
+            <w:tcW w:type="dxa" w:w="2400"/>
+            <w:tcBorders>
+              <w:top w:val="single" w:color="999999" w:sz="4"/>
+              <w:left w:val="single" w:color="999999" w:sz="4"/>
+              <w:bottom w:val="single" w:color="999999" w:sz="4"/>
+              <w:right w:val="single" w:color="999999" w:sz="4"/>
+            </w:tcBorders>
+            <w:tcMar>
+              <w:top w:type="dxa" w:w="30"/>
+              <w:left w:type="dxa" w:w="60"/>
+              <w:bottom w:type="dxa" w:w="30"/>
+              <w:right w:type="dxa" w:w="60"/>
+            </w:tcMar>
+          </w:tcPr>
+          <w:p>
+            <w:pPr>
+              <w:jc w:val="left"/>
+            </w:pPr>
+            <w:r>
+              <w:rPr>
+                <w:rFonts w:ascii="Times New Roman" w:cs="Times New Roman" w:eastAsia="Times New Roman" w:hAnsi="Times New Roman"/>
+                <w:b w:val="false"/>
+                <w:bCs w:val="false"/>
+                <w:sz w:val="16"/>
+                <w:szCs w:val="16"/>
+              </w:rPr>
+              <w:t xml:space="preserve">0.3 M</w:t>
+            </w:r>
+          </w:p>
+        </w:tc>
+        <w:tc>
+          <w:tcPr>
+            <w:tcW w:type="dxa" w:w="2800"/>
+            <w:tcBorders>
+              <w:top w:val="single" w:color="999999" w:sz="4"/>
+              <w:left w:val="single" w:color="999999" w:sz="4"/>
+              <w:bottom w:val="single" w:color="999999" w:sz="4"/>
+              <w:right w:val="single" w:color="999999" w:sz="4"/>
+            </w:tcBorders>
+            <w:tcMar>
+              <w:top w:type="dxa" w:w="30"/>
+              <w:left w:type="dxa" w:w="60"/>
+              <w:bottom w:type="dxa" w:w="30"/>
+              <w:right w:type="dxa" w:w="60"/>
+            </w:tcMar>
+          </w:tcPr>
+          <w:p>
+            <w:pPr>
+              <w:jc w:val="center"/>
+            </w:pPr>
+            <w:r>
+              <w:rPr>
+                <w:rFonts w:ascii="Times New Roman" w:cs="Times New Roman" w:eastAsia="Times New Roman" w:hAnsi="Times New Roman"/>
+                <w:b w:val="false"/>
+                <w:bCs w:val="false"/>
+                <w:sz w:val="16"/>
+                <w:szCs w:val="16"/>
+              </w:rPr>
+              <w:t xml:space="preserve">1.2 GFLOPs</w:t>
+            </w:r>
+          </w:p>
+        </w:tc>
+        <w:tc>
+          <w:tcPr>
+            <w:tcW w:type="dxa" w:w="3200"/>
+            <w:tcBorders>
+              <w:top w:val="single" w:color="999999" w:sz="4"/>
+              <w:left w:val="single" w:color="999999" w:sz="4"/>
+              <w:bottom w:val="single" w:color="999999" w:sz="4"/>
+              <w:right w:val="single" w:color="999999" w:sz="4"/>
+            </w:tcBorders>
+            <w:tcMar>
+              <w:top w:type="dxa" w:w="30"/>
+              <w:left w:type="dxa" w:w="60"/>
+              <w:bottom w:type="dxa" w:w="30"/>
+              <w:right w:type="dxa" w:w="60"/>
+            </w:tcMar>
+          </w:tcPr>
+          <w:p>
+            <w:pPr>
+              <w:jc w:val="center"/>
+            </w:pPr>
+            <w:r>
+              <w:rPr>
+                <w:rFonts w:ascii="Times New Roman" w:cs="Times New Roman" w:eastAsia="Times New Roman" w:hAnsi="Times New Roman"/>
+                <w:b w:val="false"/>
+                <w:bCs w:val="false"/>
+                <w:sz w:val="16"/>
+                <w:szCs w:val="16"/>
+              </w:rPr>
+              <w:t xml:space="preserve">n.r.</w:t>
+            </w:r>
+          </w:p>
+        </w:tc>
+        <w:tc>
+          <w:tcPr>
+            <w:tcW w:type="dxa" w:w="3000"/>
+            <w:tcBorders>
+              <w:top w:val="single" w:color="999999" w:sz="4"/>
+              <w:left w:val="single" w:color="999999" w:sz="4"/>
+              <w:bottom w:val="single" w:color="999999" w:sz="4"/>
+              <w:right w:val="single" w:color="999999" w:sz="4"/>
+            </w:tcBorders>
+            <w:tcMar>
+              <w:top w:type="dxa" w:w="30"/>
+              <w:left w:type="dxa" w:w="60"/>
+              <w:bottom w:type="dxa" w:w="30"/>
+              <w:right w:type="dxa" w:w="60"/>
+            </w:tcMar>
+          </w:tcPr>
+          <w:p>
+            <w:pPr>
+              <w:jc w:val="center"/>
+            </w:pPr>
+            <w:r>
+              <w:rPr>
+                <w:rFonts w:ascii="Times New Roman" w:cs="Times New Roman" w:eastAsia="Times New Roman" w:hAnsi="Times New Roman"/>
+                <w:b w:val="false"/>
+                <w:bCs w:val="false"/>
+                <w:sz w:val="16"/>
+                <w:szCs w:val="16"/>
+              </w:rPr>
+              <w:t xml:space="preserve">SSDD only (AP50 98.2 %); HRSID n.r.</w:t>
+            </w:r>
+          </w:p>
+        </w:tc>
+      </w:tr>
     </w:tbl>
     <w:p>
       <w:pPr>
@@ -21490,7 +25867,7 @@
           <w:sz w:val="17"/>
           <w:szCs w:val="17"/>
         </w:rPr>
-        <w:t xml:space="preserve">MAC / FLOP conventions differ between papers (1 MAC = 2 FLOPs here: 1.95 M MAC = 3.9 MFLOP per patch). Our per-frame figure counts only candidate patches; image-level pooling and the prescreen are integer additions and are not included. The lightweight detectors are 15-47 times larger in parameters than our CNN, but they also produce boxes, classify and localise without a separate CFAR stage.</w:t>
+        <w:t xml:space="preserve">MAC / FLOP conventions differ between papers (1 MAC = 2 FLOPs here: 1.95 M MAC = 3.9 MFLOP per patch). Our per-frame figure counts only candidate patches; image-level pooling and the prescreen are integer additions and are not included. The lightweight detectors are about 5 to 47 times larger in parameters than our CNN (ELSD-Net, which reports SSDD only, is the smallest at 0.3 M), but they also produce boxes, classify and localise without a separate CFAR stage.</w:t>
       </w:r>
     </w:p>
     <w:p>
@@ -27691,6 +32068,286 @@
           <w:szCs w:val="18"/>
         </w:rPr>
         <w:t xml:space="preserve">[21] "Adaptive CFAR method for SAR ship detection using intensity and texture feature fusion attention contrast mechanism," Sensors, 2022, PMC9659258 (project vault; author list not recorded in the vault note).</w:t>
+      </w:r>
+    </w:p>
+    <w:p>
+      <w:pPr>
+        <w:spacing w:after="50" w:line="250"/>
+        <w:jc w:val="left"/>
+      </w:pPr>
+      <w:r>
+        <w:rPr>
+          <w:rFonts w:ascii="Times New Roman" w:cs="Times New Roman" w:eastAsia="Times New Roman" w:hAnsi="Times New Roman"/>
+          <w:sz w:val="18"/>
+          <w:szCs w:val="18"/>
+        </w:rPr>
+        <w:t xml:space="preserve">[22] X. Peng, Y. Xu, "AD-YOLO: An adaptive detection YOLO architecture for ship detection in SAR imagery," IEEE Geosci. Remote Sens. Lett., vol. 23, 2026, Art. no. 3502705, doi:10.1109/LGRS.2026.3718803.</w:t>
+      </w:r>
+    </w:p>
+    <w:p>
+      <w:pPr>
+        <w:spacing w:after="50" w:line="250"/>
+        <w:jc w:val="left"/>
+      </w:pPr>
+      <w:r>
+        <w:rPr>
+          <w:rFonts w:ascii="Times New Roman" w:cs="Times New Roman" w:eastAsia="Times New Roman" w:hAnsi="Times New Roman"/>
+          <w:sz w:val="18"/>
+          <w:szCs w:val="18"/>
+        </w:rPr>
+        <w:t xml:space="preserve">[23] C. Zhang, J. Xing, Y. Wang, Y. Liu, Y. Xing, "AMFS-Net: An adaptive multiscale feature fusion framework for efficient SAR ship detection," IEEE Geosci. Remote Sens. Lett., vol. 23, 2026, Art. no. 4004405, doi:10.1109/LGRS.2026.3656578.</w:t>
+      </w:r>
+    </w:p>
+    <w:p>
+      <w:pPr>
+        <w:spacing w:after="50" w:line="250"/>
+        <w:jc w:val="left"/>
+      </w:pPr>
+      <w:r>
+        <w:rPr>
+          <w:rFonts w:ascii="Times New Roman" w:cs="Times New Roman" w:eastAsia="Times New Roman" w:hAnsi="Times New Roman"/>
+          <w:sz w:val="18"/>
+          <w:szCs w:val="18"/>
+        </w:rPr>
+        <w:t xml:space="preserve">[24] G. Fang, F. Han, C. He, J. Li, "LightSAR-Net: A lightweight multiscale dynamic SAR ship detection network," IEEE Geosci. Remote Sens. Lett., vol. 22, 2025, Art. no. 4015105, doi:10.1109/LGRS.2025.3628605.</w:t>
+      </w:r>
+    </w:p>
+    <w:p>
+      <w:pPr>
+        <w:spacing w:after="50" w:line="250"/>
+        <w:jc w:val="left"/>
+      </w:pPr>
+      <w:r>
+        <w:rPr>
+          <w:rFonts w:ascii="Times New Roman" w:cs="Times New Roman" w:eastAsia="Times New Roman" w:hAnsi="Times New Roman"/>
+          <w:sz w:val="18"/>
+          <w:szCs w:val="18"/>
+        </w:rPr>
+        <w:t xml:space="preserve">[25] S. Gao, J. M. Liu, Y. H. Miao, Z. J. He, "A high-effective implementation of ship detector for SAR images," IEEE Geosci. Remote Sens. Lett., vol. 19, 2022, Art. no. 4019005, doi:10.1109/LGRS.2021.3115121.</w:t>
+      </w:r>
+    </w:p>
+    <w:p>
+      <w:pPr>
+        <w:spacing w:after="50" w:line="250"/>
+        <w:jc w:val="left"/>
+      </w:pPr>
+      <w:r>
+        <w:rPr>
+          <w:rFonts w:ascii="Times New Roman" w:cs="Times New Roman" w:eastAsia="Times New Roman" w:hAnsi="Times New Roman"/>
+          <w:sz w:val="18"/>
+          <w:szCs w:val="18"/>
+        </w:rPr>
+        <w:t xml:space="preserve">[26] S. Man, W. Yu, "ELSD-Net: A novel efficient and lightweight ship detection network for SAR images," IEEE Geosci. Remote Sens. Lett., vol. 22, 2025, Art. no. 4003505, doi:10.1109/LGRS.2025.3527444.</w:t>
+      </w:r>
+    </w:p>
+    <w:p>
+      <w:pPr>
+        <w:spacing w:after="50" w:line="250"/>
+        <w:jc w:val="left"/>
+      </w:pPr>
+      <w:r>
+        <w:rPr>
+          <w:rFonts w:ascii="Times New Roman" w:cs="Times New Roman" w:eastAsia="Times New Roman" w:hAnsi="Times New Roman"/>
+          <w:sz w:val="18"/>
+          <w:szCs w:val="18"/>
+        </w:rPr>
+        <w:t xml:space="preserve">[27] Y. Yang, Y. Ju, Z. Zhou, "A super lightweight and efficient SAR image ship detector," IEEE Geosci. Remote Sens. Lett., vol. 20, 2023, Art. no. 4006805, doi:10.1109/LGRS.2023.3284093.</w:t>
+      </w:r>
+    </w:p>
+    <w:p>
+      <w:pPr>
+        <w:spacing w:after="50" w:line="250"/>
+        <w:jc w:val="left"/>
+      </w:pPr>
+      <w:r>
+        <w:rPr>
+          <w:rFonts w:ascii="Times New Roman" w:cs="Times New Roman" w:eastAsia="Times New Roman" w:hAnsi="Times New Roman"/>
+          <w:sz w:val="18"/>
+          <w:szCs w:val="18"/>
+        </w:rPr>
+        <w:t xml:space="preserve">[28] X. Wang, B. Yang, S. Chen, X. Liu, "CPC-YOLO: Lightweight framework for small ship detection in SAR images," IEEE Signal Process. Lett., vol. 33, 2026, p. 1961, doi:10.1109/LSP.2026.3687786.</w:t>
+      </w:r>
+    </w:p>
+    <w:p>
+      <w:pPr>
+        <w:spacing w:after="50" w:line="250"/>
+        <w:jc w:val="left"/>
+      </w:pPr>
+      <w:r>
+        <w:rPr>
+          <w:rFonts w:ascii="Times New Roman" w:cs="Times New Roman" w:eastAsia="Times New Roman" w:hAnsi="Times New Roman"/>
+          <w:sz w:val="18"/>
+          <w:szCs w:val="18"/>
+        </w:rPr>
+        <w:t xml:space="preserve">[29] W. Chen, M. Ye, "Adaptive feature enhancement for SAR-based ship detection," IEEE Signal Process. Lett., vol. 33, 2026, p. 2121, doi:10.1109/LSP.2026.3696607.</w:t>
+      </w:r>
+    </w:p>
+    <w:p>
+      <w:pPr>
+        <w:spacing w:after="50" w:line="250"/>
+        <w:jc w:val="left"/>
+      </w:pPr>
+      <w:r>
+        <w:rPr>
+          <w:rFonts w:ascii="Times New Roman" w:cs="Times New Roman" w:eastAsia="Times New Roman" w:hAnsi="Times New Roman"/>
+          <w:sz w:val="18"/>
+          <w:szCs w:val="18"/>
+        </w:rPr>
+        <w:t xml:space="preserve">[30] T. Zeng, T. Zhang, Z. Shao, X. Xu, W. Zhang, J. Shi, S. Wei, X. Zhang, "CFAR-DP-FW: A CFAR-guided dual-polarization fusion framework for large-scene SAR ship detection," IEEE J. Sel. Topics Appl. Earth Observ. Remote Sens., vol. 17, 2024, doi:10.1109/JSTARS.2024.3358058.</w:t>
+      </w:r>
+    </w:p>
+    <w:p>
+      <w:pPr>
+        <w:spacing w:after="50" w:line="250"/>
+        <w:jc w:val="left"/>
+      </w:pPr>
+      <w:r>
+        <w:rPr>
+          <w:rFonts w:ascii="Times New Roman" w:cs="Times New Roman" w:eastAsia="Times New Roman" w:hAnsi="Times New Roman"/>
+          <w:sz w:val="18"/>
+          <w:szCs w:val="18"/>
+        </w:rPr>
+        <w:t xml:space="preserve">[31] X. Meng, "Wilcoxon nonparametric CFAR scheme for ship detection in SAR image," IEEE J. Sel. Topics Appl. Earth Observ. Remote Sens., vol. 18, 2025, p. 5360, doi:10.1109/JSTARS.2025.3533140.</w:t>
+      </w:r>
+    </w:p>
+    <w:p>
+      <w:pPr>
+        <w:spacing w:after="50" w:line="250"/>
+        <w:jc w:val="left"/>
+      </w:pPr>
+      <w:r>
+        <w:rPr>
+          <w:rFonts w:ascii="Times New Roman" w:cs="Times New Roman" w:eastAsia="Times New Roman" w:hAnsi="Times New Roman"/>
+          <w:sz w:val="18"/>
+          <w:szCs w:val="18"/>
+        </w:rPr>
+        <w:t xml:space="preserve">[32] Y. Li, Z. Wang, H. Chen, Y. Li, "A density clustering-based CFAR algorithm for ship detection in SAR images," IEEE Geosci. Remote Sens. Lett., vol. 21, 2024, Art. no. 4009505, doi:10.1109/LGRS.2024.3397883.</w:t>
+      </w:r>
+    </w:p>
+    <w:p>
+      <w:pPr>
+        <w:spacing w:after="50" w:line="250"/>
+        <w:jc w:val="left"/>
+      </w:pPr>
+      <w:r>
+        <w:rPr>
+          <w:rFonts w:ascii="Times New Roman" w:cs="Times New Roman" w:eastAsia="Times New Roman" w:hAnsi="Times New Roman"/>
+          <w:sz w:val="18"/>
+          <w:szCs w:val="18"/>
+        </w:rPr>
+        <w:t xml:space="preserve">[33] X. Wang, G. Li, X.-P. Zhang, Y. He, "A fast CFAR algorithm based on density-censoring operation for ship detection in SAR images," IEEE Signal Process. Lett., vol. 28, p. 1085, 2021, doi:10.1109/LSP.2021.3082034.</w:t>
+      </w:r>
+    </w:p>
+    <w:p>
+      <w:pPr>
+        <w:spacing w:after="50" w:line="250"/>
+        <w:jc w:val="left"/>
+      </w:pPr>
+      <w:r>
+        <w:rPr>
+          <w:rFonts w:ascii="Times New Roman" w:cs="Times New Roman" w:eastAsia="Times New Roman" w:hAnsi="Times New Roman"/>
+          <w:sz w:val="18"/>
+          <w:szCs w:val="18"/>
+        </w:rPr>
+        <w:t xml:space="preserve">[34] Z. Cui, Z. Hou, H. Yang, N. Liu, Z. Cao, "A CFAR target-detection method based on superpixel statistical modeling," IEEE Geosci. Remote Sens. Lett., vol. 18, no. 9, p. 1605, 2021, doi:10.1109/LGRS.2020.3006033.</w:t>
+      </w:r>
+    </w:p>
+    <w:p>
+      <w:pPr>
+        <w:spacing w:after="50" w:line="250"/>
+        <w:jc w:val="left"/>
+      </w:pPr>
+      <w:r>
+        <w:rPr>
+          <w:rFonts w:ascii="Times New Roman" w:cs="Times New Roman" w:eastAsia="Times New Roman" w:hAnsi="Times New Roman"/>
+          <w:sz w:val="18"/>
+          <w:szCs w:val="18"/>
+        </w:rPr>
+        <w:t xml:space="preserve">[35] M.-D. Li, X.-C. Cui, S.-W. Chen, "Adaptive superpixel-level CFAR detector for SAR inshore dense ship detection," IEEE Geosci. Remote Sens. Lett., vol. 19, 2022, Art. no. 4010405, doi:10.1109/LGRS.2021.3059253.</w:t>
+      </w:r>
+    </w:p>
+    <w:p>
+      <w:pPr>
+        <w:spacing w:after="50" w:line="250"/>
+        <w:jc w:val="left"/>
+      </w:pPr>
+      <w:r>
+        <w:rPr>
+          <w:rFonts w:ascii="Times New Roman" w:cs="Times New Roman" w:eastAsia="Times New Roman" w:hAnsi="Times New Roman"/>
+          <w:sz w:val="18"/>
+          <w:szCs w:val="18"/>
+        </w:rPr>
+        <w:t xml:space="preserve">[36] L. Zhang, Z. Zhang, S. Lu, D. Xiang, Y. Su, "Fast superpixel-based non-window CFAR ship detector for SAR imagery," Remote Sens., vol. 14, no. 9, 2092, 2022, doi:10.3390/rs14092092.</w:t>
+      </w:r>
+    </w:p>
+    <w:p>
+      <w:pPr>
+        <w:spacing w:after="50" w:line="250"/>
+        <w:jc w:val="left"/>
+      </w:pPr>
+      <w:r>
+        <w:rPr>
+          <w:rFonts w:ascii="Times New Roman" w:cs="Times New Roman" w:eastAsia="Times New Roman" w:hAnsi="Times New Roman"/>
+          <w:sz w:val="18"/>
+          <w:szCs w:val="18"/>
+        </w:rPr>
+        <w:t xml:space="preserve">[37] S. Chen, X. Li, "A new CFAR algorithm based on variable window for ship target detection in SAR images," Signal Image Video Process., vol. 13, pp. 779-786, 2019, doi:10.1007/s11760-018-1408-4.</w:t>
+      </w:r>
+    </w:p>
+    <w:p>
+      <w:pPr>
+        <w:spacing w:after="50" w:line="250"/>
+        <w:jc w:val="left"/>
+      </w:pPr>
+      <w:r>
+        <w:rPr>
+          <w:rFonts w:ascii="Times New Roman" w:cs="Times New Roman" w:eastAsia="Times New Roman" w:hAnsi="Times New Roman"/>
+          <w:sz w:val="18"/>
+          <w:szCs w:val="18"/>
+        </w:rPr>
+        <w:t xml:space="preserve">[38] "Robust CFAR detector based on censored harmonic averaging in heterogeneous clutter," IEEE Trans. Aerosp. Electron. Syst. (Correspondence), 2021, doi:10.1109/TAES.2020.3046050 (author list not captured in the text extraction of the PDF).</w:t>
+      </w:r>
+    </w:p>
+    <w:p>
+      <w:pPr>
+        <w:spacing w:after="50" w:line="250"/>
+        <w:jc w:val="left"/>
+      </w:pPr>
+      <w:r>
+        <w:rPr>
+          <w:rFonts w:ascii="Times New Roman" w:cs="Times New Roman" w:eastAsia="Times New Roman" w:hAnsi="Times New Roman"/>
+          <w:sz w:val="18"/>
+          <w:szCs w:val="18"/>
+        </w:rPr>
+        <w:t xml:space="preserve">[39] J. Ai, Y. Mao, Q. Luo et al., "Robust CFAR ship detector based on bilateral-trimmed-statistics of complex ocean scenes in SAR imagery: A closed-form solution," IEEE Trans. Aerosp. Electron. Syst., vol. 57, no. 3, 2021, doi:10.1109/TAES.2021.3050654.</w:t>
+      </w:r>
+    </w:p>
+    <w:p>
+      <w:pPr>
+        <w:spacing w:after="50" w:line="250"/>
+        <w:jc w:val="left"/>
+      </w:pPr>
+      <w:r>
+        <w:rPr>
+          <w:rFonts w:ascii="Times New Roman" w:cs="Times New Roman" w:eastAsia="Times New Roman" w:hAnsi="Times New Roman"/>
+          <w:sz w:val="18"/>
+          <w:szCs w:val="18"/>
+        </w:rPr>
+        <w:t xml:space="preserve">[40] J. Ai, Z. Pei, B. Yao, Z. Wang, M. Xing, "AIS data aided Rayleigh CFAR ship detection algorithm of multiple-target environment in SAR images," IEEE Trans. Aerosp. Electron. Syst., 2022, doi:10.1109/TAES.2021.3111849.</w:t>
+      </w:r>
+    </w:p>
+    <w:p>
+      <w:pPr>
+        <w:spacing w:after="50" w:line="250"/>
+        <w:jc w:val="left"/>
+      </w:pPr>
+      <w:r>
+        <w:rPr>
+          <w:rFonts w:ascii="Times New Roman" w:cs="Times New Roman" w:eastAsia="Times New Roman" w:hAnsi="Times New Roman"/>
+          <w:sz w:val="18"/>
+          <w:szCs w:val="18"/>
+        </w:rPr>
+        <w:t xml:space="preserve">[41] S. Gao, H. Liu, "Performance comparison of statistical models for characterizing sea clutter and ship CFAR detection in SAR images," IEEE J. Sel. Topics Appl. Earth Observ. Remote Sens., vol. 15, p. 7414, 2022, doi:10.1109/JSTARS.2022.3203230.</w:t>
       </w:r>
     </w:p>
     <w:sectPr>

</xml_diff>